<commit_message>
progress on ch70, major bugs'
</commit_message>
<xml_diff>
--- a/roof/Leverett STM November 2025 - Middle School Roof.docx
+++ b/roof/Leverett STM November 2025 - Middle School Roof.docx
@@ -4,1713 +4,425 @@
   <w:body>
     <w:p>
       <w:pPr>
-        <w:jc w:val="both"/>
-        <w:rPr>
-          <w:rFonts w:ascii="Skeena" w:hAnsi="Skeena"/>
-          <w:b/>
-          <w:bCs/>
-          <w:sz w:val="28"/>
-          <w:szCs w:val="28"/>
-        </w:rPr>
-      </w:pPr>
-      <w:r>
-        <w:rPr>
-          <w:rFonts w:ascii="Skeena" w:hAnsi="Skeena"/>
-          <w:b/>
-          <w:bCs/>
-          <w:sz w:val="28"/>
-          <w:szCs w:val="28"/>
-        </w:rPr>
-        <w:t>Middle School Roof: Critical Infrastructure at Breaking Point</w:t>
+        <w:pStyle w:val="Heading1"/>
+      </w:pPr>
+      <w:r>
+        <w:t>Amherst-Pelham Regional Middle School Roof Replacement Project</w:t>
       </w:r>
     </w:p>
     <w:p>
       <w:pPr>
-        <w:jc w:val="both"/>
-        <w:rPr>
-          <w:rFonts w:ascii="Skeena" w:hAnsi="Skeena"/>
-          <w:b/>
-          <w:bCs/>
-          <w:sz w:val="28"/>
-          <w:szCs w:val="28"/>
-        </w:rPr>
-      </w:pPr>
-      <w:r>
-        <w:rPr>
-          <w:rFonts w:ascii="Skeena" w:hAnsi="Skeena"/>
-          <w:b/>
-          <w:bCs/>
-          <w:sz w:val="28"/>
-          <w:szCs w:val="28"/>
-        </w:rPr>
-        <w:t>The Deteriorating Situation</w:t>
+        <w:pStyle w:val="Heading2"/>
+      </w:pPr>
+      <w:r>
+        <w:t>Existing Conditions and Risks</w:t>
       </w:r>
     </w:p>
     <w:p>
       <w:pPr>
-        <w:jc w:val="both"/>
-        <w:rPr>
-          <w:rFonts w:ascii="Skeena" w:hAnsi="Skeena"/>
-          <w:sz w:val="28"/>
-          <w:szCs w:val="28"/>
-        </w:rPr>
-      </w:pPr>
-      <w:r>
-        <w:rPr>
-          <w:rFonts w:ascii="Skeena" w:hAnsi="Skeena"/>
-          <w:sz w:val="28"/>
-          <w:szCs w:val="28"/>
-        </w:rPr>
-        <w:t>The middle school roof is failing. After 31 years and over 75 emergency patches, we have active leaks every time it rains. The 2022 Gale Associates evaluation documented:</w:t>
+        <w:pStyle w:val="Heading3"/>
+      </w:pPr>
+      <w:r>
+        <w:t xml:space="preserve">Current Roof </w:t>
+      </w:r>
+      <w:r>
+        <w:t>Status</w:t>
       </w:r>
     </w:p>
     <w:p>
       <w:pPr>
-        <w:numPr>
-          <w:ilvl w:val="0"/>
-          <w:numId w:val="9"/>
-        </w:numPr>
-        <w:jc w:val="both"/>
-        <w:rPr>
-          <w:rFonts w:ascii="Skeena" w:hAnsi="Skeena"/>
-          <w:sz w:val="28"/>
-          <w:szCs w:val="28"/>
-        </w:rPr>
-      </w:pPr>
-      <w:r>
-        <w:rPr>
-          <w:rFonts w:ascii="Skeena" w:hAnsi="Skeena"/>
-          <w:b/>
-          <w:bCs/>
-          <w:sz w:val="28"/>
-          <w:szCs w:val="28"/>
-        </w:rPr>
-        <w:t>One confirmed active leak that occurs with every rainfall</w:t>
+        <w:rPr>
+          <w:rFonts w:ascii="Skeena" w:hAnsi="Skeena"/>
+        </w:rPr>
+      </w:pPr>
+      <w:r>
+        <w:rPr>
+          <w:rFonts w:ascii="Skeena" w:hAnsi="Skeena"/>
+        </w:rPr>
+        <w:t>The middle school roof system was installed in 1994 and carried a 15-year warranty that expired in 2009. The building consists of three main sections covering approximately 104,000 square feet: the classroom wing, gymnasium wing, and auditorium. The district has performed over 75 patch repairs to address ongoing leaks (MSBA Submission, Section 3, p. 1).</w:t>
       </w:r>
     </w:p>
     <w:p>
       <w:pPr>
-        <w:numPr>
-          <w:ilvl w:val="0"/>
-          <w:numId w:val="9"/>
-        </w:numPr>
-        <w:jc w:val="both"/>
-        <w:rPr>
-          <w:rFonts w:ascii="Skeena" w:hAnsi="Skeena"/>
-          <w:sz w:val="28"/>
-          <w:szCs w:val="28"/>
-        </w:rPr>
-      </w:pPr>
-      <w:r>
-        <w:rPr>
-          <w:rFonts w:ascii="Skeena" w:hAnsi="Skeena"/>
-          <w:b/>
-          <w:bCs/>
-          <w:sz w:val="28"/>
-          <w:szCs w:val="28"/>
-        </w:rPr>
-        <w:t>Four additional recent leak locations</w:t>
-      </w:r>
-      <w:r>
-        <w:rPr>
-          <w:rFonts w:ascii="Skeena" w:hAnsi="Skeena"/>
-          <w:sz w:val="28"/>
-          <w:szCs w:val="28"/>
-        </w:rPr>
-        <w:t xml:space="preserve"> requiring constant maintenance</w:t>
+        <w:rPr>
+          <w:rFonts w:ascii="Skeena" w:hAnsi="Skeena"/>
+        </w:rPr>
+      </w:pPr>
+      <w:r>
+        <w:rPr>
+          <w:rFonts w:ascii="Skeena" w:hAnsi="Skeena"/>
+        </w:rPr>
+        <w:t xml:space="preserve">The 2022 Gale Associates </w:t>
+      </w:r>
+      <w:proofErr w:type="gramStart"/>
+      <w:r>
+        <w:rPr>
+          <w:rFonts w:ascii="Skeena" w:hAnsi="Skeena"/>
+        </w:rPr>
+        <w:t>engineering evaluation</w:t>
+      </w:r>
+      <w:proofErr w:type="gramEnd"/>
+      <w:r>
+        <w:rPr>
+          <w:rFonts w:ascii="Skeena" w:hAnsi="Skeena"/>
+        </w:rPr>
+        <w:t xml:space="preserve"> documented several conditions requiring attention. The assessment identified one active leak that occurs with every rainfall event, along with four additional leak locations that have required recent maintenance. The evaluation noted reverse-lap flashing at snow guards, which creates pathways for water infiltration, and efflorescence throughout the structure, indicating moisture has been penetrating the building envelope over time (Gale 2022 evaluation, referenced in MSBA Submission, Section 3, p. 2).</w:t>
       </w:r>
     </w:p>
     <w:p>
       <w:pPr>
-        <w:numPr>
-          <w:ilvl w:val="0"/>
-          <w:numId w:val="9"/>
-        </w:numPr>
-        <w:jc w:val="both"/>
-        <w:rPr>
-          <w:rFonts w:ascii="Skeena" w:hAnsi="Skeena"/>
-          <w:sz w:val="28"/>
-          <w:szCs w:val="28"/>
-        </w:rPr>
-      </w:pPr>
-      <w:r>
-        <w:rPr>
-          <w:rFonts w:ascii="Skeena" w:hAnsi="Skeena"/>
-          <w:b/>
-          <w:bCs/>
-          <w:sz w:val="28"/>
-          <w:szCs w:val="28"/>
-        </w:rPr>
-        <w:t>Reverse-lap flashing at snow guards</w:t>
-      </w:r>
-      <w:r>
-        <w:rPr>
-          <w:rFonts w:ascii="Skeena" w:hAnsi="Skeena"/>
-          <w:sz w:val="28"/>
-          <w:szCs w:val="28"/>
-        </w:rPr>
-        <w:t xml:space="preserve"> — a fundamental design flaw causing water infiltration</w:t>
+        <w:pStyle w:val="Heading3"/>
+      </w:pPr>
+      <w:r>
+        <w:t>Hazardous Materials Assessment</w:t>
       </w:r>
     </w:p>
     <w:p>
       <w:pPr>
-        <w:numPr>
-          <w:ilvl w:val="0"/>
-          <w:numId w:val="9"/>
-        </w:numPr>
-        <w:jc w:val="both"/>
-        <w:rPr>
-          <w:rFonts w:ascii="Skeena" w:hAnsi="Skeena"/>
-          <w:sz w:val="28"/>
-          <w:szCs w:val="28"/>
-        </w:rPr>
-      </w:pPr>
-      <w:r>
-        <w:rPr>
-          <w:rFonts w:ascii="Skeena" w:hAnsi="Skeena"/>
-          <w:b/>
-          <w:bCs/>
-          <w:sz w:val="28"/>
-          <w:szCs w:val="28"/>
-        </w:rPr>
-        <w:t>Efflorescence throughout the structure</w:t>
-      </w:r>
-      <w:r>
-        <w:rPr>
-          <w:rFonts w:ascii="Skeena" w:hAnsi="Skeena"/>
-          <w:sz w:val="28"/>
-          <w:szCs w:val="28"/>
-        </w:rPr>
-        <w:t xml:space="preserve"> indicating widespread moisture penetration</w:t>
+        <w:rPr>
+          <w:rFonts w:ascii="Skeena" w:hAnsi="Skeena"/>
+        </w:rPr>
+      </w:pPr>
+      <w:r>
+        <w:rPr>
+          <w:rFonts w:ascii="Skeena" w:hAnsi="Skeena"/>
+        </w:rPr>
+        <w:t xml:space="preserve">CDW Consultants conducted a comprehensive hazardous materials assessment in July 2025. The assessment identified chrysotile asbestos in several roof components. Specifically, asbestos was found in sealant on gutters over the auditorium (2% chrysotile), tar vapor barriers on auditorium walls (5-20% chrysotile), and tar materials on the main school roof deck covering approximately 76,000 square feet (2-3% chrysotile). The auditorium also contains ceiling materials that can become friable when disturbed by water damage. The district has already conducted some emergency </w:t>
+      </w:r>
+      <w:proofErr w:type="gramStart"/>
+      <w:r>
+        <w:rPr>
+          <w:rFonts w:ascii="Skeena" w:hAnsi="Skeena"/>
+        </w:rPr>
+        <w:t>abatement</w:t>
+      </w:r>
+      <w:proofErr w:type="gramEnd"/>
+      <w:r>
+        <w:rPr>
+          <w:rFonts w:ascii="Skeena" w:hAnsi="Skeena"/>
+        </w:rPr>
+        <w:t xml:space="preserve"> in water-damaged areas (CDW Hazmat Report 2025, pp. 2-18).</w:t>
       </w:r>
     </w:p>
     <w:p>
       <w:pPr>
-        <w:numPr>
-          <w:ilvl w:val="0"/>
-          <w:numId w:val="9"/>
-        </w:numPr>
-        <w:jc w:val="both"/>
-        <w:rPr>
-          <w:rFonts w:ascii="Skeena" w:hAnsi="Skeena"/>
-          <w:sz w:val="28"/>
-          <w:szCs w:val="28"/>
-        </w:rPr>
-      </w:pPr>
-      <w:r>
-        <w:rPr>
-          <w:rFonts w:ascii="Skeena" w:hAnsi="Skeena"/>
-          <w:b/>
-          <w:bCs/>
-          <w:sz w:val="28"/>
-          <w:szCs w:val="28"/>
-        </w:rPr>
-        <w:t>Asbestos-containing ceiling material in the auditorium</w:t>
-      </w:r>
-      <w:r>
-        <w:rPr>
-          <w:rFonts w:ascii="Skeena" w:hAnsi="Skeena"/>
-          <w:sz w:val="28"/>
-          <w:szCs w:val="28"/>
-        </w:rPr>
-        <w:t xml:space="preserve"> that becomes friable (airborne) when disturbed by water damage or roof work</w:t>
+        <w:pStyle w:val="Heading3"/>
+      </w:pPr>
+      <w:r>
+        <w:t>Infrastructure Concerns</w:t>
       </w:r>
     </w:p>
     <w:p>
       <w:pPr>
-        <w:jc w:val="both"/>
-        <w:rPr>
-          <w:rFonts w:ascii="Skeena" w:hAnsi="Skeena"/>
-          <w:sz w:val="28"/>
-          <w:szCs w:val="28"/>
-        </w:rPr>
-      </w:pPr>
-      <w:r>
-        <w:rPr>
-          <w:rFonts w:ascii="Skeena" w:hAnsi="Skeena"/>
-          <w:sz w:val="28"/>
-          <w:szCs w:val="28"/>
-        </w:rPr>
-        <w:t>The district has already performed emergency asbestos abatement in water-damaged ceiling areas. Each new leak risks exposing students and staff to asbestos fibers.</w:t>
+        <w:rPr>
+          <w:rFonts w:ascii="Skeena" w:hAnsi="Skeena"/>
+        </w:rPr>
+      </w:pPr>
+      <w:r>
+        <w:rPr>
+          <w:rFonts w:ascii="Skeena" w:hAnsi="Skeena"/>
+        </w:rPr>
+        <w:t xml:space="preserve">The existing internal roof drainage system presents ongoing maintenance challenges. Water currently drains through cast iron pipes that run through the building interior. These pipes, installed with the original construction, are beginning to show signs of deterioration. When internal drains fail, water can travel through the building before manifesting as visible damage, making leak sources difficult to identify. The Gale evaluation noted that determining </w:t>
+      </w:r>
+      <w:r>
+        <w:rPr>
+          <w:rFonts w:ascii="Skeena" w:hAnsi="Skeena"/>
+        </w:rPr>
+        <w:lastRenderedPageBreak/>
+        <w:t>specific leak sources would require extensive water testing due to the complexity of the internal drainage paths (MSBA Submission, Section 3, p. 2).</w:t>
       </w:r>
     </w:p>
     <w:p>
       <w:pPr>
-        <w:jc w:val="both"/>
-        <w:rPr>
-          <w:rFonts w:ascii="Skeena" w:hAnsi="Skeena"/>
-          <w:b/>
-          <w:bCs/>
-          <w:sz w:val="28"/>
-          <w:szCs w:val="28"/>
-        </w:rPr>
-      </w:pPr>
-      <w:r>
-        <w:rPr>
-          <w:rFonts w:ascii="Skeena" w:hAnsi="Skeena"/>
-          <w:b/>
-          <w:bCs/>
-          <w:sz w:val="28"/>
-          <w:szCs w:val="28"/>
-        </w:rPr>
-        <w:t>What We're Deciding on November 4</w:t>
+        <w:rPr>
+          <w:rFonts w:ascii="Skeena" w:hAnsi="Skeena"/>
+        </w:rPr>
+      </w:pPr>
+      <w:r>
+        <w:rPr>
+          <w:rFonts w:ascii="Skeena" w:hAnsi="Skeena"/>
+        </w:rPr>
+        <w:t>The structural assessment also identified that some existing steel joists in the auditorium framing do not meet current capacity requirements for potential future uses without reinforcement (Gale 2022, cited in MSBA Submission, Section 3, p. 2).</w:t>
       </w:r>
     </w:p>
     <w:p>
       <w:pPr>
-        <w:jc w:val="both"/>
-        <w:rPr>
-          <w:rFonts w:ascii="Skeena" w:hAnsi="Skeena"/>
-          <w:sz w:val="28"/>
-          <w:szCs w:val="28"/>
-        </w:rPr>
-      </w:pPr>
-      <w:r>
-        <w:rPr>
-          <w:rFonts w:ascii="Skeena" w:hAnsi="Skeena"/>
-          <w:b/>
-          <w:bCs/>
-          <w:sz w:val="28"/>
-          <w:szCs w:val="28"/>
-        </w:rPr>
-        <w:t>Total project cost</w:t>
-      </w:r>
-      <w:r>
-        <w:rPr>
-          <w:rFonts w:ascii="Skeena" w:hAnsi="Skeena"/>
-          <w:sz w:val="28"/>
-          <w:szCs w:val="28"/>
-        </w:rPr>
-        <w:t>: $10,024,016</w:t>
+        <w:pStyle w:val="Heading2"/>
+      </w:pPr>
+      <w:r>
+        <w:t>Project Requirements and Benefits</w:t>
       </w:r>
     </w:p>
     <w:p>
       <w:pPr>
-        <w:jc w:val="both"/>
-        <w:rPr>
-          <w:rFonts w:ascii="Skeena" w:hAnsi="Skeena"/>
-          <w:sz w:val="28"/>
-          <w:szCs w:val="28"/>
-        </w:rPr>
-      </w:pPr>
-      <w:r>
-        <w:rPr>
-          <w:rFonts w:ascii="Skeena" w:hAnsi="Skeena"/>
-          <w:b/>
-          <w:bCs/>
-          <w:sz w:val="28"/>
-          <w:szCs w:val="28"/>
-        </w:rPr>
-        <w:t>MSBA reimbursement</w:t>
-      </w:r>
-      <w:r>
-        <w:rPr>
-          <w:rFonts w:ascii="Skeena" w:hAnsi="Skeena"/>
-          <w:sz w:val="28"/>
-          <w:szCs w:val="28"/>
-        </w:rPr>
-        <w:t>: $5,999,980 (61.95% of eligible costs)</w:t>
+        <w:pStyle w:val="Heading3"/>
+      </w:pPr>
+      <w:r>
+        <w:t>MSBA Program Requirements</w:t>
       </w:r>
     </w:p>
     <w:p>
       <w:pPr>
-        <w:jc w:val="both"/>
-        <w:rPr>
-          <w:rFonts w:ascii="Skeena" w:hAnsi="Skeena"/>
-          <w:sz w:val="28"/>
-          <w:szCs w:val="28"/>
-        </w:rPr>
-      </w:pPr>
-      <w:r>
-        <w:rPr>
-          <w:rFonts w:ascii="Skeena" w:hAnsi="Skeena"/>
-          <w:b/>
-          <w:bCs/>
-          <w:sz w:val="28"/>
-          <w:szCs w:val="28"/>
-        </w:rPr>
-        <w:t>District responsibility</w:t>
-      </w:r>
-      <w:r>
-        <w:rPr>
-          <w:rFonts w:ascii="Skeena" w:hAnsi="Skeena"/>
-          <w:sz w:val="28"/>
-          <w:szCs w:val="28"/>
-        </w:rPr>
-        <w:t>: $4,024,036</w:t>
+        <w:rPr>
+          <w:rFonts w:ascii="Skeena" w:hAnsi="Skeena"/>
+        </w:rPr>
+      </w:pPr>
+      <w:r>
+        <w:rPr>
+          <w:rFonts w:ascii="Skeena" w:hAnsi="Skeena"/>
+        </w:rPr>
+        <w:t>The Massachusetts School Building Authority accepted the district into the Accelerated Repair Program in October 2024, after annual applications since 2019. The program provides a 61.95% reimbursement rate for eligible costs. The district must complete all necessary approvals within 14 months of acceptance (by October 2025) to maintain eligibility. The MSBA Board vote on funding is scheduled for October 29, 2025 (District Q&amp;A, p. 2).</w:t>
       </w:r>
     </w:p>
     <w:p>
       <w:pPr>
-        <w:jc w:val="both"/>
-        <w:rPr>
-          <w:rFonts w:ascii="Skeena" w:hAnsi="Skeena"/>
-          <w:sz w:val="28"/>
-          <w:szCs w:val="28"/>
-        </w:rPr>
-      </w:pPr>
-      <w:r>
-        <w:rPr>
-          <w:rFonts w:ascii="Skeena" w:hAnsi="Skeena"/>
-          <w:b/>
-          <w:bCs/>
-          <w:sz w:val="28"/>
-          <w:szCs w:val="28"/>
-        </w:rPr>
-        <w:t>Leverett's projected debt service:</w:t>
+        <w:rPr>
+          <w:rFonts w:ascii="Skeena" w:hAnsi="Skeena"/>
+        </w:rPr>
+      </w:pPr>
+      <w:r>
+        <w:rPr>
+          <w:rFonts w:ascii="Skeena" w:hAnsi="Skeena"/>
+        </w:rPr>
+        <w:t>The MSBA program requires that facilities receiving funding continue to be used for educational purposes, with an expected service life of at least 20 years. The program also requires that a portion of the new roof be made structurally capable of supporting future solar installations, which the project addresses with 1,000 square feet of solar-ready capacity (District Q&amp;A, p. 1).</w:t>
       </w:r>
     </w:p>
     <w:p>
       <w:pPr>
-        <w:numPr>
-          <w:ilvl w:val="0"/>
-          <w:numId w:val="10"/>
-        </w:numPr>
-        <w:jc w:val="both"/>
-        <w:rPr>
-          <w:rFonts w:ascii="Skeena" w:hAnsi="Skeena"/>
-          <w:sz w:val="28"/>
-          <w:szCs w:val="28"/>
-        </w:rPr>
-      </w:pPr>
-      <w:r>
-        <w:rPr>
-          <w:rFonts w:ascii="Skeena" w:hAnsi="Skeena"/>
-          <w:sz w:val="28"/>
-          <w:szCs w:val="28"/>
-        </w:rPr>
-        <w:t>FY27: $79,452 (first year)</w:t>
+        <w:pStyle w:val="Heading3"/>
+      </w:pPr>
+      <w:r>
+        <w:t>Technical Scope and Design Solution</w:t>
       </w:r>
     </w:p>
     <w:p>
       <w:pPr>
-        <w:numPr>
-          <w:ilvl w:val="0"/>
-          <w:numId w:val="10"/>
-        </w:numPr>
-        <w:jc w:val="both"/>
-        <w:rPr>
-          <w:rFonts w:ascii="Skeena" w:hAnsi="Skeena"/>
-          <w:sz w:val="28"/>
-          <w:szCs w:val="28"/>
-        </w:rPr>
-      </w:pPr>
-      <w:r>
-        <w:rPr>
-          <w:rFonts w:ascii="Skeena" w:hAnsi="Skeena"/>
-          <w:sz w:val="28"/>
-          <w:szCs w:val="28"/>
-        </w:rPr>
-        <w:t>FY28: $97,006</w:t>
+        <w:rPr>
+          <w:rFonts w:ascii="Skeena" w:hAnsi="Skeena"/>
+        </w:rPr>
+      </w:pPr>
+      <w:r>
+        <w:rPr>
+          <w:rFonts w:ascii="Skeena" w:hAnsi="Skeena"/>
+        </w:rPr>
+        <w:t>After evaluating five design alternatives, the district selected Option A, which involves complete replacement of the roofing system. The project will remove all existing roofing materials down to the metal deck and install a new system meeting current building codes (MSBA Submission, Section 6, p. 1).</w:t>
       </w:r>
     </w:p>
     <w:p>
       <w:pPr>
-        <w:numPr>
-          <w:ilvl w:val="0"/>
-          <w:numId w:val="10"/>
-        </w:numPr>
-        <w:jc w:val="both"/>
-        <w:rPr>
-          <w:rFonts w:ascii="Skeena" w:hAnsi="Skeena"/>
-          <w:sz w:val="28"/>
-          <w:szCs w:val="28"/>
-        </w:rPr>
-      </w:pPr>
-      <w:r>
-        <w:rPr>
-          <w:rFonts w:ascii="Skeena" w:hAnsi="Skeena"/>
-          <w:sz w:val="28"/>
-          <w:szCs w:val="28"/>
-        </w:rPr>
-        <w:t>FY29: $138,920</w:t>
+        <w:rPr>
+          <w:rFonts w:ascii="Skeena" w:hAnsi="Skeena"/>
+        </w:rPr>
+      </w:pPr>
+      <w:r>
+        <w:rPr>
+          <w:rFonts w:ascii="Skeena" w:hAnsi="Skeena"/>
+        </w:rPr>
+        <w:t>The new design converts from internal to perimeter drainage, eliminating water travel through the building. This approach involves capping existing internal drains below the deck level and installing new gutters and downspouts around the building perimeter. The tapered insulation will create a 1/8" per foot slope directing water to the edges (MSBA Submission, Section 7, p. 1).</w:t>
       </w:r>
     </w:p>
     <w:p>
       <w:pPr>
-        <w:numPr>
-          <w:ilvl w:val="0"/>
-          <w:numId w:val="10"/>
-        </w:numPr>
-        <w:jc w:val="both"/>
-        <w:rPr>
-          <w:rFonts w:ascii="Skeena" w:hAnsi="Skeena"/>
-          <w:sz w:val="28"/>
-          <w:szCs w:val="28"/>
-        </w:rPr>
-      </w:pPr>
-      <w:r>
-        <w:rPr>
-          <w:rFonts w:ascii="Skeena" w:hAnsi="Skeena"/>
-          <w:sz w:val="28"/>
-          <w:szCs w:val="28"/>
-        </w:rPr>
-        <w:t>FY30: $169,906</w:t>
+        <w:rPr>
+          <w:rFonts w:ascii="Skeena" w:hAnsi="Skeena"/>
+        </w:rPr>
+      </w:pPr>
+      <w:r>
+        <w:rPr>
+          <w:rFonts w:ascii="Skeena" w:hAnsi="Skeena"/>
+        </w:rPr>
+        <w:t>The new roofing system will include self-adhered vapor barriers, mechanically fastened tapered insulation achieving R-30 value (compared to current R-20), high-density cover board, and 80-mil fleece-back membrane. The complete system will carry a 30-year manufacturer's warranty, double the original 15-year warranty period (MSBA Submission, Section 7, p. 2).</w:t>
       </w:r>
     </w:p>
     <w:p>
       <w:pPr>
-        <w:numPr>
-          <w:ilvl w:val="0"/>
-          <w:numId w:val="10"/>
-        </w:numPr>
-        <w:jc w:val="both"/>
-        <w:rPr>
-          <w:rFonts w:ascii="Skeena" w:hAnsi="Skeena"/>
-          <w:sz w:val="28"/>
-          <w:szCs w:val="28"/>
-        </w:rPr>
-      </w:pPr>
-      <w:r>
-        <w:rPr>
-          <w:rFonts w:ascii="Skeena" w:hAnsi="Skeena"/>
-          <w:sz w:val="28"/>
-          <w:szCs w:val="28"/>
-        </w:rPr>
-        <w:t>FY31: $233,873</w:t>
+        <w:pStyle w:val="Heading3"/>
+      </w:pPr>
+      <w:r>
+        <w:lastRenderedPageBreak/>
+        <w:t>Code Compliance Improvements</w:t>
       </w:r>
     </w:p>
     <w:p>
       <w:pPr>
-        <w:jc w:val="both"/>
-        <w:rPr>
-          <w:rFonts w:ascii="Skeena" w:hAnsi="Skeena"/>
-          <w:sz w:val="28"/>
-          <w:szCs w:val="28"/>
-        </w:rPr>
-      </w:pPr>
-      <w:r>
-        <w:rPr>
-          <w:rFonts w:ascii="Skeena" w:hAnsi="Skeena"/>
-          <w:sz w:val="28"/>
-          <w:szCs w:val="28"/>
-        </w:rPr>
-        <w:lastRenderedPageBreak/>
-        <w:t>This represents $33,461 above existing debt obligations in FY27, growing as other debts retire.</w:t>
+        <w:rPr>
+          <w:rFonts w:ascii="Skeena" w:hAnsi="Skeena"/>
+        </w:rPr>
+      </w:pPr>
+      <w:r>
+        <w:rPr>
+          <w:rFonts w:ascii="Skeena" w:hAnsi="Skeena"/>
+        </w:rPr>
+        <w:t>The project brings the facility up to current Massachusetts building codes in several areas. Energy efficiency will improve with R-30 continuous insulation, exceeding the Massachusetts Stretch Code requirement for Climate Zone 5. The roof will meet current snow load requirements of 35 pounds per square foot and current wind uplift resistance standards, both significantly higher than 1994 requirements (MSBA Submission, Section 5, pp. 1-3).</w:t>
       </w:r>
     </w:p>
     <w:p>
       <w:pPr>
-        <w:jc w:val="both"/>
-        <w:rPr>
-          <w:rFonts w:ascii="Skeena" w:hAnsi="Skeena"/>
-          <w:b/>
-          <w:bCs/>
-          <w:sz w:val="28"/>
-          <w:szCs w:val="28"/>
-        </w:rPr>
-      </w:pPr>
-      <w:r>
-        <w:rPr>
-          <w:rFonts w:ascii="Skeena" w:hAnsi="Skeena"/>
-          <w:b/>
-          <w:bCs/>
-          <w:sz w:val="28"/>
-          <w:szCs w:val="28"/>
-        </w:rPr>
-        <w:t>The Cost of Waiting Is Measurable</w:t>
+        <w:pStyle w:val="Heading3"/>
+      </w:pPr>
+      <w:r>
+        <w:t>Construction Timeline</w:t>
       </w:r>
     </w:p>
     <w:p>
       <w:pPr>
-        <w:jc w:val="both"/>
-        <w:rPr>
-          <w:rFonts w:ascii="Skeena" w:hAnsi="Skeena"/>
-          <w:sz w:val="28"/>
-          <w:szCs w:val="28"/>
-        </w:rPr>
-      </w:pPr>
-      <w:r>
-        <w:rPr>
-          <w:rFonts w:ascii="Skeena" w:hAnsi="Skeena"/>
-          <w:b/>
-          <w:bCs/>
-          <w:sz w:val="28"/>
-          <w:szCs w:val="28"/>
-        </w:rPr>
-        <w:t>2019 estimate</w:t>
-      </w:r>
-      <w:r>
-        <w:rPr>
-          <w:rFonts w:ascii="Skeena" w:hAnsi="Skeena"/>
-          <w:sz w:val="28"/>
-          <w:szCs w:val="28"/>
-        </w:rPr>
-        <w:t>: $6 million</w:t>
+        <w:rPr>
+          <w:rFonts w:ascii="Skeena" w:hAnsi="Skeena"/>
+        </w:rPr>
+      </w:pPr>
+      <w:r>
+        <w:rPr>
+          <w:rFonts w:ascii="Skeena" w:hAnsi="Skeena"/>
+        </w:rPr>
+        <w:t>Construction must occur during summer 2026 when students are not present, particularly given the asbestos abatement requirements. The timeline includes bidding beginning February 2, 2026, with construction completion targeted for August 30, 2026. The work cannot be phased across multiple summers without jeopardizing MSBA funding eligibility due to the program's timeline requirements (District Q&amp;A, p. 1).</w:t>
       </w:r>
     </w:p>
     <w:p>
       <w:pPr>
-        <w:jc w:val="both"/>
-        <w:rPr>
-          <w:rFonts w:ascii="Skeena" w:hAnsi="Skeena"/>
-          <w:sz w:val="28"/>
-          <w:szCs w:val="28"/>
-        </w:rPr>
-      </w:pPr>
-      <w:r>
-        <w:rPr>
-          <w:rFonts w:ascii="Skeena" w:hAnsi="Skeena"/>
-          <w:b/>
-          <w:bCs/>
-          <w:sz w:val="28"/>
-          <w:szCs w:val="28"/>
-        </w:rPr>
-        <w:t>2022 estimate</w:t>
-      </w:r>
-      <w:r>
-        <w:rPr>
-          <w:rFonts w:ascii="Skeena" w:hAnsi="Skeena"/>
-          <w:sz w:val="28"/>
-          <w:szCs w:val="28"/>
-        </w:rPr>
-        <w:t>: $828,000 (Gale's roof-only estimate)</w:t>
+        <w:pStyle w:val="Heading2"/>
+      </w:pPr>
+      <w:r>
+        <w:t>Costs</w:t>
       </w:r>
     </w:p>
     <w:p>
       <w:pPr>
-        <w:jc w:val="both"/>
-        <w:rPr>
-          <w:rFonts w:ascii="Skeena" w:hAnsi="Skeena"/>
-          <w:sz w:val="28"/>
-          <w:szCs w:val="28"/>
-        </w:rPr>
-      </w:pPr>
-      <w:r>
-        <w:rPr>
-          <w:rFonts w:ascii="Skeena" w:hAnsi="Skeena"/>
-          <w:b/>
-          <w:bCs/>
-          <w:sz w:val="28"/>
-          <w:szCs w:val="28"/>
-        </w:rPr>
-        <w:t>2025 actual bid</w:t>
-      </w:r>
-      <w:r>
-        <w:rPr>
-          <w:rFonts w:ascii="Skeena" w:hAnsi="Skeena"/>
-          <w:sz w:val="28"/>
-          <w:szCs w:val="28"/>
-        </w:rPr>
-        <w:t>: $10,024,016</w:t>
+        <w:pStyle w:val="Heading3"/>
+      </w:pPr>
+      <w:r>
+        <w:t>Total Project Investment</w:t>
       </w:r>
     </w:p>
     <w:p>
       <w:pPr>
-        <w:jc w:val="both"/>
-        <w:rPr>
-          <w:rFonts w:ascii="Skeena" w:hAnsi="Skeena"/>
-          <w:sz w:val="28"/>
-          <w:szCs w:val="28"/>
-        </w:rPr>
-      </w:pPr>
-      <w:r>
-        <w:rPr>
-          <w:rFonts w:ascii="Skeena" w:hAnsi="Skeena"/>
-          <w:sz w:val="28"/>
-          <w:szCs w:val="28"/>
-        </w:rPr>
-        <w:t>That's $4 million in inflation over 6 years — a 67% increase. Construction costs are climbing 5-8% annually. Every year we delay</w:t>
-      </w:r>
-      <w:r>
-        <w:rPr>
-          <w:rFonts w:ascii="Skeena" w:hAnsi="Skeena"/>
-          <w:sz w:val="28"/>
-          <w:szCs w:val="28"/>
-        </w:rPr>
-        <w:t xml:space="preserve"> has</w:t>
-      </w:r>
-      <w:r>
-        <w:rPr>
-          <w:rFonts w:ascii="Skeena" w:hAnsi="Skeena"/>
-          <w:sz w:val="28"/>
-          <w:szCs w:val="28"/>
-        </w:rPr>
-        <w:t xml:space="preserve"> add</w:t>
-      </w:r>
-      <w:r>
-        <w:rPr>
-          <w:rFonts w:ascii="Skeena" w:hAnsi="Skeena"/>
-          <w:sz w:val="28"/>
-          <w:szCs w:val="28"/>
-        </w:rPr>
-        <w:t xml:space="preserve">ed </w:t>
-      </w:r>
-      <w:r>
-        <w:rPr>
-          <w:rFonts w:ascii="Skeena" w:hAnsi="Skeena"/>
-          <w:sz w:val="28"/>
-          <w:szCs w:val="28"/>
-        </w:rPr>
-        <w:t>$500,000-800,000 to the project cost.</w:t>
+        <w:rPr>
+          <w:rFonts w:ascii="Skeena" w:hAnsi="Skeena"/>
+        </w:rPr>
+      </w:pPr>
+      <w:r>
+        <w:rPr>
+          <w:rFonts w:ascii="Skeena" w:hAnsi="Skeena"/>
+        </w:rPr>
+        <w:t>The total project cost is $10,024,016, which breaks down into construction costs of $8,470,479 and soft costs of $1,553,537. Soft costs include design services, owner's project management, bidding, and administrative expenses, representing approximately 15.5% of the total project (MSBA Submission, Cost Summary).</w:t>
       </w:r>
     </w:p>
     <w:p>
       <w:pPr>
-        <w:jc w:val="both"/>
-        <w:rPr>
-          <w:rFonts w:ascii="Skeena" w:hAnsi="Skeena"/>
-          <w:sz w:val="28"/>
-          <w:szCs w:val="28"/>
-        </w:rPr>
-      </w:pPr>
-      <w:r>
-        <w:rPr>
-          <w:rFonts w:ascii="Skeena" w:hAnsi="Skeena"/>
-          <w:sz w:val="28"/>
-          <w:szCs w:val="28"/>
-        </w:rPr>
-        <w:t>Meanwhile, emergency patches are failing. Gale documented water find</w:t>
-      </w:r>
-      <w:r>
-        <w:rPr>
-          <w:rFonts w:ascii="Skeena" w:hAnsi="Skeena"/>
-          <w:sz w:val="28"/>
-          <w:szCs w:val="28"/>
-        </w:rPr>
-        <w:t>ing</w:t>
-      </w:r>
-      <w:r>
-        <w:rPr>
-          <w:rFonts w:ascii="Skeena" w:hAnsi="Skeena"/>
-          <w:sz w:val="28"/>
-          <w:szCs w:val="28"/>
-        </w:rPr>
-        <w:t xml:space="preserve"> new paths around </w:t>
-      </w:r>
-      <w:r>
-        <w:rPr>
-          <w:rFonts w:ascii="Skeena" w:hAnsi="Skeena"/>
-          <w:sz w:val="28"/>
-          <w:szCs w:val="28"/>
-        </w:rPr>
-        <w:t>patches</w:t>
-      </w:r>
-      <w:r>
-        <w:rPr>
-          <w:rFonts w:ascii="Skeena" w:hAnsi="Skeena"/>
-          <w:sz w:val="28"/>
-          <w:szCs w:val="28"/>
-        </w:rPr>
-        <w:t xml:space="preserve">. </w:t>
-      </w:r>
-      <w:r>
-        <w:rPr>
-          <w:rFonts w:ascii="Skeena" w:hAnsi="Skeena"/>
-          <w:sz w:val="28"/>
-          <w:szCs w:val="28"/>
-        </w:rPr>
-        <w:t>I</w:t>
-      </w:r>
-      <w:r>
-        <w:rPr>
-          <w:rFonts w:ascii="Skeena" w:hAnsi="Skeena"/>
-          <w:sz w:val="28"/>
-          <w:szCs w:val="28"/>
-        </w:rPr>
-        <w:t xml:space="preserve">nternal </w:t>
-      </w:r>
-      <w:r>
-        <w:rPr>
-          <w:rFonts w:ascii="Skeena" w:hAnsi="Skeena"/>
-          <w:sz w:val="28"/>
-          <w:szCs w:val="28"/>
-        </w:rPr>
-        <w:t xml:space="preserve">roof </w:t>
-      </w:r>
-      <w:r>
-        <w:rPr>
-          <w:rFonts w:ascii="Skeena" w:hAnsi="Skeena"/>
-          <w:sz w:val="28"/>
-          <w:szCs w:val="28"/>
-        </w:rPr>
-        <w:t xml:space="preserve">drainage </w:t>
-      </w:r>
-      <w:r>
-        <w:rPr>
-          <w:rFonts w:ascii="Skeena" w:hAnsi="Skeena"/>
-          <w:sz w:val="28"/>
-          <w:szCs w:val="28"/>
-        </w:rPr>
-        <w:t xml:space="preserve">lets </w:t>
-      </w:r>
-      <w:r>
-        <w:rPr>
-          <w:rFonts w:ascii="Skeena" w:hAnsi="Skeena"/>
-          <w:sz w:val="28"/>
-          <w:szCs w:val="28"/>
-        </w:rPr>
-        <w:t>leak</w:t>
-      </w:r>
-      <w:r>
-        <w:rPr>
-          <w:rFonts w:ascii="Skeena" w:hAnsi="Skeena"/>
-          <w:sz w:val="28"/>
-          <w:szCs w:val="28"/>
-        </w:rPr>
-        <w:t xml:space="preserve">s </w:t>
-      </w:r>
-      <w:r>
-        <w:rPr>
-          <w:rFonts w:ascii="Skeena" w:hAnsi="Skeena"/>
-          <w:sz w:val="28"/>
-          <w:szCs w:val="28"/>
-        </w:rPr>
-        <w:t xml:space="preserve">travel throughout the building before manifesting as </w:t>
-      </w:r>
-      <w:r>
-        <w:rPr>
-          <w:rFonts w:ascii="Skeena" w:hAnsi="Skeena"/>
-          <w:sz w:val="28"/>
-          <w:szCs w:val="28"/>
-        </w:rPr>
-        <w:t>water</w:t>
-      </w:r>
-      <w:r>
-        <w:rPr>
-          <w:rFonts w:ascii="Skeena" w:hAnsi="Skeena"/>
-          <w:sz w:val="28"/>
-          <w:szCs w:val="28"/>
-        </w:rPr>
-        <w:t xml:space="preserve"> damage far from the source.</w:t>
+        <w:pStyle w:val="Heading3"/>
+      </w:pPr>
+      <w:r>
+        <w:t>Funding Structure</w:t>
       </w:r>
     </w:p>
     <w:p>
       <w:pPr>
-        <w:jc w:val="both"/>
-        <w:rPr>
-          <w:rFonts w:ascii="Skeena" w:hAnsi="Skeena"/>
-          <w:b/>
-          <w:bCs/>
-          <w:sz w:val="28"/>
-          <w:szCs w:val="28"/>
-        </w:rPr>
-      </w:pPr>
-      <w:r>
-        <w:rPr>
-          <w:rFonts w:ascii="Skeena" w:hAnsi="Skeena"/>
-          <w:b/>
-          <w:bCs/>
-          <w:sz w:val="28"/>
-          <w:szCs w:val="28"/>
-        </w:rPr>
-        <w:t>Why This Project, Why Now</w:t>
+        <w:rPr>
+          <w:rFonts w:ascii="Skeena" w:hAnsi="Skeena"/>
+        </w:rPr>
+      </w:pPr>
+      <w:r>
+        <w:rPr>
+          <w:rFonts w:ascii="Skeena" w:hAnsi="Skeena"/>
+        </w:rPr>
+        <w:t>The MSBA will provide $5,999,980 in reimbursement, covering 61.95% of eligible costs. The regional district's responsibility is $4,024,036. The district previously authorized $3 million in borrowing, which has been incorporated into capital planning. The additional authorization needed is approximately $4 million, though final borrowing amounts will be determined based on available funds and financing terms (District Q&amp;A, p. 3).</w:t>
       </w:r>
     </w:p>
     <w:p>
       <w:pPr>
-        <w:jc w:val="both"/>
-        <w:rPr>
-          <w:rFonts w:ascii="Skeena" w:hAnsi="Skeena"/>
-          <w:sz w:val="28"/>
-          <w:szCs w:val="28"/>
-        </w:rPr>
-      </w:pPr>
-      <w:r>
-        <w:rPr>
-          <w:rFonts w:ascii="Skeena" w:hAnsi="Skeena"/>
-          <w:b/>
-          <w:bCs/>
-          <w:sz w:val="28"/>
-          <w:szCs w:val="28"/>
-        </w:rPr>
-        <w:t>The warranty expired 16 years ago.</w:t>
-      </w:r>
-      <w:r>
-        <w:rPr>
-          <w:rFonts w:ascii="Skeena" w:hAnsi="Skeena"/>
-          <w:sz w:val="28"/>
-          <w:szCs w:val="28"/>
-        </w:rPr>
-        <w:t xml:space="preserve"> The roof system installed in 1994 came with a 15-year warranty. We're now operating 16 years beyond the manufacturer's expected lifespan. Gale's 2022 evaluation gave us 3-5 years before mandatory replacement — we're already 2.5 years into that window.</w:t>
+        <w:pStyle w:val="Heading3"/>
+      </w:pPr>
+      <w:r>
+        <w:t>Cost Allocation to Member Towns</w:t>
       </w:r>
     </w:p>
     <w:p>
       <w:pPr>
-        <w:jc w:val="both"/>
-        <w:rPr>
-          <w:rFonts w:ascii="Skeena" w:hAnsi="Skeena"/>
-          <w:sz w:val="28"/>
-          <w:szCs w:val="28"/>
-        </w:rPr>
-      </w:pPr>
-      <w:r>
-        <w:rPr>
-          <w:rFonts w:ascii="Skeena" w:hAnsi="Skeena"/>
-          <w:b/>
-          <w:bCs/>
-          <w:sz w:val="28"/>
-          <w:szCs w:val="28"/>
-        </w:rPr>
-        <w:t>The patches aren't working.</w:t>
-      </w:r>
-      <w:r>
-        <w:rPr>
-          <w:rFonts w:ascii="Skeena" w:hAnsi="Skeena"/>
-          <w:sz w:val="28"/>
-          <w:szCs w:val="28"/>
-        </w:rPr>
-        <w:t xml:space="preserve"> With 75+ repair attempts, we're not fixing problems anymore — we're just moving them. The reverse-lap flashing at snow guards creates permanent vulnerabilities that patches cannot address. Snow loads create ice dams that force water upward into these compromised joints.</w:t>
+        <w:rPr>
+          <w:rFonts w:ascii="Skeena" w:hAnsi="Skeena"/>
+        </w:rPr>
+      </w:pPr>
+      <w:r>
+        <w:rPr>
+          <w:rFonts w:ascii="Skeena" w:hAnsi="Skeena"/>
+        </w:rPr>
+        <w:t>Leverett's share, based on 2024 equalized valuation, totals approximately $412,000 plus interest. This represents about $155,000 plus interest above what was already planned for under the existing $3 million authorization. The preliminary debt service projections for Leverett range from $79,452 in FY27 to $233,873 in FY31, though final amounts will depend on borrowing terms and interest rates (District Q&amp;A, p</w:t>
+      </w:r>
+      <w:proofErr w:type="gramStart"/>
+      <w:r>
+        <w:rPr>
+          <w:rFonts w:ascii="Skeena" w:hAnsi="Skeena"/>
+        </w:rPr>
+        <w:t>. 3</w:t>
+      </w:r>
+      <w:proofErr w:type="gramEnd"/>
+      <w:r>
+        <w:rPr>
+          <w:rFonts w:ascii="Skeena" w:hAnsi="Skeena"/>
+        </w:rPr>
+        <w:t>).</w:t>
       </w:r>
     </w:p>
     <w:p>
       <w:pPr>
-        <w:jc w:val="both"/>
-        <w:rPr>
-          <w:rFonts w:ascii="Skeena" w:hAnsi="Skeena"/>
-          <w:sz w:val="28"/>
-          <w:szCs w:val="28"/>
-        </w:rPr>
-      </w:pPr>
-      <w:r>
-        <w:rPr>
-          <w:rFonts w:ascii="Skeena" w:hAnsi="Skeena"/>
-          <w:b/>
-          <w:bCs/>
-          <w:sz w:val="28"/>
-          <w:szCs w:val="28"/>
-        </w:rPr>
-        <w:t>Health and safety risks are escalating.</w:t>
-      </w:r>
-      <w:r>
-        <w:rPr>
-          <w:rFonts w:ascii="Skeena" w:hAnsi="Skeena"/>
-          <w:sz w:val="28"/>
-          <w:szCs w:val="28"/>
-        </w:rPr>
-        <w:t xml:space="preserve"> Every leak in the auditorium risks disturbing asbestos-containing ceiling material. The district has already conducted emergency abatement in water-damaged areas. Continued deterioration means more exposure risk and more emergency abatement costs (not covered by MSBA).</w:t>
+        <w:pStyle w:val="Heading3"/>
+      </w:pPr>
+      <w:r>
+        <w:lastRenderedPageBreak/>
+        <w:t>Historical Cost Context</w:t>
       </w:r>
     </w:p>
     <w:p>
       <w:pPr>
-        <w:jc w:val="both"/>
-        <w:rPr>
-          <w:rFonts w:ascii="Skeena" w:hAnsi="Skeena"/>
-          <w:sz w:val="28"/>
-          <w:szCs w:val="28"/>
-        </w:rPr>
-      </w:pPr>
-      <w:r>
-        <w:rPr>
-          <w:rFonts w:ascii="Skeena" w:hAnsi="Skeena"/>
-          <w:b/>
-          <w:bCs/>
-          <w:sz w:val="28"/>
-          <w:szCs w:val="28"/>
-        </w:rPr>
-        <w:t>Structural implications are emerging.</w:t>
-      </w:r>
-      <w:r>
-        <w:rPr>
-          <w:rFonts w:ascii="Skeena" w:hAnsi="Skeena"/>
-          <w:sz w:val="28"/>
-          <w:szCs w:val="28"/>
-        </w:rPr>
-        <w:t xml:space="preserve"> The 2022 structural analysis found efflorescence (mineral deposits from water infiltration) throughout the steel </w:t>
-      </w:r>
-      <w:r>
-        <w:rPr>
-          <w:rFonts w:ascii="Skeena" w:hAnsi="Skeena"/>
-          <w:sz w:val="28"/>
-          <w:szCs w:val="28"/>
-        </w:rPr>
-        <w:lastRenderedPageBreak/>
-        <w:t>framing. While structural integrity isn't compromised yet, continued water infiltration will accelerate corrosion of steel members — a problem that becomes exponentially more expensive to address.</w:t>
+        <w:rPr>
+          <w:rFonts w:ascii="Skeena" w:hAnsi="Skeena"/>
+        </w:rPr>
+      </w:pPr>
+      <w:r>
+        <w:rPr>
+          <w:rFonts w:ascii="Skeena" w:hAnsi="Skeena"/>
+        </w:rPr>
+        <w:t>The project cost has increased from an estimated $6 million in 2019 to the current $10 million, reflecting construction industry inflation of approximately 5-8% annually. The district notes that further delays would likely add $500,000-800,000 per year to the project cost. If the district does not proceed with MSBA funding, future roof replacement would require 100% local funding rather than the current 38% local share (District Q&amp;A, p. 3).</w:t>
       </w:r>
     </w:p>
     <w:p>
       <w:pPr>
-        <w:jc w:val="both"/>
-        <w:rPr>
-          <w:rFonts w:ascii="Skeena" w:hAnsi="Skeena"/>
-          <w:b/>
-          <w:bCs/>
-          <w:sz w:val="28"/>
-          <w:szCs w:val="28"/>
-        </w:rPr>
-      </w:pPr>
-      <w:r>
-        <w:rPr>
-          <w:rFonts w:ascii="Skeena" w:hAnsi="Skeena"/>
-          <w:b/>
-          <w:bCs/>
-          <w:sz w:val="28"/>
-          <w:szCs w:val="28"/>
-        </w:rPr>
-        <w:t>Understanding the True Scope</w:t>
+        <w:pStyle w:val="Heading3"/>
+      </w:pPr>
+      <w:r>
+        <w:t>Alternative Scenarios</w:t>
       </w:r>
     </w:p>
     <w:p>
       <w:pPr>
-        <w:jc w:val="both"/>
-        <w:rPr>
-          <w:rFonts w:ascii="Skeena" w:hAnsi="Skeena"/>
-          <w:sz w:val="28"/>
-          <w:szCs w:val="28"/>
-        </w:rPr>
-      </w:pPr>
-      <w:r>
-        <w:rPr>
-          <w:rFonts w:ascii="Skeena" w:hAnsi="Skeena"/>
-          <w:sz w:val="28"/>
-          <w:szCs w:val="28"/>
-        </w:rPr>
-        <w:t>The $10 million isn't just for a roof. The project includes:</w:t>
+        <w:rPr>
+          <w:rFonts w:ascii="Skeena" w:hAnsi="Skeena"/>
+        </w:rPr>
+      </w:pPr>
+      <w:r>
+        <w:rPr>
+          <w:rFonts w:ascii="Skeena" w:hAnsi="Skeena"/>
+        </w:rPr>
+        <w:t xml:space="preserve">The district evaluated </w:t>
+      </w:r>
+      <w:proofErr w:type="gramStart"/>
+      <w:r>
+        <w:rPr>
+          <w:rFonts w:ascii="Skeena" w:hAnsi="Skeena"/>
+        </w:rPr>
+        <w:t>less</w:t>
+      </w:r>
+      <w:proofErr w:type="gramEnd"/>
+      <w:r>
+        <w:rPr>
+          <w:rFonts w:ascii="Skeena" w:hAnsi="Skeena"/>
+        </w:rPr>
+        <w:t xml:space="preserve"> comprehensive options, including partial replacement and recoating strategies (Options B through E), with costs ranging from approximately $800,000 to several million dollars. These alternatives were not recommended as they would not address the underlying drainage issues, would provide shorter warranty periods, and would not bring the facility up to current building codes (MSBA Submission, Section 6, p. 1).</w:t>
       </w:r>
     </w:p>
     <w:p>
       <w:pPr>
-        <w:jc w:val="both"/>
-        <w:rPr>
-          <w:rFonts w:ascii="Skeena" w:hAnsi="Skeena"/>
-          <w:sz w:val="28"/>
-          <w:szCs w:val="28"/>
-        </w:rPr>
-      </w:pPr>
-      <w:r>
-        <w:rPr>
-          <w:rFonts w:ascii="Skeena" w:hAnsi="Skeena"/>
-          <w:b/>
-          <w:bCs/>
-          <w:sz w:val="28"/>
-          <w:szCs w:val="28"/>
-        </w:rPr>
-        <w:t>Fixing the root cause</w:t>
-      </w:r>
-      <w:r>
-        <w:rPr>
-          <w:rFonts w:ascii="Skeena" w:hAnsi="Skeena"/>
-          <w:sz w:val="28"/>
-          <w:szCs w:val="28"/>
-        </w:rPr>
-        <w:t>: Converting from failure-prone internal drainage (pipes through the building) to external perimeter drainage that keeps water outside the envelope entirely.</w:t>
-      </w:r>
-    </w:p>
-    <w:p>
-      <w:pPr>
-        <w:jc w:val="both"/>
-        <w:rPr>
-          <w:rFonts w:ascii="Skeena" w:hAnsi="Skeena"/>
-          <w:sz w:val="28"/>
-          <w:szCs w:val="28"/>
-        </w:rPr>
-      </w:pPr>
-      <w:r>
-        <w:rPr>
-          <w:rFonts w:ascii="Skeena" w:hAnsi="Skeena"/>
-          <w:b/>
-          <w:bCs/>
-          <w:sz w:val="28"/>
-          <w:szCs w:val="28"/>
-        </w:rPr>
-        <w:t>Meeting current codes</w:t>
-      </w:r>
-      <w:r>
-        <w:rPr>
-          <w:rFonts w:ascii="Skeena" w:hAnsi="Skeena"/>
-          <w:sz w:val="28"/>
-          <w:szCs w:val="28"/>
-        </w:rPr>
-        <w:t>:</w:t>
-      </w:r>
-    </w:p>
-    <w:p>
-      <w:pPr>
-        <w:numPr>
-          <w:ilvl w:val="0"/>
-          <w:numId w:val="11"/>
-        </w:numPr>
-        <w:jc w:val="both"/>
-        <w:rPr>
-          <w:rFonts w:ascii="Skeena" w:hAnsi="Skeena"/>
-          <w:sz w:val="28"/>
-          <w:szCs w:val="28"/>
-        </w:rPr>
-      </w:pPr>
-      <w:r>
-        <w:rPr>
-          <w:rFonts w:ascii="Skeena" w:hAnsi="Skeena"/>
-          <w:sz w:val="28"/>
-          <w:szCs w:val="28"/>
-        </w:rPr>
-        <w:t>Energy efficiency (R-30 insulation vs. current R-20)</w:t>
-      </w:r>
-    </w:p>
-    <w:p>
-      <w:pPr>
-        <w:numPr>
-          <w:ilvl w:val="0"/>
-          <w:numId w:val="11"/>
-        </w:numPr>
-        <w:jc w:val="both"/>
-        <w:rPr>
-          <w:rFonts w:ascii="Skeena" w:hAnsi="Skeena"/>
-          <w:sz w:val="28"/>
-          <w:szCs w:val="28"/>
-        </w:rPr>
-      </w:pPr>
-      <w:r>
-        <w:rPr>
-          <w:rFonts w:ascii="Skeena" w:hAnsi="Skeena"/>
-          <w:sz w:val="28"/>
-          <w:szCs w:val="28"/>
-        </w:rPr>
-        <w:t>Snow load requirements (35 psf per current Massachusetts code)</w:t>
-      </w:r>
-    </w:p>
-    <w:p>
-      <w:pPr>
-        <w:numPr>
-          <w:ilvl w:val="0"/>
-          <w:numId w:val="11"/>
-        </w:numPr>
-        <w:jc w:val="both"/>
-        <w:rPr>
-          <w:rFonts w:ascii="Skeena" w:hAnsi="Skeena"/>
-          <w:sz w:val="28"/>
-          <w:szCs w:val="28"/>
-        </w:rPr>
-      </w:pPr>
-      <w:r>
-        <w:rPr>
-          <w:rFonts w:ascii="Skeena" w:hAnsi="Skeena"/>
-          <w:sz w:val="28"/>
-          <w:szCs w:val="28"/>
-        </w:rPr>
-        <w:t>Wind uplift resistance (current standards are much higher than 1994)</w:t>
-      </w:r>
-    </w:p>
-    <w:p>
-      <w:pPr>
-        <w:numPr>
-          <w:ilvl w:val="0"/>
-          <w:numId w:val="11"/>
-        </w:numPr>
-        <w:jc w:val="both"/>
-        <w:rPr>
-          <w:rFonts w:ascii="Skeena" w:hAnsi="Skeena"/>
-          <w:sz w:val="28"/>
-          <w:szCs w:val="28"/>
-        </w:rPr>
-      </w:pPr>
-      <w:r>
-        <w:rPr>
-          <w:rFonts w:ascii="Skeena" w:hAnsi="Skeena"/>
-          <w:sz w:val="28"/>
-          <w:szCs w:val="28"/>
-        </w:rPr>
-        <w:t>Solar readiness (</w:t>
-      </w:r>
-      <w:r>
-        <w:rPr>
-          <w:rFonts w:ascii="Skeena" w:hAnsi="Skeena"/>
-          <w:sz w:val="28"/>
-          <w:szCs w:val="28"/>
-        </w:rPr>
-        <w:t xml:space="preserve">OPM Vertex estimates that </w:t>
-      </w:r>
-      <w:r>
-        <w:rPr>
-          <w:rFonts w:ascii="Skeena" w:hAnsi="Skeena"/>
-          <w:sz w:val="28"/>
-          <w:szCs w:val="28"/>
-        </w:rPr>
-        <w:t>1,000 sf of structural capacity</w:t>
-      </w:r>
-      <w:r>
-        <w:rPr>
-          <w:rFonts w:ascii="Skeena" w:hAnsi="Skeena"/>
-          <w:sz w:val="28"/>
-          <w:szCs w:val="28"/>
-        </w:rPr>
-        <w:t xml:space="preserve"> will satisfy MSBA requirement</w:t>
-      </w:r>
-      <w:r>
-        <w:rPr>
-          <w:rFonts w:ascii="Skeena" w:hAnsi="Skeena"/>
-          <w:sz w:val="28"/>
-          <w:szCs w:val="28"/>
-        </w:rPr>
-        <w:t>)</w:t>
-      </w:r>
-    </w:p>
-    <w:p>
-      <w:pPr>
-        <w:jc w:val="both"/>
-        <w:rPr>
-          <w:rFonts w:ascii="Skeena" w:hAnsi="Skeena"/>
-          <w:sz w:val="28"/>
-          <w:szCs w:val="28"/>
-        </w:rPr>
-      </w:pPr>
-      <w:r>
-        <w:rPr>
-          <w:rFonts w:ascii="Skeena" w:hAnsi="Skeena"/>
-          <w:b/>
-          <w:bCs/>
-          <w:sz w:val="28"/>
-          <w:szCs w:val="28"/>
-        </w:rPr>
-        <w:t>Addressing 31 years of deferred maintenance</w:t>
-      </w:r>
-      <w:r>
-        <w:rPr>
-          <w:rFonts w:ascii="Skeena" w:hAnsi="Skeena"/>
-          <w:sz w:val="28"/>
-          <w:szCs w:val="28"/>
-        </w:rPr>
-        <w:t>:</w:t>
-      </w:r>
-    </w:p>
-    <w:p>
-      <w:pPr>
-        <w:numPr>
-          <w:ilvl w:val="0"/>
-          <w:numId w:val="12"/>
-        </w:numPr>
-        <w:jc w:val="both"/>
-        <w:rPr>
-          <w:rFonts w:ascii="Skeena" w:hAnsi="Skeena"/>
-          <w:sz w:val="28"/>
-          <w:szCs w:val="28"/>
-        </w:rPr>
-      </w:pPr>
-      <w:r>
-        <w:rPr>
-          <w:rFonts w:ascii="Skeena" w:hAnsi="Skeena"/>
-          <w:sz w:val="28"/>
-          <w:szCs w:val="28"/>
-        </w:rPr>
-        <w:t>New roof drains with proper overflow protection</w:t>
-      </w:r>
-    </w:p>
-    <w:p>
-      <w:pPr>
-        <w:numPr>
-          <w:ilvl w:val="0"/>
-          <w:numId w:val="12"/>
-        </w:numPr>
-        <w:jc w:val="both"/>
-        <w:rPr>
-          <w:rFonts w:ascii="Skeena" w:hAnsi="Skeena"/>
-          <w:sz w:val="28"/>
-          <w:szCs w:val="28"/>
-        </w:rPr>
-      </w:pPr>
-      <w:r>
-        <w:rPr>
-          <w:rFonts w:ascii="Skeena" w:hAnsi="Skeena"/>
-          <w:sz w:val="28"/>
-          <w:szCs w:val="28"/>
-        </w:rPr>
-        <w:t>Correcting inadequate roof slopes that create ponding</w:t>
-      </w:r>
-    </w:p>
-    <w:p>
-      <w:pPr>
-        <w:numPr>
-          <w:ilvl w:val="0"/>
-          <w:numId w:val="12"/>
-        </w:numPr>
-        <w:jc w:val="both"/>
-        <w:rPr>
-          <w:rFonts w:ascii="Skeena" w:hAnsi="Skeena"/>
-          <w:sz w:val="28"/>
-          <w:szCs w:val="28"/>
-        </w:rPr>
-      </w:pPr>
-      <w:r>
-        <w:rPr>
-          <w:rFonts w:ascii="Skeena" w:hAnsi="Skeena"/>
-          <w:sz w:val="28"/>
-          <w:szCs w:val="28"/>
-        </w:rPr>
-        <w:t>Replacing deteriorated masonry control joints</w:t>
-      </w:r>
-    </w:p>
-    <w:p>
-      <w:pPr>
-        <w:numPr>
-          <w:ilvl w:val="0"/>
-          <w:numId w:val="12"/>
-        </w:numPr>
-        <w:jc w:val="both"/>
-        <w:rPr>
-          <w:rFonts w:ascii="Skeena" w:hAnsi="Skeena"/>
-          <w:sz w:val="28"/>
-          <w:szCs w:val="28"/>
-        </w:rPr>
-      </w:pPr>
-      <w:r>
-        <w:rPr>
-          <w:rFonts w:ascii="Skeena" w:hAnsi="Skeena"/>
-          <w:sz w:val="28"/>
-          <w:szCs w:val="28"/>
-        </w:rPr>
-        <w:t>Installing proper vapor barriers (missing in many areas per Gale's test cuts)</w:t>
-      </w:r>
-    </w:p>
-    <w:p>
-      <w:pPr>
-        <w:jc w:val="both"/>
-        <w:rPr>
-          <w:rFonts w:ascii="Skeena" w:hAnsi="Skeena"/>
-          <w:b/>
-          <w:bCs/>
-          <w:sz w:val="28"/>
-          <w:szCs w:val="28"/>
-        </w:rPr>
-      </w:pPr>
-      <w:r>
-        <w:rPr>
-          <w:rFonts w:ascii="Skeena" w:hAnsi="Skeena"/>
-          <w:b/>
-          <w:bCs/>
-          <w:sz w:val="28"/>
-          <w:szCs w:val="28"/>
-        </w:rPr>
-        <w:t>The MSBA Window Is Closing</w:t>
-      </w:r>
-    </w:p>
-    <w:p>
-      <w:pPr>
-        <w:jc w:val="both"/>
-        <w:rPr>
-          <w:rFonts w:ascii="Skeena" w:hAnsi="Skeena"/>
-          <w:sz w:val="28"/>
-          <w:szCs w:val="28"/>
-        </w:rPr>
-      </w:pPr>
-      <w:r>
-        <w:rPr>
-          <w:rFonts w:ascii="Skeena" w:hAnsi="Skeena"/>
-          <w:sz w:val="28"/>
-          <w:szCs w:val="28"/>
-        </w:rPr>
-        <w:t>We applied for this grant every year since 2019. We finally got accepted. If we reject MSBA funding now:</w:t>
-      </w:r>
-    </w:p>
-    <w:p>
-      <w:pPr>
-        <w:numPr>
-          <w:ilvl w:val="0"/>
-          <w:numId w:val="13"/>
-        </w:numPr>
-        <w:jc w:val="both"/>
-        <w:rPr>
-          <w:rFonts w:ascii="Skeena" w:hAnsi="Skeena"/>
-          <w:sz w:val="28"/>
-          <w:szCs w:val="28"/>
-        </w:rPr>
-      </w:pPr>
-      <w:r>
-        <w:rPr>
-          <w:rFonts w:ascii="Skeena" w:hAnsi="Skeena"/>
-          <w:sz w:val="28"/>
-          <w:szCs w:val="28"/>
-        </w:rPr>
-        <w:t>We return to the back of the line with no guarantee of future acceptance</w:t>
-      </w:r>
-    </w:p>
-    <w:p>
-      <w:pPr>
-        <w:numPr>
-          <w:ilvl w:val="0"/>
-          <w:numId w:val="13"/>
-        </w:numPr>
-        <w:jc w:val="both"/>
-        <w:rPr>
-          <w:rFonts w:ascii="Skeena" w:hAnsi="Skeena"/>
-          <w:sz w:val="28"/>
-          <w:szCs w:val="28"/>
-        </w:rPr>
-      </w:pPr>
-      <w:r>
-        <w:rPr>
-          <w:rFonts w:ascii="Skeena" w:hAnsi="Skeena"/>
-          <w:sz w:val="28"/>
-          <w:szCs w:val="28"/>
-        </w:rPr>
-        <w:t>We pay 100% of costs instead of 38%</w:t>
-      </w:r>
-    </w:p>
-    <w:p>
-      <w:pPr>
-        <w:numPr>
-          <w:ilvl w:val="0"/>
-          <w:numId w:val="13"/>
-        </w:numPr>
-        <w:jc w:val="both"/>
-        <w:rPr>
-          <w:rFonts w:ascii="Skeena" w:hAnsi="Skeena"/>
-          <w:sz w:val="28"/>
-          <w:szCs w:val="28"/>
-        </w:rPr>
-      </w:pPr>
-      <w:r>
-        <w:rPr>
-          <w:rFonts w:ascii="Skeena" w:hAnsi="Skeena"/>
-          <w:sz w:val="28"/>
-          <w:szCs w:val="28"/>
-        </w:rPr>
-        <w:t>The project still needs to be done</w:t>
-      </w:r>
-    </w:p>
-    <w:p>
-      <w:pPr>
-        <w:numPr>
-          <w:ilvl w:val="0"/>
-          <w:numId w:val="13"/>
-        </w:numPr>
-        <w:jc w:val="both"/>
-        <w:rPr>
-          <w:rFonts w:ascii="Skeena" w:hAnsi="Skeena"/>
-          <w:sz w:val="28"/>
-          <w:szCs w:val="28"/>
-        </w:rPr>
-      </w:pPr>
-      <w:r>
-        <w:rPr>
-          <w:rFonts w:ascii="Skeena" w:hAnsi="Skeena"/>
-          <w:sz w:val="28"/>
-          <w:szCs w:val="28"/>
-        </w:rPr>
-        <w:lastRenderedPageBreak/>
-        <w:t>Emergency costs continue mounting while we wait</w:t>
-      </w:r>
-    </w:p>
-    <w:p>
-      <w:pPr>
-        <w:jc w:val="both"/>
-        <w:rPr>
-          <w:rFonts w:ascii="Skeena" w:hAnsi="Skeena"/>
-          <w:b/>
-          <w:bCs/>
-          <w:sz w:val="28"/>
-          <w:szCs w:val="28"/>
-        </w:rPr>
-      </w:pPr>
-      <w:r>
-        <w:rPr>
-          <w:rFonts w:ascii="Skeena" w:hAnsi="Skeena"/>
-          <w:b/>
-          <w:bCs/>
-          <w:sz w:val="28"/>
-          <w:szCs w:val="28"/>
-        </w:rPr>
-        <w:t>What Professional Engineers Found</w:t>
-      </w:r>
-    </w:p>
-    <w:p>
-      <w:pPr>
-        <w:jc w:val="both"/>
-        <w:rPr>
-          <w:rFonts w:ascii="Skeena" w:hAnsi="Skeena"/>
-          <w:sz w:val="28"/>
-          <w:szCs w:val="28"/>
-        </w:rPr>
-      </w:pPr>
-      <w:r>
-        <w:rPr>
-          <w:rFonts w:ascii="Skeena" w:hAnsi="Skeena"/>
-          <w:sz w:val="28"/>
-          <w:szCs w:val="28"/>
-        </w:rPr>
-        <w:t>From Gale Associates' evaluations:</w:t>
-      </w:r>
-    </w:p>
-    <w:p>
-      <w:pPr>
-        <w:numPr>
-          <w:ilvl w:val="0"/>
-          <w:numId w:val="14"/>
-        </w:numPr>
-        <w:jc w:val="both"/>
-        <w:rPr>
-          <w:rFonts w:ascii="Skeena" w:hAnsi="Skeena"/>
-          <w:sz w:val="28"/>
-          <w:szCs w:val="28"/>
-        </w:rPr>
-      </w:pPr>
-      <w:r>
-        <w:rPr>
-          <w:rFonts w:ascii="Skeena" w:hAnsi="Skeena"/>
-          <w:sz w:val="28"/>
-          <w:szCs w:val="28"/>
-        </w:rPr>
-        <w:t>"It is Gale's opinion that the five thermoplastic roof areas are still in serviceable condition but should be replaced in the next 3 to 5 years" (July 2022)</w:t>
-      </w:r>
-    </w:p>
-    <w:p>
-      <w:pPr>
-        <w:numPr>
-          <w:ilvl w:val="0"/>
-          <w:numId w:val="14"/>
-        </w:numPr>
-        <w:jc w:val="both"/>
-        <w:rPr>
-          <w:rFonts w:ascii="Skeena" w:hAnsi="Skeena"/>
-          <w:sz w:val="28"/>
-          <w:szCs w:val="28"/>
-        </w:rPr>
-      </w:pPr>
-      <w:r>
-        <w:rPr>
-          <w:rFonts w:ascii="Skeena" w:hAnsi="Skeena"/>
-          <w:sz w:val="28"/>
-          <w:szCs w:val="28"/>
-        </w:rPr>
-        <w:t>"The reported water leakage source is unknown at this time... water testing studies must be performed to identify leak sources" — indicating problems so complex they can't identify specific failure points</w:t>
-      </w:r>
-    </w:p>
-    <w:p>
-      <w:pPr>
-        <w:numPr>
-          <w:ilvl w:val="0"/>
-          <w:numId w:val="14"/>
-        </w:numPr>
-        <w:jc w:val="both"/>
-        <w:rPr>
-          <w:rFonts w:ascii="Skeena" w:hAnsi="Skeena"/>
-          <w:sz w:val="28"/>
-          <w:szCs w:val="28"/>
-        </w:rPr>
-      </w:pPr>
-      <w:r>
-        <w:rPr>
-          <w:rFonts w:ascii="Skeena" w:hAnsi="Skeena"/>
-          <w:sz w:val="28"/>
-          <w:szCs w:val="28"/>
-        </w:rPr>
-        <w:t>"Some existing steel joists of the auditorium framing do not have adequate capacity" for future uses without the improvements this project provides</w:t>
-      </w:r>
-    </w:p>
-    <w:p>
-      <w:pPr>
-        <w:jc w:val="both"/>
-        <w:rPr>
-          <w:rFonts w:ascii="Skeena" w:hAnsi="Skeena"/>
-          <w:b/>
-          <w:bCs/>
-          <w:sz w:val="28"/>
-          <w:szCs w:val="28"/>
-        </w:rPr>
-      </w:pPr>
-      <w:r>
-        <w:rPr>
-          <w:rFonts w:ascii="Skeena" w:hAnsi="Skeena"/>
-          <w:b/>
-          <w:bCs/>
-          <w:sz w:val="28"/>
-          <w:szCs w:val="28"/>
-        </w:rPr>
-        <w:t>The Bottom Line</w:t>
-      </w:r>
-    </w:p>
-    <w:p>
-      <w:pPr>
-        <w:jc w:val="both"/>
-        <w:rPr>
-          <w:rFonts w:ascii="Skeena" w:hAnsi="Skeena"/>
-          <w:sz w:val="28"/>
-          <w:szCs w:val="28"/>
-        </w:rPr>
-      </w:pPr>
-      <w:r>
-        <w:rPr>
-          <w:rFonts w:ascii="Skeena" w:hAnsi="Skeena"/>
-          <w:sz w:val="28"/>
-          <w:szCs w:val="28"/>
-        </w:rPr>
-        <w:t>This isn't a choice between fixing the roof now or fixing it later. It's a choice between:</w:t>
-      </w:r>
-    </w:p>
-    <w:p>
-      <w:pPr>
-        <w:numPr>
-          <w:ilvl w:val="0"/>
-          <w:numId w:val="15"/>
-        </w:numPr>
-        <w:jc w:val="both"/>
-        <w:rPr>
-          <w:rFonts w:ascii="Skeena" w:hAnsi="Skeena"/>
-          <w:sz w:val="28"/>
-          <w:szCs w:val="28"/>
-        </w:rPr>
-      </w:pPr>
-      <w:r>
-        <w:rPr>
-          <w:rFonts w:ascii="Skeena" w:hAnsi="Skeena"/>
-          <w:sz w:val="28"/>
-          <w:szCs w:val="28"/>
-        </w:rPr>
-        <w:t>Fixing it now with 62% state reimbursement, OR</w:t>
-      </w:r>
-    </w:p>
-    <w:p>
-      <w:pPr>
-        <w:numPr>
-          <w:ilvl w:val="0"/>
-          <w:numId w:val="15"/>
-        </w:numPr>
-        <w:jc w:val="both"/>
-        <w:rPr>
-          <w:rFonts w:ascii="Skeena" w:hAnsi="Skeena"/>
-          <w:sz w:val="28"/>
-          <w:szCs w:val="28"/>
-        </w:rPr>
-      </w:pPr>
-      <w:r>
-        <w:rPr>
-          <w:rFonts w:ascii="Skeena" w:hAnsi="Skeena"/>
-          <w:sz w:val="28"/>
-          <w:szCs w:val="28"/>
-        </w:rPr>
-        <w:t>Fixing it later at 100% local cost plus inflation plus emergency repairs plus potential asbestos remediation</w:t>
-      </w:r>
-    </w:p>
-    <w:p>
-      <w:pPr>
-        <w:jc w:val="both"/>
-        <w:rPr>
-          <w:rFonts w:ascii="Skeena" w:hAnsi="Skeena"/>
-          <w:sz w:val="28"/>
-          <w:szCs w:val="28"/>
-        </w:rPr>
-      </w:pPr>
-      <w:r>
-        <w:rPr>
-          <w:rFonts w:ascii="Skeena" w:hAnsi="Skeena"/>
-          <w:sz w:val="28"/>
-          <w:szCs w:val="28"/>
-        </w:rPr>
-        <w:t>The Finance Director has provided actual debt service projections. The numbers are real. The health risks are documented. The structural concerns are professional engineering findings, not speculation.</w:t>
-      </w:r>
-    </w:p>
-    <w:p>
-      <w:pPr>
-        <w:jc w:val="both"/>
-        <w:rPr>
-          <w:rFonts w:ascii="Skeena" w:hAnsi="Skeena"/>
-          <w:sz w:val="28"/>
-          <w:szCs w:val="28"/>
-        </w:rPr>
-      </w:pPr>
-      <w:r>
-        <w:rPr>
-          <w:rFonts w:ascii="Skeena" w:hAnsi="Skeena"/>
-          <w:b/>
-          <w:bCs/>
-          <w:sz w:val="28"/>
-          <w:szCs w:val="28"/>
-        </w:rPr>
-        <w:t>By November 4, MSBA will have voted.</w:t>
-      </w:r>
-      <w:r>
-        <w:rPr>
-          <w:rFonts w:ascii="Skeena" w:hAnsi="Skeena"/>
-          <w:sz w:val="28"/>
-          <w:szCs w:val="28"/>
-        </w:rPr>
-        <w:t xml:space="preserve"> They're providing $5,999,980 toward this project. Our vote decides whether we accept their funding or go it alone.</w:t>
-      </w:r>
-    </w:p>
-    <w:p>
-      <w:pPr>
-        <w:jc w:val="both"/>
-        <w:rPr>
-          <w:rFonts w:ascii="Skeena" w:hAnsi="Skeena"/>
-          <w:b/>
-          <w:bCs/>
-          <w:sz w:val="28"/>
-          <w:szCs w:val="28"/>
-        </w:rPr>
-      </w:pPr>
-      <w:r>
-        <w:rPr>
-          <w:rFonts w:ascii="Skeena" w:hAnsi="Skeena"/>
-          <w:b/>
-          <w:bCs/>
-          <w:sz w:val="28"/>
-          <w:szCs w:val="28"/>
-        </w:rPr>
-        <w:t>Motion for Town Meeting</w:t>
-      </w:r>
-    </w:p>
-    <w:p>
-      <w:pPr>
-        <w:jc w:val="both"/>
-        <w:rPr>
-          <w:rFonts w:ascii="Skeena" w:hAnsi="Skeena"/>
-          <w:sz w:val="28"/>
-          <w:szCs w:val="28"/>
-        </w:rPr>
-      </w:pPr>
-      <w:r>
-        <w:rPr>
-          <w:rFonts w:ascii="Skeena" w:hAnsi="Skeena"/>
-          <w:sz w:val="28"/>
-          <w:szCs w:val="28"/>
-        </w:rPr>
-        <w:t>"To authorize borrowing not to exceed $7,024,016 for the Amherst-Pelham Regional Middle School roof replacement project, contingent upon execution of the MSBA Project Funding Agreement providing up to $5,999,980 in state reimbursement, with the understanding that the existing roof system has active leaks, documented safety concerns, and has exceeded its warranty by 16 years."</w:t>
-      </w:r>
-    </w:p>
-    <w:p>
-      <w:pPr>
-        <w:jc w:val="both"/>
-        <w:rPr>
-          <w:rFonts w:ascii="Skeena" w:hAnsi="Skeena"/>
-          <w:sz w:val="28"/>
-          <w:szCs w:val="28"/>
-        </w:rPr>
-      </w:pPr>
-      <w:r>
-        <w:rPr>
-          <w:rFonts w:ascii="Skeena" w:hAnsi="Skeena"/>
-          <w:sz w:val="28"/>
-          <w:szCs w:val="28"/>
-        </w:rPr>
-        <w:lastRenderedPageBreak/>
-        <w:pict w14:anchorId="299D7C90">
-          <v:rect id="_x0000_i1040" style="width:0;height:1.5pt" o:hralign="center" o:hrstd="t" o:hr="t" fillcolor="#a0a0a0" stroked="f"/>
-        </w:pict>
-      </w:r>
-    </w:p>
-    <w:p>
-      <w:pPr>
-        <w:jc w:val="both"/>
-        <w:rPr>
-          <w:rFonts w:ascii="Skeena" w:hAnsi="Skeena"/>
-          <w:sz w:val="28"/>
-          <w:szCs w:val="28"/>
-        </w:rPr>
-      </w:pPr>
-      <w:r>
-        <w:rPr>
-          <w:rFonts w:ascii="Skeena" w:hAnsi="Skeena"/>
-          <w:b/>
-          <w:bCs/>
-          <w:sz w:val="28"/>
-          <w:szCs w:val="28"/>
-        </w:rPr>
-        <w:t>For Finance Committee discussion</w:t>
-      </w:r>
-      <w:r>
-        <w:rPr>
-          <w:rFonts w:ascii="Skeena" w:hAnsi="Skeena"/>
-          <w:sz w:val="28"/>
-          <w:szCs w:val="28"/>
-        </w:rPr>
-        <w:t>: Frame this as risk management, not just capital investment. We have documented water infiltration, asbestos exposure risks, and structural concerns. The professional engineering reports make clear this isn't optional — it's mandatory infrastructure replacement. The only question is whether we take the state's money or not.</w:t>
-      </w:r>
-    </w:p>
-    <w:p>
-      <w:pPr>
-        <w:jc w:val="both"/>
-        <w:rPr>
-          <w:rFonts w:ascii="Skeena" w:hAnsi="Skeena"/>
-          <w:sz w:val="28"/>
-          <w:szCs w:val="28"/>
+        <w:rPr>
+          <w:rFonts w:ascii="Skeena" w:hAnsi="Skeena"/>
         </w:rPr>
       </w:pPr>
     </w:p>
@@ -1727,9 +439,9 @@
 <file path=word/numbering.xml><?xml version="1.0" encoding="utf-8"?>
 <w:numbering xmlns:wpc="http://schemas.microsoft.com/office/word/2010/wordprocessingCanvas" xmlns:cx="http://schemas.microsoft.com/office/drawing/2014/chartex" xmlns:cx1="http://schemas.microsoft.com/office/drawing/2015/9/8/chartex" xmlns:cx2="http://schemas.microsoft.com/office/drawing/2015/10/21/chartex" xmlns:cx3="http://schemas.microsoft.com/office/drawing/2016/5/9/chartex" xmlns:cx4="http://schemas.microsoft.com/office/drawing/2016/5/10/chartex" xmlns:cx5="http://schemas.microsoft.com/office/drawing/2016/5/11/chartex" xmlns:cx6="http://schemas.microsoft.com/office/drawing/2016/5/12/chartex" xmlns:cx7="http://schemas.microsoft.com/office/drawing/2016/5/13/chartex" xmlns:cx8="http://schemas.microsoft.com/office/drawing/2016/5/14/chartex" xmlns:mc="http://schemas.openxmlformats.org/markup-compatibility/2006" xmlns:aink="http://schemas.microsoft.com/office/drawing/2016/ink" xmlns:am3d="http://schemas.microsoft.com/office/drawing/2017/model3d" xmlns:o="urn:schemas-microsoft-com:office:office" xmlns:oel="http://schemas.microsoft.com/office/2019/extlst" xmlns:r="http://schemas.openxmlformats.org/officeDocument/2006/relationships" xmlns:m="http://schemas.openxmlformats.org/officeDocument/2006/math" xmlns:v="urn:schemas-microsoft-com:vml" xmlns:wp14="http://schemas.microsoft.com/office/word/2010/wordprocessingDrawing" xmlns:wp="http://schemas.openxmlformats.org/drawingml/2006/wordprocessingDrawing" xmlns:w10="urn:schemas-microsoft-com:office:word" xmlns:w="http://schemas.openxmlformats.org/wordprocessingml/2006/main" xmlns:w14="http://schemas.microsoft.com/office/word/2010/wordml" xmlns:w15="http://schemas.microsoft.com/office/word/2012/wordml" xmlns:w16cex="http://schemas.microsoft.com/office/word/2018/wordml/cex" xmlns:w16cid="http://schemas.microsoft.com/office/word/2016/wordml/cid" xmlns:w16="http://schemas.microsoft.com/office/word/2018/wordml" xmlns:w16du="http://schemas.microsoft.com/office/word/2023/wordml/word16du" xmlns:w16sdtdh="http://schemas.microsoft.com/office/word/2020/wordml/sdtdatahash" xmlns:w16sdtfl="http://schemas.microsoft.com/office/word/2024/wordml/sdtformatlock" xmlns:w16se="http://schemas.microsoft.com/office/word/2015/wordml/symex" xmlns:wpg="http://schemas.microsoft.com/office/word/2010/wordprocessingGroup" xmlns:wpi="http://schemas.microsoft.com/office/word/2010/wordprocessingInk" xmlns:wne="http://schemas.microsoft.com/office/word/2006/wordml" xmlns:wps="http://schemas.microsoft.com/office/word/2010/wordprocessingShape" mc:Ignorable="w14 w15 w16se w16cid w16 w16cex w16sdtdh w16sdtfl w16du wp14">
   <w:abstractNum w:abstractNumId="0" w15:restartNumberingAfterBreak="0">
-    <w:nsid w:val="0C9D1DE2"/>
+    <w:nsid w:val="0448654F"/>
     <w:multiLevelType w:val="multilevel"/>
-    <w:tmpl w:val="3FB8CC80"/>
+    <w:tmpl w:val="9580E018"/>
     <w:lvl w:ilvl="0">
       <w:start w:val="1"/>
       <w:numFmt w:val="bullet"/>
@@ -1876,9 +588,9 @@
     </w:lvl>
   </w:abstractNum>
   <w:abstractNum w:abstractNumId="1" w15:restartNumberingAfterBreak="0">
-    <w:nsid w:val="13985B23"/>
+    <w:nsid w:val="16A8729D"/>
     <w:multiLevelType w:val="multilevel"/>
-    <w:tmpl w:val="2C7289E0"/>
+    <w:tmpl w:val="62222042"/>
     <w:lvl w:ilvl="0">
       <w:start w:val="1"/>
       <w:numFmt w:val="bullet"/>
@@ -2025,9 +737,9 @@
     </w:lvl>
   </w:abstractNum>
   <w:abstractNum w:abstractNumId="2" w15:restartNumberingAfterBreak="0">
-    <w:nsid w:val="1F483E2C"/>
+    <w:nsid w:val="1DB4401D"/>
     <w:multiLevelType w:val="multilevel"/>
-    <w:tmpl w:val="D0781584"/>
+    <w:tmpl w:val="BAF28C0A"/>
     <w:lvl w:ilvl="0">
       <w:start w:val="1"/>
       <w:numFmt w:val="bullet"/>
@@ -2174,13 +886,13 @@
     </w:lvl>
   </w:abstractNum>
   <w:abstractNum w:abstractNumId="3" w15:restartNumberingAfterBreak="0">
-    <w:nsid w:val="1F553825"/>
+    <w:nsid w:val="25FC7DA9"/>
     <w:multiLevelType w:val="multilevel"/>
-    <w:tmpl w:val="2A2E79BE"/>
+    <w:tmpl w:val="186C3482"/>
     <w:lvl w:ilvl="0">
       <w:start w:val="1"/>
-      <w:numFmt w:val="decimal"/>
-      <w:lvlText w:val="%1."/>
+      <w:numFmt w:val="bullet"/>
+      <w:lvlText w:val=""/>
       <w:lvlJc w:val="left"/>
       <w:pPr>
         <w:tabs>
@@ -2188,11 +900,15 @@
         </w:tabs>
         <w:ind w:left="720" w:hanging="360"/>
       </w:pPr>
+      <w:rPr>
+        <w:rFonts w:ascii="Symbol" w:hAnsi="Symbol" w:hint="default"/>
+        <w:sz w:val="20"/>
+      </w:rPr>
     </w:lvl>
     <w:lvl w:ilvl="1" w:tentative="1">
       <w:start w:val="1"/>
-      <w:numFmt w:val="decimal"/>
-      <w:lvlText w:val="%2."/>
+      <w:numFmt w:val="bullet"/>
+      <w:lvlText w:val="o"/>
       <w:lvlJc w:val="left"/>
       <w:pPr>
         <w:tabs>
@@ -2200,11 +916,15 @@
         </w:tabs>
         <w:ind w:left="1440" w:hanging="360"/>
       </w:pPr>
+      <w:rPr>
+        <w:rFonts w:ascii="Courier New" w:hAnsi="Courier New" w:hint="default"/>
+        <w:sz w:val="20"/>
+      </w:rPr>
     </w:lvl>
     <w:lvl w:ilvl="2" w:tentative="1">
       <w:start w:val="1"/>
-      <w:numFmt w:val="decimal"/>
-      <w:lvlText w:val="%3."/>
+      <w:numFmt w:val="bullet"/>
+      <w:lvlText w:val=""/>
       <w:lvlJc w:val="left"/>
       <w:pPr>
         <w:tabs>
@@ -2212,11 +932,15 @@
         </w:tabs>
         <w:ind w:left="2160" w:hanging="360"/>
       </w:pPr>
+      <w:rPr>
+        <w:rFonts w:ascii="Wingdings" w:hAnsi="Wingdings" w:hint="default"/>
+        <w:sz w:val="20"/>
+      </w:rPr>
     </w:lvl>
     <w:lvl w:ilvl="3" w:tentative="1">
       <w:start w:val="1"/>
-      <w:numFmt w:val="decimal"/>
-      <w:lvlText w:val="%4."/>
+      <w:numFmt w:val="bullet"/>
+      <w:lvlText w:val=""/>
       <w:lvlJc w:val="left"/>
       <w:pPr>
         <w:tabs>
@@ -2224,11 +948,15 @@
         </w:tabs>
         <w:ind w:left="2880" w:hanging="360"/>
       </w:pPr>
+      <w:rPr>
+        <w:rFonts w:ascii="Wingdings" w:hAnsi="Wingdings" w:hint="default"/>
+        <w:sz w:val="20"/>
+      </w:rPr>
     </w:lvl>
     <w:lvl w:ilvl="4" w:tentative="1">
       <w:start w:val="1"/>
-      <w:numFmt w:val="decimal"/>
-      <w:lvlText w:val="%5."/>
+      <w:numFmt w:val="bullet"/>
+      <w:lvlText w:val=""/>
       <w:lvlJc w:val="left"/>
       <w:pPr>
         <w:tabs>
@@ -2236,11 +964,15 @@
         </w:tabs>
         <w:ind w:left="3600" w:hanging="360"/>
       </w:pPr>
+      <w:rPr>
+        <w:rFonts w:ascii="Wingdings" w:hAnsi="Wingdings" w:hint="default"/>
+        <w:sz w:val="20"/>
+      </w:rPr>
     </w:lvl>
     <w:lvl w:ilvl="5" w:tentative="1">
       <w:start w:val="1"/>
-      <w:numFmt w:val="decimal"/>
-      <w:lvlText w:val="%6."/>
+      <w:numFmt w:val="bullet"/>
+      <w:lvlText w:val=""/>
       <w:lvlJc w:val="left"/>
       <w:pPr>
         <w:tabs>
@@ -2248,11 +980,15 @@
         </w:tabs>
         <w:ind w:left="4320" w:hanging="360"/>
       </w:pPr>
+      <w:rPr>
+        <w:rFonts w:ascii="Wingdings" w:hAnsi="Wingdings" w:hint="default"/>
+        <w:sz w:val="20"/>
+      </w:rPr>
     </w:lvl>
     <w:lvl w:ilvl="6" w:tentative="1">
       <w:start w:val="1"/>
-      <w:numFmt w:val="decimal"/>
-      <w:lvlText w:val="%7."/>
+      <w:numFmt w:val="bullet"/>
+      <w:lvlText w:val=""/>
       <w:lvlJc w:val="left"/>
       <w:pPr>
         <w:tabs>
@@ -2260,11 +996,15 @@
         </w:tabs>
         <w:ind w:left="5040" w:hanging="360"/>
       </w:pPr>
+      <w:rPr>
+        <w:rFonts w:ascii="Wingdings" w:hAnsi="Wingdings" w:hint="default"/>
+        <w:sz w:val="20"/>
+      </w:rPr>
     </w:lvl>
     <w:lvl w:ilvl="7" w:tentative="1">
       <w:start w:val="1"/>
-      <w:numFmt w:val="decimal"/>
-      <w:lvlText w:val="%8."/>
+      <w:numFmt w:val="bullet"/>
+      <w:lvlText w:val=""/>
       <w:lvlJc w:val="left"/>
       <w:pPr>
         <w:tabs>
@@ -2272,11 +1012,15 @@
         </w:tabs>
         <w:ind w:left="5760" w:hanging="360"/>
       </w:pPr>
+      <w:rPr>
+        <w:rFonts w:ascii="Wingdings" w:hAnsi="Wingdings" w:hint="default"/>
+        <w:sz w:val="20"/>
+      </w:rPr>
     </w:lvl>
     <w:lvl w:ilvl="8" w:tentative="1">
       <w:start w:val="1"/>
-      <w:numFmt w:val="decimal"/>
-      <w:lvlText w:val="%9."/>
+      <w:numFmt w:val="bullet"/>
+      <w:lvlText w:val=""/>
       <w:lvlJc w:val="left"/>
       <w:pPr>
         <w:tabs>
@@ -2284,12 +1028,16 @@
         </w:tabs>
         <w:ind w:left="6480" w:hanging="360"/>
       </w:pPr>
+      <w:rPr>
+        <w:rFonts w:ascii="Wingdings" w:hAnsi="Wingdings" w:hint="default"/>
+        <w:sz w:val="20"/>
+      </w:rPr>
     </w:lvl>
   </w:abstractNum>
   <w:abstractNum w:abstractNumId="4" w15:restartNumberingAfterBreak="0">
-    <w:nsid w:val="2A484150"/>
+    <w:nsid w:val="3BFF6B45"/>
     <w:multiLevelType w:val="multilevel"/>
-    <w:tmpl w:val="CA64EA90"/>
+    <w:tmpl w:val="FEB40BAE"/>
     <w:lvl w:ilvl="0">
       <w:start w:val="1"/>
       <w:numFmt w:val="bullet"/>
@@ -2436,9 +1184,9 @@
     </w:lvl>
   </w:abstractNum>
   <w:abstractNum w:abstractNumId="5" w15:restartNumberingAfterBreak="0">
-    <w:nsid w:val="2DC652D6"/>
+    <w:nsid w:val="3CEC5DCC"/>
     <w:multiLevelType w:val="multilevel"/>
-    <w:tmpl w:val="5AC82798"/>
+    <w:tmpl w:val="6F9085EE"/>
     <w:lvl w:ilvl="0">
       <w:start w:val="1"/>
       <w:numFmt w:val="bullet"/>
@@ -2585,9 +1333,9 @@
     </w:lvl>
   </w:abstractNum>
   <w:abstractNum w:abstractNumId="6" w15:restartNumberingAfterBreak="0">
-    <w:nsid w:val="30BD1287"/>
+    <w:nsid w:val="494E7DF2"/>
     <w:multiLevelType w:val="multilevel"/>
-    <w:tmpl w:val="FCA4B15E"/>
+    <w:tmpl w:val="005296FE"/>
     <w:lvl w:ilvl="0">
       <w:start w:val="1"/>
       <w:numFmt w:val="bullet"/>
@@ -2734,9 +1482,9 @@
     </w:lvl>
   </w:abstractNum>
   <w:abstractNum w:abstractNumId="7" w15:restartNumberingAfterBreak="0">
-    <w:nsid w:val="46AD302E"/>
+    <w:nsid w:val="4C77441F"/>
     <w:multiLevelType w:val="multilevel"/>
-    <w:tmpl w:val="037C04F6"/>
+    <w:tmpl w:val="321EFA58"/>
     <w:lvl w:ilvl="0">
       <w:start w:val="1"/>
       <w:numFmt w:val="bullet"/>
@@ -2883,9 +1631,9 @@
     </w:lvl>
   </w:abstractNum>
   <w:abstractNum w:abstractNumId="8" w15:restartNumberingAfterBreak="0">
-    <w:nsid w:val="4BE84954"/>
+    <w:nsid w:val="50DE2DC6"/>
     <w:multiLevelType w:val="multilevel"/>
-    <w:tmpl w:val="D78A5A6C"/>
+    <w:tmpl w:val="767E36AA"/>
     <w:lvl w:ilvl="0">
       <w:start w:val="1"/>
       <w:numFmt w:val="bullet"/>
@@ -3032,9 +1780,9 @@
     </w:lvl>
   </w:abstractNum>
   <w:abstractNum w:abstractNumId="9" w15:restartNumberingAfterBreak="0">
-    <w:nsid w:val="4DC41008"/>
+    <w:nsid w:val="532D319D"/>
     <w:multiLevelType w:val="multilevel"/>
-    <w:tmpl w:val="7EBC849E"/>
+    <w:tmpl w:val="28EC5E4A"/>
     <w:lvl w:ilvl="0">
       <w:start w:val="1"/>
       <w:numFmt w:val="bullet"/>
@@ -3181,9 +1929,9 @@
     </w:lvl>
   </w:abstractNum>
   <w:abstractNum w:abstractNumId="10" w15:restartNumberingAfterBreak="0">
-    <w:nsid w:val="52EE4025"/>
+    <w:nsid w:val="5C933457"/>
     <w:multiLevelType w:val="multilevel"/>
-    <w:tmpl w:val="2168D7FE"/>
+    <w:tmpl w:val="54C0DE32"/>
     <w:lvl w:ilvl="0">
       <w:start w:val="1"/>
       <w:numFmt w:val="bullet"/>
@@ -3330,9 +2078,9 @@
     </w:lvl>
   </w:abstractNum>
   <w:abstractNum w:abstractNumId="11" w15:restartNumberingAfterBreak="0">
-    <w:nsid w:val="686239D8"/>
+    <w:nsid w:val="5D8F137A"/>
     <w:multiLevelType w:val="multilevel"/>
-    <w:tmpl w:val="C02A9582"/>
+    <w:tmpl w:val="AA2CE62C"/>
     <w:lvl w:ilvl="0">
       <w:start w:val="1"/>
       <w:numFmt w:val="bullet"/>
@@ -3479,9 +2227,9 @@
     </w:lvl>
   </w:abstractNum>
   <w:abstractNum w:abstractNumId="12" w15:restartNumberingAfterBreak="0">
-    <w:nsid w:val="6A1E57AB"/>
+    <w:nsid w:val="6B55740C"/>
     <w:multiLevelType w:val="multilevel"/>
-    <w:tmpl w:val="2AF6A208"/>
+    <w:tmpl w:val="73145B84"/>
     <w:lvl w:ilvl="0">
       <w:start w:val="1"/>
       <w:numFmt w:val="bullet"/>
@@ -3628,9 +2376,9 @@
     </w:lvl>
   </w:abstractNum>
   <w:abstractNum w:abstractNumId="13" w15:restartNumberingAfterBreak="0">
-    <w:nsid w:val="746D3CF1"/>
+    <w:nsid w:val="723815E3"/>
     <w:multiLevelType w:val="multilevel"/>
-    <w:tmpl w:val="665AF0D0"/>
+    <w:tmpl w:val="A8BE0E0E"/>
     <w:lvl w:ilvl="0">
       <w:start w:val="1"/>
       <w:numFmt w:val="bullet"/>
@@ -3776,200 +2524,49 @@
       </w:rPr>
     </w:lvl>
   </w:abstractNum>
-  <w:abstractNum w:abstractNumId="14" w15:restartNumberingAfterBreak="0">
-    <w:nsid w:val="7753071D"/>
-    <w:multiLevelType w:val="multilevel"/>
-    <w:tmpl w:val="14F2CE70"/>
-    <w:lvl w:ilvl="0">
-      <w:start w:val="1"/>
-      <w:numFmt w:val="bullet"/>
-      <w:lvlText w:val=""/>
-      <w:lvlJc w:val="left"/>
-      <w:pPr>
-        <w:tabs>
-          <w:tab w:val="num" w:pos="720"/>
-        </w:tabs>
-        <w:ind w:left="720" w:hanging="360"/>
-      </w:pPr>
-      <w:rPr>
-        <w:rFonts w:ascii="Symbol" w:hAnsi="Symbol" w:hint="default"/>
-        <w:sz w:val="20"/>
-      </w:rPr>
-    </w:lvl>
-    <w:lvl w:ilvl="1" w:tentative="1">
-      <w:start w:val="1"/>
-      <w:numFmt w:val="bullet"/>
-      <w:lvlText w:val="o"/>
-      <w:lvlJc w:val="left"/>
-      <w:pPr>
-        <w:tabs>
-          <w:tab w:val="num" w:pos="1440"/>
-        </w:tabs>
-        <w:ind w:left="1440" w:hanging="360"/>
-      </w:pPr>
-      <w:rPr>
-        <w:rFonts w:ascii="Courier New" w:hAnsi="Courier New" w:hint="default"/>
-        <w:sz w:val="20"/>
-      </w:rPr>
-    </w:lvl>
-    <w:lvl w:ilvl="2" w:tentative="1">
-      <w:start w:val="1"/>
-      <w:numFmt w:val="bullet"/>
-      <w:lvlText w:val=""/>
-      <w:lvlJc w:val="left"/>
-      <w:pPr>
-        <w:tabs>
-          <w:tab w:val="num" w:pos="2160"/>
-        </w:tabs>
-        <w:ind w:left="2160" w:hanging="360"/>
-      </w:pPr>
-      <w:rPr>
-        <w:rFonts w:ascii="Wingdings" w:hAnsi="Wingdings" w:hint="default"/>
-        <w:sz w:val="20"/>
-      </w:rPr>
-    </w:lvl>
-    <w:lvl w:ilvl="3" w:tentative="1">
-      <w:start w:val="1"/>
-      <w:numFmt w:val="bullet"/>
-      <w:lvlText w:val=""/>
-      <w:lvlJc w:val="left"/>
-      <w:pPr>
-        <w:tabs>
-          <w:tab w:val="num" w:pos="2880"/>
-        </w:tabs>
-        <w:ind w:left="2880" w:hanging="360"/>
-      </w:pPr>
-      <w:rPr>
-        <w:rFonts w:ascii="Wingdings" w:hAnsi="Wingdings" w:hint="default"/>
-        <w:sz w:val="20"/>
-      </w:rPr>
-    </w:lvl>
-    <w:lvl w:ilvl="4" w:tentative="1">
-      <w:start w:val="1"/>
-      <w:numFmt w:val="bullet"/>
-      <w:lvlText w:val=""/>
-      <w:lvlJc w:val="left"/>
-      <w:pPr>
-        <w:tabs>
-          <w:tab w:val="num" w:pos="3600"/>
-        </w:tabs>
-        <w:ind w:left="3600" w:hanging="360"/>
-      </w:pPr>
-      <w:rPr>
-        <w:rFonts w:ascii="Wingdings" w:hAnsi="Wingdings" w:hint="default"/>
-        <w:sz w:val="20"/>
-      </w:rPr>
-    </w:lvl>
-    <w:lvl w:ilvl="5" w:tentative="1">
-      <w:start w:val="1"/>
-      <w:numFmt w:val="bullet"/>
-      <w:lvlText w:val=""/>
-      <w:lvlJc w:val="left"/>
-      <w:pPr>
-        <w:tabs>
-          <w:tab w:val="num" w:pos="4320"/>
-        </w:tabs>
-        <w:ind w:left="4320" w:hanging="360"/>
-      </w:pPr>
-      <w:rPr>
-        <w:rFonts w:ascii="Wingdings" w:hAnsi="Wingdings" w:hint="default"/>
-        <w:sz w:val="20"/>
-      </w:rPr>
-    </w:lvl>
-    <w:lvl w:ilvl="6" w:tentative="1">
-      <w:start w:val="1"/>
-      <w:numFmt w:val="bullet"/>
-      <w:lvlText w:val=""/>
-      <w:lvlJc w:val="left"/>
-      <w:pPr>
-        <w:tabs>
-          <w:tab w:val="num" w:pos="5040"/>
-        </w:tabs>
-        <w:ind w:left="5040" w:hanging="360"/>
-      </w:pPr>
-      <w:rPr>
-        <w:rFonts w:ascii="Wingdings" w:hAnsi="Wingdings" w:hint="default"/>
-        <w:sz w:val="20"/>
-      </w:rPr>
-    </w:lvl>
-    <w:lvl w:ilvl="7" w:tentative="1">
-      <w:start w:val="1"/>
-      <w:numFmt w:val="bullet"/>
-      <w:lvlText w:val=""/>
-      <w:lvlJc w:val="left"/>
-      <w:pPr>
-        <w:tabs>
-          <w:tab w:val="num" w:pos="5760"/>
-        </w:tabs>
-        <w:ind w:left="5760" w:hanging="360"/>
-      </w:pPr>
-      <w:rPr>
-        <w:rFonts w:ascii="Wingdings" w:hAnsi="Wingdings" w:hint="default"/>
-        <w:sz w:val="20"/>
-      </w:rPr>
-    </w:lvl>
-    <w:lvl w:ilvl="8" w:tentative="1">
-      <w:start w:val="1"/>
-      <w:numFmt w:val="bullet"/>
-      <w:lvlText w:val=""/>
-      <w:lvlJc w:val="left"/>
-      <w:pPr>
-        <w:tabs>
-          <w:tab w:val="num" w:pos="6480"/>
-        </w:tabs>
-        <w:ind w:left="6480" w:hanging="360"/>
-      </w:pPr>
-      <w:rPr>
-        <w:rFonts w:ascii="Wingdings" w:hAnsi="Wingdings" w:hint="default"/>
-        <w:sz w:val="20"/>
-      </w:rPr>
-    </w:lvl>
-  </w:abstractNum>
-  <w:num w:numId="1" w16cid:durableId="1960258754">
+  <w:num w:numId="1" w16cid:durableId="1448309999">
+    <w:abstractNumId w:val="10"/>
+  </w:num>
+  <w:num w:numId="2" w16cid:durableId="915019574">
+    <w:abstractNumId w:val="4"/>
+  </w:num>
+  <w:num w:numId="3" w16cid:durableId="1792020129">
+    <w:abstractNumId w:val="2"/>
+  </w:num>
+  <w:num w:numId="4" w16cid:durableId="1751344126">
+    <w:abstractNumId w:val="11"/>
+  </w:num>
+  <w:num w:numId="5" w16cid:durableId="1028334816">
+    <w:abstractNumId w:val="8"/>
+  </w:num>
+  <w:num w:numId="6" w16cid:durableId="1554536795">
+    <w:abstractNumId w:val="7"/>
+  </w:num>
+  <w:num w:numId="7" w16cid:durableId="1717243985">
+    <w:abstractNumId w:val="9"/>
+  </w:num>
+  <w:num w:numId="8" w16cid:durableId="1878423261">
+    <w:abstractNumId w:val="3"/>
+  </w:num>
+  <w:num w:numId="9" w16cid:durableId="1150250499">
+    <w:abstractNumId w:val="5"/>
+  </w:num>
+  <w:num w:numId="10" w16cid:durableId="175585763">
     <w:abstractNumId w:val="6"/>
   </w:num>
-  <w:num w:numId="2" w16cid:durableId="1729063571">
-    <w:abstractNumId w:val="10"/>
+  <w:num w:numId="11" w16cid:durableId="1121075564">
+    <w:abstractNumId w:val="13"/>
   </w:num>
-  <w:num w:numId="3" w16cid:durableId="1565602884">
+  <w:num w:numId="12" w16cid:durableId="1953514049">
+    <w:abstractNumId w:val="1"/>
+  </w:num>
+  <w:num w:numId="13" w16cid:durableId="556162490">
     <w:abstractNumId w:val="12"/>
   </w:num>
-  <w:num w:numId="4" w16cid:durableId="448822521">
-    <w:abstractNumId w:val="9"/>
-  </w:num>
-  <w:num w:numId="5" w16cid:durableId="922448116">
-    <w:abstractNumId w:val="5"/>
-  </w:num>
-  <w:num w:numId="6" w16cid:durableId="4211346">
-    <w:abstractNumId w:val="3"/>
-  </w:num>
-  <w:num w:numId="7" w16cid:durableId="1761634477">
+  <w:num w:numId="14" w16cid:durableId="1364553042">
     <w:abstractNumId w:val="0"/>
   </w:num>
-  <w:num w:numId="8" w16cid:durableId="2039117266">
-    <w:abstractNumId w:val="1"/>
-  </w:num>
-  <w:num w:numId="9" w16cid:durableId="547885980">
-    <w:abstractNumId w:val="4"/>
-  </w:num>
-  <w:num w:numId="10" w16cid:durableId="194540824">
-    <w:abstractNumId w:val="13"/>
-  </w:num>
-  <w:num w:numId="11" w16cid:durableId="628322219">
-    <w:abstractNumId w:val="14"/>
-  </w:num>
-  <w:num w:numId="12" w16cid:durableId="1263957575">
-    <w:abstractNumId w:val="7"/>
-  </w:num>
-  <w:num w:numId="13" w16cid:durableId="923144975">
-    <w:abstractNumId w:val="8"/>
-  </w:num>
-  <w:num w:numId="14" w16cid:durableId="287008475">
-    <w:abstractNumId w:val="11"/>
-  </w:num>
-  <w:num w:numId="15" w16cid:durableId="1672636910">
-    <w:abstractNumId w:val="2"/>
-  </w:num>
+  <w:numIdMacAtCleanup w:val="14"/>
 </w:numbering>
 </file>
 
@@ -4381,7 +2978,7 @@
     <w:link w:val="Heading1Char"/>
     <w:uiPriority w:val="9"/>
     <w:qFormat/>
-    <w:rsid w:val="007010A6"/>
+    <w:rsid w:val="009F52B1"/>
     <w:pPr>
       <w:keepNext/>
       <w:keepLines/>
@@ -4389,8 +2986,10 @@
       <w:outlineLvl w:val="0"/>
     </w:pPr>
     <w:rPr>
-      <w:rFonts w:asciiTheme="majorHAnsi" w:eastAsiaTheme="majorEastAsia" w:hAnsiTheme="majorHAnsi" w:cstheme="majorBidi"/>
-      <w:color w:val="0F4761" w:themeColor="accent1" w:themeShade="BF"/>
+      <w:rFonts w:ascii="Skeena" w:eastAsiaTheme="majorEastAsia" w:hAnsi="Skeena" w:cstheme="majorBidi"/>
+      <w:b/>
+      <w:bCs/>
+      <w:color w:val="41631B"/>
       <w:sz w:val="40"/>
       <w:szCs w:val="40"/>
     </w:rPr>
@@ -4401,19 +3000,20 @@
     <w:next w:val="Normal"/>
     <w:link w:val="Heading2Char"/>
     <w:uiPriority w:val="9"/>
-    <w:semiHidden/>
     <w:unhideWhenUsed/>
     <w:qFormat/>
-    <w:rsid w:val="007010A6"/>
+    <w:rsid w:val="009F52B1"/>
     <w:pPr>
       <w:keepNext/>
       <w:keepLines/>
-      <w:spacing w:before="160" w:after="80"/>
+      <w:spacing w:before="480" w:after="80"/>
       <w:outlineLvl w:val="1"/>
     </w:pPr>
     <w:rPr>
-      <w:rFonts w:asciiTheme="majorHAnsi" w:eastAsiaTheme="majorEastAsia" w:hAnsiTheme="majorHAnsi" w:cstheme="majorBidi"/>
-      <w:color w:val="0F4761" w:themeColor="accent1" w:themeShade="BF"/>
+      <w:rFonts w:ascii="Skeena" w:eastAsiaTheme="majorEastAsia" w:hAnsi="Skeena" w:cstheme="majorBidi"/>
+      <w:b/>
+      <w:bCs/>
+      <w:color w:val="72AF2F"/>
       <w:sz w:val="32"/>
       <w:szCs w:val="32"/>
     </w:rPr>
@@ -4424,10 +3024,9 @@
     <w:next w:val="Normal"/>
     <w:link w:val="Heading3Char"/>
     <w:uiPriority w:val="9"/>
-    <w:semiHidden/>
     <w:unhideWhenUsed/>
     <w:qFormat/>
-    <w:rsid w:val="007010A6"/>
+    <w:rsid w:val="007B03C3"/>
     <w:pPr>
       <w:keepNext/>
       <w:keepLines/>
@@ -4435,10 +3034,11 @@
       <w:outlineLvl w:val="2"/>
     </w:pPr>
     <w:rPr>
-      <w:rFonts w:eastAsiaTheme="majorEastAsia" w:cstheme="majorBidi"/>
+      <w:rFonts w:ascii="Skeena" w:eastAsiaTheme="majorEastAsia" w:hAnsi="Skeena" w:cstheme="majorBidi"/>
       <w:color w:val="0F4761" w:themeColor="accent1" w:themeShade="BF"/>
       <w:sz w:val="28"/>
       <w:szCs w:val="28"/>
+      <w:u w:val="single"/>
     </w:rPr>
   </w:style>
   <w:style w:type="paragraph" w:styleId="Heading4">
@@ -4604,10 +3204,12 @@
     <w:basedOn w:val="DefaultParagraphFont"/>
     <w:link w:val="Heading1"/>
     <w:uiPriority w:val="9"/>
-    <w:rsid w:val="007010A6"/>
+    <w:rsid w:val="009F52B1"/>
     <w:rPr>
-      <w:rFonts w:asciiTheme="majorHAnsi" w:eastAsiaTheme="majorEastAsia" w:hAnsiTheme="majorHAnsi" w:cstheme="majorBidi"/>
-      <w:color w:val="0F4761" w:themeColor="accent1" w:themeShade="BF"/>
+      <w:rFonts w:ascii="Skeena" w:eastAsiaTheme="majorEastAsia" w:hAnsi="Skeena" w:cstheme="majorBidi"/>
+      <w:b/>
+      <w:bCs/>
+      <w:color w:val="41631B"/>
       <w:sz w:val="40"/>
       <w:szCs w:val="40"/>
     </w:rPr>
@@ -4617,11 +3219,12 @@
     <w:basedOn w:val="DefaultParagraphFont"/>
     <w:link w:val="Heading2"/>
     <w:uiPriority w:val="9"/>
-    <w:semiHidden/>
-    <w:rsid w:val="007010A6"/>
+    <w:rsid w:val="009F52B1"/>
     <w:rPr>
-      <w:rFonts w:asciiTheme="majorHAnsi" w:eastAsiaTheme="majorEastAsia" w:hAnsiTheme="majorHAnsi" w:cstheme="majorBidi"/>
-      <w:color w:val="0F4761" w:themeColor="accent1" w:themeShade="BF"/>
+      <w:rFonts w:ascii="Skeena" w:eastAsiaTheme="majorEastAsia" w:hAnsi="Skeena" w:cstheme="majorBidi"/>
+      <w:b/>
+      <w:bCs/>
+      <w:color w:val="72AF2F"/>
       <w:sz w:val="32"/>
       <w:szCs w:val="32"/>
     </w:rPr>
@@ -4631,13 +3234,13 @@
     <w:basedOn w:val="DefaultParagraphFont"/>
     <w:link w:val="Heading3"/>
     <w:uiPriority w:val="9"/>
-    <w:semiHidden/>
-    <w:rsid w:val="007010A6"/>
+    <w:rsid w:val="007B03C3"/>
     <w:rPr>
-      <w:rFonts w:eastAsiaTheme="majorEastAsia" w:cstheme="majorBidi"/>
+      <w:rFonts w:ascii="Skeena" w:eastAsiaTheme="majorEastAsia" w:hAnsi="Skeena" w:cstheme="majorBidi"/>
       <w:color w:val="0F4761" w:themeColor="accent1" w:themeShade="BF"/>
       <w:sz w:val="28"/>
       <w:szCs w:val="28"/>
+      <w:u w:val="single"/>
     </w:rPr>
   </w:style>
   <w:style w:type="character" w:customStyle="1" w:styleId="Heading4Char">

</xml_diff>

<commit_message>
appendix in separate doc and main doc tidied up
</commit_message>
<xml_diff>
--- a/roof/Leverett STM November 2025 - Middle School Roof.docx
+++ b/roof/Leverett STM November 2025 - Middle School Roof.docx
@@ -31,49 +31,583 @@
     </w:p>
     <w:p>
       <w:pPr>
-        <w:rPr>
-          <w:rFonts w:ascii="Skeena" w:hAnsi="Skeena"/>
-        </w:rPr>
-      </w:pPr>
-      <w:r>
-        <w:rPr>
-          <w:rFonts w:ascii="Skeena" w:hAnsi="Skeena"/>
-        </w:rPr>
-        <w:t>The middle school roof system was installed in 1994 and carried a 15-year warranty that expired in 2009. The building consists of three main sections covering approximately 104,000 square feet: the classroom wing, gymnasium wing, and auditorium. The district has performed over 75 patch repairs to address ongoing leaks (MSBA Submission, Section 3, p. 1).</w:t>
-      </w:r>
-    </w:p>
-    <w:p>
-      <w:pPr>
-        <w:rPr>
-          <w:rFonts w:ascii="Skeena" w:hAnsi="Skeena"/>
-        </w:rPr>
-      </w:pPr>
-      <w:r>
-        <w:rPr>
-          <w:rFonts w:ascii="Skeena" w:hAnsi="Skeena"/>
-        </w:rPr>
-        <w:t xml:space="preserve">The 2022 Gale Associates </w:t>
-      </w:r>
-      <w:proofErr w:type="gramStart"/>
-      <w:r>
-        <w:rPr>
-          <w:rFonts w:ascii="Skeena" w:hAnsi="Skeena"/>
-        </w:rPr>
-        <w:t>engineering evaluation</w:t>
-      </w:r>
-      <w:proofErr w:type="gramEnd"/>
-      <w:r>
-        <w:rPr>
-          <w:rFonts w:ascii="Skeena" w:hAnsi="Skeena"/>
-        </w:rPr>
-        <w:t xml:space="preserve"> documented several conditions requiring attention. The assessment identified one active leak that occurs with every rainfall event, along with four additional leak locations that have required recent maintenance. The evaluation noted reverse-lap flashing at snow guards, which creates pathways for water infiltration, and efflorescence throughout the structure, indicating moisture has been penetrating the building envelope over time (Gale 2022 evaluation, referenced in MSBA Submission, Section 3, p. 2).</w:t>
-      </w:r>
+        <w:pStyle w:val="ListParagraph"/>
+        <w:numPr>
+          <w:ilvl w:val="0"/>
+          <w:numId w:val="15"/>
+        </w:numPr>
+        <w:rPr>
+          <w:rFonts w:ascii="Skeena" w:hAnsi="Skeena"/>
+        </w:rPr>
+      </w:pPr>
+      <w:commentRangeStart w:id="0"/>
+      <w:r>
+        <w:rPr>
+          <w:rFonts w:ascii="Skeena" w:hAnsi="Skeena"/>
+        </w:rPr>
+        <w:t>Middle School facility</w:t>
+      </w:r>
+      <w:r>
+        <w:rPr>
+          <w:rFonts w:ascii="Skeena" w:hAnsi="Skeena"/>
+        </w:rPr>
+        <w:t xml:space="preserve"> was constructed around 1967</w:t>
+      </w:r>
+      <w:r>
+        <w:rPr>
+          <w:rFonts w:ascii="Skeena" w:hAnsi="Skeena"/>
+        </w:rPr>
+        <w:t>.</w:t>
+      </w:r>
+    </w:p>
+    <w:p>
+      <w:pPr>
+        <w:pStyle w:val="ListParagraph"/>
+        <w:numPr>
+          <w:ilvl w:val="0"/>
+          <w:numId w:val="15"/>
+        </w:numPr>
+        <w:rPr>
+          <w:rFonts w:ascii="Skeena" w:hAnsi="Skeena"/>
+        </w:rPr>
+      </w:pPr>
+      <w:r>
+        <w:rPr>
+          <w:rFonts w:ascii="Skeena" w:hAnsi="Skeena"/>
+        </w:rPr>
+        <w:t>The assessed value of the building is $69,815,400</w:t>
+      </w:r>
+      <w:r>
+        <w:rPr>
+          <w:rFonts w:ascii="Skeena" w:hAnsi="Skeena"/>
+        </w:rPr>
+        <w:t>.</w:t>
+      </w:r>
+    </w:p>
+    <w:p>
+      <w:pPr>
+        <w:pStyle w:val="ListParagraph"/>
+        <w:numPr>
+          <w:ilvl w:val="0"/>
+          <w:numId w:val="15"/>
+        </w:numPr>
+        <w:rPr>
+          <w:rFonts w:ascii="Skeena" w:hAnsi="Skeena"/>
+        </w:rPr>
+      </w:pPr>
+      <w:r>
+        <w:rPr>
+          <w:rFonts w:ascii="Skeena" w:hAnsi="Skeena"/>
+        </w:rPr>
+        <w:t xml:space="preserve">The facility is </w:t>
+      </w:r>
+      <w:r>
+        <w:rPr>
+          <w:rFonts w:ascii="Skeena" w:hAnsi="Skeena"/>
+        </w:rPr>
+        <w:t xml:space="preserve">in fair shape and ADA compliant </w:t>
+      </w:r>
+      <w:r>
+        <w:rPr>
+          <w:rFonts w:ascii="Skeena" w:hAnsi="Skeena"/>
+        </w:rPr>
+        <w:t xml:space="preserve">after </w:t>
+      </w:r>
+      <w:r>
+        <w:rPr>
+          <w:rFonts w:ascii="Skeena" w:hAnsi="Skeena"/>
+        </w:rPr>
+        <w:t>2001 renovations</w:t>
+      </w:r>
+      <w:r>
+        <w:rPr>
+          <w:rFonts w:ascii="Skeena" w:hAnsi="Skeena"/>
+        </w:rPr>
+        <w:t xml:space="preserve">, and </w:t>
+      </w:r>
+      <w:r>
+        <w:rPr>
+          <w:rFonts w:ascii="Skeena" w:hAnsi="Skeena"/>
+        </w:rPr>
+        <w:t xml:space="preserve">all entrances and toilet facilities </w:t>
+      </w:r>
+      <w:r>
+        <w:rPr>
+          <w:rFonts w:ascii="Skeena" w:hAnsi="Skeena"/>
+        </w:rPr>
+        <w:t>compl</w:t>
+      </w:r>
+      <w:r>
+        <w:rPr>
+          <w:rFonts w:ascii="Skeena" w:hAnsi="Skeena"/>
+        </w:rPr>
+        <w:t>y</w:t>
+      </w:r>
+      <w:r>
+        <w:rPr>
+          <w:rFonts w:ascii="Skeena" w:hAnsi="Skeena"/>
+        </w:rPr>
+        <w:t xml:space="preserve"> </w:t>
+      </w:r>
+      <w:r>
+        <w:rPr>
+          <w:rFonts w:ascii="Skeena" w:hAnsi="Skeena"/>
+        </w:rPr>
+        <w:t>with the requirements of the Massachusetts Architectural Access</w:t>
+      </w:r>
+      <w:r>
+        <w:rPr>
+          <w:rFonts w:ascii="Skeena" w:hAnsi="Skeena"/>
+        </w:rPr>
+        <w:t xml:space="preserve"> </w:t>
+      </w:r>
+      <w:r>
+        <w:rPr>
+          <w:rFonts w:ascii="Skeena" w:hAnsi="Skeena"/>
+        </w:rPr>
+        <w:t>Board Regulations (521 CMR)</w:t>
+      </w:r>
+      <w:r>
+        <w:rPr>
+          <w:rFonts w:ascii="Skeena" w:hAnsi="Skeena"/>
+        </w:rPr>
+        <w:t>.</w:t>
+      </w:r>
+    </w:p>
+    <w:p>
+      <w:pPr>
+        <w:pStyle w:val="ListParagraph"/>
+        <w:numPr>
+          <w:ilvl w:val="0"/>
+          <w:numId w:val="15"/>
+        </w:numPr>
+        <w:rPr>
+          <w:rFonts w:ascii="Skeena" w:hAnsi="Skeena"/>
+        </w:rPr>
+      </w:pPr>
+      <w:r>
+        <w:rPr>
+          <w:rFonts w:ascii="Skeena" w:hAnsi="Skeena"/>
+        </w:rPr>
+        <w:t>The building consists of three main sections covering approximately 104,000 square feet: the classroom wing, gymnasium wing, and auditorium.</w:t>
+      </w:r>
+    </w:p>
+    <w:p>
+      <w:pPr>
+        <w:pStyle w:val="ListParagraph"/>
+        <w:numPr>
+          <w:ilvl w:val="0"/>
+          <w:numId w:val="15"/>
+        </w:numPr>
+        <w:rPr>
+          <w:rFonts w:ascii="Skeena" w:hAnsi="Skeena"/>
+        </w:rPr>
+      </w:pPr>
+      <w:r>
+        <w:rPr>
+          <w:rFonts w:ascii="Skeena" w:hAnsi="Skeena"/>
+          <w:b/>
+          <w:bCs/>
+        </w:rPr>
+        <w:t>In 1994</w:t>
+      </w:r>
+      <w:r>
+        <w:rPr>
+          <w:rFonts w:ascii="Skeena" w:hAnsi="Skeena"/>
+        </w:rPr>
+        <w:t>, t</w:t>
+      </w:r>
+      <w:r>
+        <w:rPr>
+          <w:rFonts w:ascii="Skeena" w:hAnsi="Skeena"/>
+        </w:rPr>
+        <w:t xml:space="preserve">he roof over the </w:t>
+      </w:r>
+      <w:r>
+        <w:rPr>
+          <w:rFonts w:ascii="Skeena" w:hAnsi="Skeena"/>
+        </w:rPr>
+        <w:t>c</w:t>
+      </w:r>
+      <w:r>
+        <w:rPr>
+          <w:rFonts w:ascii="Skeena" w:hAnsi="Skeena"/>
+        </w:rPr>
+        <w:t xml:space="preserve">lassroom </w:t>
+      </w:r>
+      <w:r>
+        <w:rPr>
+          <w:rFonts w:ascii="Skeena" w:hAnsi="Skeena"/>
+        </w:rPr>
+        <w:t>w</w:t>
+      </w:r>
+      <w:r>
+        <w:rPr>
+          <w:rFonts w:ascii="Skeena" w:hAnsi="Skeena"/>
+        </w:rPr>
+        <w:t xml:space="preserve">ing </w:t>
+      </w:r>
+      <w:r>
+        <w:rPr>
+          <w:rFonts w:ascii="Skeena" w:hAnsi="Skeena"/>
+        </w:rPr>
+        <w:t xml:space="preserve">and </w:t>
+      </w:r>
+      <w:r>
+        <w:rPr>
+          <w:rFonts w:ascii="Skeena" w:hAnsi="Skeena"/>
+        </w:rPr>
+        <w:t>g</w:t>
+      </w:r>
+      <w:r>
+        <w:rPr>
+          <w:rFonts w:ascii="Skeena" w:hAnsi="Skeena"/>
+        </w:rPr>
+        <w:t xml:space="preserve">ymnasium </w:t>
+      </w:r>
+      <w:r>
+        <w:rPr>
+          <w:rFonts w:ascii="Skeena" w:hAnsi="Skeena"/>
+        </w:rPr>
+        <w:t>w</w:t>
+      </w:r>
+      <w:r>
+        <w:rPr>
+          <w:rFonts w:ascii="Skeena" w:hAnsi="Skeena"/>
+        </w:rPr>
+        <w:t xml:space="preserve">ing </w:t>
+      </w:r>
+      <w:r>
+        <w:rPr>
+          <w:rFonts w:ascii="Skeena" w:hAnsi="Skeena"/>
+        </w:rPr>
+        <w:t>was replaced</w:t>
+      </w:r>
+      <w:r>
+        <w:rPr>
+          <w:rFonts w:ascii="Skeena" w:hAnsi="Skeena"/>
+        </w:rPr>
+        <w:t xml:space="preserve"> </w:t>
+      </w:r>
+      <w:r>
+        <w:rPr>
+          <w:rFonts w:ascii="Skeena" w:hAnsi="Skeena"/>
+        </w:rPr>
+        <w:t>with a Sika PVC roof system</w:t>
+      </w:r>
+      <w:r>
+        <w:rPr>
+          <w:rFonts w:ascii="Skeena" w:hAnsi="Skeena"/>
+        </w:rPr>
+        <w:t xml:space="preserve">. </w:t>
+      </w:r>
+      <w:r>
+        <w:rPr>
+          <w:rFonts w:ascii="Skeena" w:hAnsi="Skeena"/>
+        </w:rPr>
+        <w:t xml:space="preserve">The </w:t>
+      </w:r>
+      <w:r>
+        <w:rPr>
+          <w:rFonts w:ascii="Skeena" w:hAnsi="Skeena"/>
+        </w:rPr>
+        <w:t>15</w:t>
+      </w:r>
+      <w:r>
+        <w:rPr>
+          <w:rFonts w:ascii="Skeena" w:hAnsi="Skeena"/>
+        </w:rPr>
+        <w:t>-</w:t>
+      </w:r>
+      <w:r>
+        <w:rPr>
+          <w:rFonts w:ascii="Skeena" w:hAnsi="Skeena"/>
+        </w:rPr>
+        <w:t xml:space="preserve">year warranty expired </w:t>
+      </w:r>
+      <w:r>
+        <w:rPr>
+          <w:rFonts w:ascii="Skeena" w:hAnsi="Skeena"/>
+          <w:b/>
+          <w:bCs/>
+        </w:rPr>
+        <w:t xml:space="preserve">September </w:t>
+      </w:r>
+      <w:r>
+        <w:rPr>
+          <w:rFonts w:ascii="Skeena" w:hAnsi="Skeena"/>
+          <w:b/>
+          <w:bCs/>
+        </w:rPr>
+        <w:t>2009</w:t>
+      </w:r>
+      <w:r>
+        <w:rPr>
+          <w:rFonts w:ascii="Skeena" w:hAnsi="Skeena"/>
+        </w:rPr>
+        <w:t xml:space="preserve">. </w:t>
+      </w:r>
+    </w:p>
+    <w:p>
+      <w:pPr>
+        <w:pStyle w:val="ListParagraph"/>
+        <w:numPr>
+          <w:ilvl w:val="0"/>
+          <w:numId w:val="15"/>
+        </w:numPr>
+        <w:rPr>
+          <w:rFonts w:ascii="Skeena" w:hAnsi="Skeena"/>
+        </w:rPr>
+      </w:pPr>
+      <w:r>
+        <w:rPr>
+          <w:rFonts w:ascii="Skeena" w:hAnsi="Skeena"/>
+          <w:b/>
+          <w:bCs/>
+        </w:rPr>
+        <w:t>In 1999</w:t>
+      </w:r>
+      <w:r>
+        <w:rPr>
+          <w:rFonts w:ascii="Skeena" w:hAnsi="Skeena"/>
+        </w:rPr>
+        <w:t>,</w:t>
+      </w:r>
+      <w:r>
+        <w:rPr>
+          <w:rFonts w:ascii="Skeena" w:hAnsi="Skeena"/>
+        </w:rPr>
+        <w:t xml:space="preserve"> </w:t>
+      </w:r>
+      <w:r>
+        <w:rPr>
+          <w:rFonts w:ascii="Skeena" w:hAnsi="Skeena"/>
+        </w:rPr>
+        <w:t xml:space="preserve">the roof </w:t>
+      </w:r>
+      <w:r>
+        <w:rPr>
+          <w:rFonts w:ascii="Skeena" w:hAnsi="Skeena"/>
+        </w:rPr>
+        <w:t xml:space="preserve">over the </w:t>
+      </w:r>
+      <w:r>
+        <w:rPr>
+          <w:rFonts w:ascii="Skeena" w:hAnsi="Skeena"/>
+        </w:rPr>
+        <w:t>a</w:t>
+      </w:r>
+      <w:r>
+        <w:rPr>
+          <w:rFonts w:ascii="Skeena" w:hAnsi="Skeena"/>
+        </w:rPr>
+        <w:t>uditorium</w:t>
+      </w:r>
+      <w:r>
+        <w:rPr>
+          <w:rFonts w:ascii="Skeena" w:hAnsi="Skeena"/>
+        </w:rPr>
+        <w:t xml:space="preserve"> was replaced with a </w:t>
+      </w:r>
+      <w:r>
+        <w:rPr>
+          <w:rFonts w:ascii="Skeena" w:hAnsi="Skeena"/>
+        </w:rPr>
+        <w:t xml:space="preserve">Sika Sarnafil </w:t>
+      </w:r>
+      <w:r>
+        <w:rPr>
+          <w:rFonts w:ascii="Skeena" w:hAnsi="Skeena"/>
+        </w:rPr>
+        <w:t xml:space="preserve">PVC roof. </w:t>
+      </w:r>
+      <w:r>
+        <w:rPr>
+          <w:rFonts w:ascii="Skeena" w:hAnsi="Skeena"/>
+        </w:rPr>
+        <w:t>Th</w:t>
+      </w:r>
+      <w:r>
+        <w:rPr>
+          <w:rFonts w:ascii="Skeena" w:hAnsi="Skeena"/>
+        </w:rPr>
+        <w:t>e</w:t>
+      </w:r>
+      <w:r>
+        <w:rPr>
+          <w:rFonts w:ascii="Skeena" w:hAnsi="Skeena"/>
+        </w:rPr>
+        <w:t xml:space="preserve"> warranty expired </w:t>
+      </w:r>
+      <w:r>
+        <w:rPr>
+          <w:rFonts w:ascii="Skeena" w:hAnsi="Skeena"/>
+          <w:b/>
+          <w:bCs/>
+        </w:rPr>
+        <w:t xml:space="preserve">September </w:t>
+      </w:r>
+      <w:r>
+        <w:rPr>
+          <w:rFonts w:ascii="Skeena" w:hAnsi="Skeena"/>
+          <w:b/>
+          <w:bCs/>
+        </w:rPr>
+        <w:t>2014</w:t>
+      </w:r>
+      <w:r>
+        <w:rPr>
+          <w:rFonts w:ascii="Skeena" w:hAnsi="Skeena"/>
+        </w:rPr>
+        <w:t>.</w:t>
+      </w:r>
+      <w:commentRangeEnd w:id="0"/>
+      <w:r>
+        <w:rPr>
+          <w:rStyle w:val="CommentReference"/>
+        </w:rPr>
+        <w:commentReference w:id="0"/>
+      </w:r>
+    </w:p>
+    <w:p>
+      <w:pPr>
+        <w:rPr>
+          <w:rFonts w:ascii="Skeena" w:hAnsi="Skeena"/>
+        </w:rPr>
+      </w:pPr>
+    </w:p>
+    <w:p>
+      <w:pPr>
+        <w:rPr>
+          <w:rFonts w:ascii="Skeena" w:hAnsi="Skeena"/>
+        </w:rPr>
+      </w:pPr>
+      <w:r>
+        <w:rPr>
+          <w:rFonts w:ascii="Skeena" w:hAnsi="Skeena"/>
+        </w:rPr>
+        <w:t>The 2022 Gale Associates engineering evaluation documented several conditions requiring attention. The assessment identified one active leak that occurs with every rainfall event, along with four additional leak locations that have required recent maintenance. The evaluation noted reverse-lap flashing at snow guards, which creates pathways for water infiltration, and efflorescence throughout the structure, indicating moisture has been penetrating the building envelope over time (Gale 2022 evaluation, referenced in MSBA Submission, Section 3, p. 2).</w:t>
+      </w:r>
+    </w:p>
+    <w:tbl>
+      <w:tblPr>
+        <w:tblStyle w:val="TableGrid"/>
+        <w:tblW w:w="0" w:type="auto"/>
+        <w:tblLook w:val="04A0" w:firstRow="1" w:lastRow="0" w:firstColumn="1" w:lastColumn="0" w:noHBand="0" w:noVBand="1"/>
+      </w:tblPr>
+      <w:tblGrid>
+        <w:gridCol w:w="9350"/>
+      </w:tblGrid>
+      <w:tr>
+        <w:tc>
+          <w:tcPr>
+            <w:tcW w:w="9350" w:type="dxa"/>
+          </w:tcPr>
+          <w:p>
+            <w:pPr>
+              <w:rPr>
+                <w:rFonts w:ascii="Skeena" w:hAnsi="Skeena"/>
+              </w:rPr>
+            </w:pPr>
+            <w:r>
+              <w:rPr>
+                <w:rFonts w:ascii="Skeena" w:hAnsi="Skeena"/>
+              </w:rPr>
+              <w:t>Facts from report</w:t>
+            </w:r>
+          </w:p>
+          <w:p>
+            <w:pPr>
+              <w:rPr>
+                <w:rFonts w:ascii="Skeena" w:hAnsi="Skeena"/>
+              </w:rPr>
+            </w:pPr>
+            <w:r>
+              <w:rPr>
+                <w:rFonts w:ascii="Skeena" w:hAnsi="Skeena"/>
+              </w:rPr>
+              <w:t>Construction Phase estimated to start February 2, 2026 and be completed by August 30,</w:t>
+            </w:r>
+          </w:p>
+          <w:p>
+            <w:pPr>
+              <w:rPr>
+                <w:rFonts w:ascii="Skeena" w:hAnsi="Skeena"/>
+              </w:rPr>
+            </w:pPr>
+            <w:r>
+              <w:rPr>
+                <w:rFonts w:ascii="Skeena" w:hAnsi="Skeena"/>
+              </w:rPr>
+              <w:t>2026.</w:t>
+            </w:r>
+          </w:p>
+        </w:tc>
+      </w:tr>
+    </w:tbl>
+    <w:p>
+      <w:pPr>
+        <w:rPr>
+          <w:rFonts w:ascii="Skeena" w:hAnsi="Skeena"/>
+        </w:rPr>
+      </w:pPr>
+    </w:p>
+    <w:tbl>
+      <w:tblPr>
+        <w:tblStyle w:val="TableGrid"/>
+        <w:tblW w:w="0" w:type="auto"/>
+        <w:tblLook w:val="04A0" w:firstRow="1" w:lastRow="0" w:firstColumn="1" w:lastColumn="0" w:noHBand="0" w:noVBand="1"/>
+      </w:tblPr>
+      <w:tblGrid>
+        <w:gridCol w:w="9350"/>
+      </w:tblGrid>
+      <w:tr>
+        <w:tc>
+          <w:tcPr>
+            <w:tcW w:w="9350" w:type="dxa"/>
+          </w:tcPr>
+          <w:p>
+            <w:pPr>
+              <w:rPr>
+                <w:rFonts w:ascii="Skeena" w:hAnsi="Skeena"/>
+              </w:rPr>
+            </w:pPr>
+            <w:r>
+              <w:rPr>
+                <w:rFonts w:ascii="Skeena" w:hAnsi="Skeena"/>
+              </w:rPr>
+              <w:t>Claims needing confirmation</w:t>
+            </w:r>
+          </w:p>
+          <w:p>
+            <w:pPr>
+              <w:rPr>
+                <w:rFonts w:ascii="Skeena" w:hAnsi="Skeena"/>
+              </w:rPr>
+            </w:pPr>
+            <w:r>
+              <w:rPr>
+                <w:rFonts w:ascii="Skeena" w:hAnsi="Skeena"/>
+              </w:rPr>
+              <w:t>The district has performed over 75 patch repairs to address ongoing leaks</w:t>
+            </w:r>
+          </w:p>
+        </w:tc>
+      </w:tr>
+    </w:tbl>
+    <w:p>
+      <w:pPr>
+        <w:rPr>
+          <w:rFonts w:ascii="Skeena" w:hAnsi="Skeena"/>
+        </w:rPr>
+      </w:pPr>
     </w:p>
     <w:p>
       <w:pPr>
         <w:pStyle w:val="Heading3"/>
       </w:pPr>
       <w:r>
+        <w:lastRenderedPageBreak/>
         <w:t>Hazardous Materials Assessment</w:t>
       </w:r>
     </w:p>
@@ -87,21 +621,7 @@
         <w:rPr>
           <w:rFonts w:ascii="Skeena" w:hAnsi="Skeena"/>
         </w:rPr>
-        <w:t xml:space="preserve">CDW Consultants conducted a comprehensive hazardous materials assessment in July 2025. The assessment identified chrysotile asbestos in several roof components. Specifically, asbestos was found in sealant on gutters over the auditorium (2% chrysotile), tar vapor barriers on auditorium walls (5-20% chrysotile), and tar materials on the main school roof deck covering approximately 76,000 square feet (2-3% chrysotile). The auditorium also contains ceiling materials that can become friable when disturbed by water damage. The district has already conducted some emergency </w:t>
-      </w:r>
-      <w:proofErr w:type="gramStart"/>
-      <w:r>
-        <w:rPr>
-          <w:rFonts w:ascii="Skeena" w:hAnsi="Skeena"/>
-        </w:rPr>
-        <w:t>abatement</w:t>
-      </w:r>
-      <w:proofErr w:type="gramEnd"/>
-      <w:r>
-        <w:rPr>
-          <w:rFonts w:ascii="Skeena" w:hAnsi="Skeena"/>
-        </w:rPr>
-        <w:t xml:space="preserve"> in water-damaged areas (CDW Hazmat Report 2025, pp. 2-18).</w:t>
+        <w:t>CDW Consultants conducted a comprehensive hazardous materials assessment in July 2025. The assessment identified chrysotile asbestos in several roof components. Specifically, asbestos was found in sealant on gutters over the auditorium (2% chrysotile), tar vapor barriers on auditorium walls (5-20% chrysotile), and tar materials on the main school roof deck covering approximately 76,000 square feet (2-3% chrysotile). The auditorium also contains ceiling materials that can become friable when disturbed by water damage. The district has already conducted some emergency abatement in water-damaged areas (CDW Hazmat Report 2025, pp. 2-18).</w:t>
       </w:r>
     </w:p>
     <w:p>
@@ -122,27 +642,152 @@
         <w:rPr>
           <w:rFonts w:ascii="Skeena" w:hAnsi="Skeena"/>
         </w:rPr>
-        <w:t xml:space="preserve">The existing internal roof drainage system presents ongoing maintenance challenges. Water currently drains through cast iron pipes that run through the building interior. These pipes, installed with the original construction, are beginning to show signs of deterioration. When internal drains fail, water can travel through the building before manifesting as visible damage, making leak sources difficult to identify. The Gale evaluation noted that determining </w:t>
-      </w:r>
-      <w:r>
-        <w:rPr>
-          <w:rFonts w:ascii="Skeena" w:hAnsi="Skeena"/>
-        </w:rPr>
+        <w:t>The existing internal roof drainage system presents ongoing maintenance challenges. Water currently drains through cast iron pipes that run through the building interior. These pipes, installed with the original construction, are beginning to show signs of deterioration. When internal drains fail, water can travel through the building before manifesting as visible damage, making leak sources difficult to identify. The Gale evaluation noted that determining specific leak sources would require extensive water testing due to the complexity of the internal drainage paths (MSBA Submission, Section 3, p. 2).</w:t>
+      </w:r>
+    </w:p>
+    <w:p>
+      <w:pPr>
+        <w:rPr>
+          <w:rFonts w:ascii="Skeena" w:hAnsi="Skeena"/>
+        </w:rPr>
+      </w:pPr>
+      <w:r>
+        <w:rPr>
+          <w:rFonts w:ascii="Skeena" w:hAnsi="Skeena"/>
+        </w:rPr>
+        <w:t>The structural assessment also identified that some existing steel joists in the auditorium framing do not meet current capacity requirements for potential future uses without reinforcement (Gale 2022, cited in MSBA Submission, Section 3, p. 2).</w:t>
+      </w:r>
+    </w:p>
+    <w:p>
+      <w:pPr>
+        <w:pStyle w:val="Heading2"/>
+      </w:pPr>
+      <w:r>
+        <w:t>Project Requirements and Benefits</w:t>
+      </w:r>
+    </w:p>
+    <w:p>
+      <w:pPr>
+        <w:pStyle w:val="Heading3"/>
+      </w:pPr>
+      <w:r>
+        <w:t>MSBA Program Requirements</w:t>
+      </w:r>
+    </w:p>
+    <w:p>
+      <w:pPr>
+        <w:rPr>
+          <w:rFonts w:ascii="Skeena" w:hAnsi="Skeena"/>
+        </w:rPr>
+      </w:pPr>
+      <w:r>
+        <w:rPr>
+          <w:rFonts w:ascii="Skeena" w:hAnsi="Skeena"/>
+        </w:rPr>
+        <w:t>The Massachusetts School Building Authority accepted the district into the Accelerated Repair Program in October 2024, after annual applications since 2019. The program provides a 61.95% reimbursement rate for eligible costs. The district must complete all necessary approvals within 14 months of acceptance (by October 2025) to maintain eligibility. The MSBA Board vote on funding is scheduled for October 29, 2025 (District Q&amp;A, p. 2).</w:t>
+      </w:r>
+    </w:p>
+    <w:p>
+      <w:pPr>
+        <w:rPr>
+          <w:rFonts w:ascii="Skeena" w:hAnsi="Skeena"/>
+        </w:rPr>
+      </w:pPr>
+      <w:r>
+        <w:rPr>
+          <w:rFonts w:ascii="Skeena" w:hAnsi="Skeena"/>
+        </w:rPr>
+        <w:t>The MSBA program requires that facilities receiving funding continue to be used for educational purposes, with an expected service life of at least 20 years. The program also requires that a portion of the new roof be made structurally capable of supporting future solar installations, which the project addresses with 1,000 square feet of solar-ready capacity (District Q&amp;A, p. 1).</w:t>
+      </w:r>
+    </w:p>
+    <w:p>
+      <w:pPr>
+        <w:pStyle w:val="Heading3"/>
+      </w:pPr>
+      <w:r>
         <w:lastRenderedPageBreak/>
-        <w:t>specific leak sources would require extensive water testing due to the complexity of the internal drainage paths (MSBA Submission, Section 3, p. 2).</w:t>
-      </w:r>
-    </w:p>
-    <w:p>
-      <w:pPr>
-        <w:rPr>
-          <w:rFonts w:ascii="Skeena" w:hAnsi="Skeena"/>
-        </w:rPr>
-      </w:pPr>
-      <w:r>
-        <w:rPr>
-          <w:rFonts w:ascii="Skeena" w:hAnsi="Skeena"/>
-        </w:rPr>
-        <w:t>The structural assessment also identified that some existing steel joists in the auditorium framing do not meet current capacity requirements for potential future uses without reinforcement (Gale 2022, cited in MSBA Submission, Section 3, p. 2).</w:t>
+        <w:t>Technical Scope and Design Solution</w:t>
+      </w:r>
+    </w:p>
+    <w:p>
+      <w:pPr>
+        <w:rPr>
+          <w:rFonts w:ascii="Skeena" w:hAnsi="Skeena"/>
+        </w:rPr>
+      </w:pPr>
+      <w:r>
+        <w:rPr>
+          <w:rFonts w:ascii="Skeena" w:hAnsi="Skeena"/>
+        </w:rPr>
+        <w:t>After evaluating five design alternatives, the district selected Option A, which involves complete replacement of the roofing system. The project will remove all existing roofing materials down to the metal deck and install a new system meeting current building codes (MSBA Submission, Section 6, p. 1).</w:t>
+      </w:r>
+    </w:p>
+    <w:p>
+      <w:pPr>
+        <w:rPr>
+          <w:rFonts w:ascii="Skeena" w:hAnsi="Skeena"/>
+        </w:rPr>
+      </w:pPr>
+      <w:r>
+        <w:rPr>
+          <w:rFonts w:ascii="Skeena" w:hAnsi="Skeena"/>
+        </w:rPr>
+        <w:t>The new design converts from internal to perimeter drainage, eliminating water travel through the building. This approach involves capping existing internal drains below the deck level and installing new gutters and downspouts around the building perimeter. The tapered insulation will create a 1/8" per foot slope directing water to the edges (MSBA Submission, Section 7, p. 1).</w:t>
+      </w:r>
+    </w:p>
+    <w:p>
+      <w:pPr>
+        <w:rPr>
+          <w:rFonts w:ascii="Skeena" w:hAnsi="Skeena"/>
+        </w:rPr>
+      </w:pPr>
+      <w:r>
+        <w:rPr>
+          <w:rFonts w:ascii="Skeena" w:hAnsi="Skeena"/>
+        </w:rPr>
+        <w:t>The new roofing system will include self-adhered vapor barriers, mechanically fastened tapered insulation achieving R-30 value (compared to current R-20), high-density cover board, and 80-mil fleece-back membrane. The complete system will carry a 30-year manufacturer's warranty, double the original 15-year warranty period (MSBA Submission, Section 7, p. 2).</w:t>
+      </w:r>
+    </w:p>
+    <w:p>
+      <w:pPr>
+        <w:pStyle w:val="Heading3"/>
+      </w:pPr>
+      <w:r>
+        <w:t>Code Compliance Improvements</w:t>
+      </w:r>
+    </w:p>
+    <w:p>
+      <w:pPr>
+        <w:rPr>
+          <w:rFonts w:ascii="Skeena" w:hAnsi="Skeena"/>
+        </w:rPr>
+      </w:pPr>
+      <w:r>
+        <w:rPr>
+          <w:rFonts w:ascii="Skeena" w:hAnsi="Skeena"/>
+        </w:rPr>
+        <w:t>The project brings the facility up to current Massachusetts building codes in several areas. Energy efficiency will improve with R-30 continuous insulation, exceeding the Massachusetts Stretch Code requirement for Climate Zone 5. The roof will meet current snow load requirements of 35 pounds per square foot and current wind uplift resistance standards, both significantly higher than 1994 requirements (MSBA Submission, Section 5, pp. 1-3).</w:t>
+      </w:r>
+    </w:p>
+    <w:p>
+      <w:pPr>
+        <w:pStyle w:val="Heading3"/>
+      </w:pPr>
+      <w:r>
+        <w:t>Construction Timeline</w:t>
+      </w:r>
+    </w:p>
+    <w:p>
+      <w:pPr>
+        <w:rPr>
+          <w:rFonts w:ascii="Skeena" w:hAnsi="Skeena"/>
+        </w:rPr>
+      </w:pPr>
+      <w:r>
+        <w:rPr>
+          <w:rFonts w:ascii="Skeena" w:hAnsi="Skeena"/>
+        </w:rPr>
+        <w:t>Construction must occur during summer 2026 when students are not present, particularly given the asbestos abatement requirements. The timeline includes bidding beginning February 2, 2026, with construction completion targeted for August 30, 2026. The work cannot be phased across multiple summers without jeopardizing MSBA funding eligibility due to the program's timeline requirements (District Q&amp;A, p. 1).</w:t>
       </w:r>
     </w:p>
     <w:p>
@@ -150,7 +795,7 @@
         <w:pStyle w:val="Heading2"/>
       </w:pPr>
       <w:r>
-        <w:t>Project Requirements and Benefits</w:t>
+        <w:t>Costs</w:t>
       </w:r>
     </w:p>
     <w:p>
@@ -158,33 +803,20 @@
         <w:pStyle w:val="Heading3"/>
       </w:pPr>
       <w:r>
-        <w:t>MSBA Program Requirements</w:t>
-      </w:r>
-    </w:p>
-    <w:p>
-      <w:pPr>
-        <w:rPr>
-          <w:rFonts w:ascii="Skeena" w:hAnsi="Skeena"/>
-        </w:rPr>
-      </w:pPr>
-      <w:r>
-        <w:rPr>
-          <w:rFonts w:ascii="Skeena" w:hAnsi="Skeena"/>
-        </w:rPr>
-        <w:t>The Massachusetts School Building Authority accepted the district into the Accelerated Repair Program in October 2024, after annual applications since 2019. The program provides a 61.95% reimbursement rate for eligible costs. The district must complete all necessary approvals within 14 months of acceptance (by October 2025) to maintain eligibility. The MSBA Board vote on funding is scheduled for October 29, 2025 (District Q&amp;A, p. 2).</w:t>
-      </w:r>
-    </w:p>
-    <w:p>
-      <w:pPr>
-        <w:rPr>
-          <w:rFonts w:ascii="Skeena" w:hAnsi="Skeena"/>
-        </w:rPr>
-      </w:pPr>
-      <w:r>
-        <w:rPr>
-          <w:rFonts w:ascii="Skeena" w:hAnsi="Skeena"/>
-        </w:rPr>
-        <w:t>The MSBA program requires that facilities receiving funding continue to be used for educational purposes, with an expected service life of at least 20 years. The program also requires that a portion of the new roof be made structurally capable of supporting future solar installations, which the project addresses with 1,000 square feet of solar-ready capacity (District Q&amp;A, p. 1).</w:t>
+        <w:t>Total Project Investment</w:t>
+      </w:r>
+    </w:p>
+    <w:p>
+      <w:pPr>
+        <w:rPr>
+          <w:rFonts w:ascii="Skeena" w:hAnsi="Skeena"/>
+        </w:rPr>
+      </w:pPr>
+      <w:r>
+        <w:rPr>
+          <w:rFonts w:ascii="Skeena" w:hAnsi="Skeena"/>
+        </w:rPr>
+        <w:t>The total project cost is $10,024,016, which breaks down into construction costs of $8,470,479 and soft costs of $1,553,537. Soft costs include design services, owner's project management, bidding, and administrative expenses, representing approximately 15.5% of the total project (MSBA Submission, Cost Summary).</w:t>
       </w:r>
     </w:p>
     <w:p>
@@ -192,46 +824,21 @@
         <w:pStyle w:val="Heading3"/>
       </w:pPr>
       <w:r>
-        <w:t>Technical Scope and Design Solution</w:t>
-      </w:r>
-    </w:p>
-    <w:p>
-      <w:pPr>
-        <w:rPr>
-          <w:rFonts w:ascii="Skeena" w:hAnsi="Skeena"/>
-        </w:rPr>
-      </w:pPr>
-      <w:r>
-        <w:rPr>
-          <w:rFonts w:ascii="Skeena" w:hAnsi="Skeena"/>
-        </w:rPr>
-        <w:t>After evaluating five design alternatives, the district selected Option A, which involves complete replacement of the roofing system. The project will remove all existing roofing materials down to the metal deck and install a new system meeting current building codes (MSBA Submission, Section 6, p. 1).</w:t>
-      </w:r>
-    </w:p>
-    <w:p>
-      <w:pPr>
-        <w:rPr>
-          <w:rFonts w:ascii="Skeena" w:hAnsi="Skeena"/>
-        </w:rPr>
-      </w:pPr>
-      <w:r>
-        <w:rPr>
-          <w:rFonts w:ascii="Skeena" w:hAnsi="Skeena"/>
-        </w:rPr>
-        <w:t>The new design converts from internal to perimeter drainage, eliminating water travel through the building. This approach involves capping existing internal drains below the deck level and installing new gutters and downspouts around the building perimeter. The tapered insulation will create a 1/8" per foot slope directing water to the edges (MSBA Submission, Section 7, p. 1).</w:t>
-      </w:r>
-    </w:p>
-    <w:p>
-      <w:pPr>
-        <w:rPr>
-          <w:rFonts w:ascii="Skeena" w:hAnsi="Skeena"/>
-        </w:rPr>
-      </w:pPr>
-      <w:r>
-        <w:rPr>
-          <w:rFonts w:ascii="Skeena" w:hAnsi="Skeena"/>
-        </w:rPr>
-        <w:t>The new roofing system will include self-adhered vapor barriers, mechanically fastened tapered insulation achieving R-30 value (compared to current R-20), high-density cover board, and 80-mil fleece-back membrane. The complete system will carry a 30-year manufacturer's warranty, double the original 15-year warranty period (MSBA Submission, Section 7, p. 2).</w:t>
+        <w:lastRenderedPageBreak/>
+        <w:t>Funding Structure</w:t>
+      </w:r>
+    </w:p>
+    <w:p>
+      <w:pPr>
+        <w:rPr>
+          <w:rFonts w:ascii="Skeena" w:hAnsi="Skeena"/>
+        </w:rPr>
+      </w:pPr>
+      <w:r>
+        <w:rPr>
+          <w:rFonts w:ascii="Skeena" w:hAnsi="Skeena"/>
+        </w:rPr>
+        <w:t>The MSBA will provide $5,999,980 in reimbursement, covering 61.95% of eligible costs. The regional district's responsibility is $4,024,036. The district previously authorized $3 million in borrowing, which has been incorporated into capital planning. The additional authorization needed is approximately $4 million, though final borrowing amounts will be determined based on available funds and financing terms (District Q&amp;A, p. 3).</w:t>
       </w:r>
     </w:p>
     <w:p>
@@ -239,192 +846,362 @@
         <w:pStyle w:val="Heading3"/>
       </w:pPr>
       <w:r>
+        <w:t>Cost Allocation to Member Towns</w:t>
+      </w:r>
+    </w:p>
+    <w:p>
+      <w:pPr>
+        <w:rPr>
+          <w:rFonts w:ascii="Skeena" w:hAnsi="Skeena"/>
+        </w:rPr>
+      </w:pPr>
+      <w:r>
+        <w:rPr>
+          <w:rFonts w:ascii="Skeena" w:hAnsi="Skeena"/>
+        </w:rPr>
+        <w:t xml:space="preserve">Leverett's share, based on 2024 equalized valuation, totals approximately $412,000 plus interest. This </w:t>
+      </w:r>
+      <w:r>
+        <w:rPr>
+          <w:rFonts w:ascii="Skeena" w:hAnsi="Skeena"/>
+        </w:rPr>
+        <w:t>is</w:t>
+      </w:r>
+      <w:r>
+        <w:rPr>
+          <w:rFonts w:ascii="Skeena" w:hAnsi="Skeena"/>
+        </w:rPr>
+        <w:t xml:space="preserve"> about $155,000 plus interest above what was already planned for under the existing $3 million authorization. The preliminary debt service projections for Leverett range from $79,452 in FY27 to $233,873 in FY31, though final amounts will depend on borrowing terms and interest rates (District Q&amp;A, p. 3).</w:t>
+      </w:r>
+    </w:p>
+    <w:p>
+      <w:pPr>
+        <w:pStyle w:val="Heading3"/>
+      </w:pPr>
+      <w:r>
+        <w:t>Historical Cost Context</w:t>
+      </w:r>
+    </w:p>
+    <w:p>
+      <w:pPr>
+        <w:rPr>
+          <w:rFonts w:ascii="Skeena" w:hAnsi="Skeena"/>
+        </w:rPr>
+      </w:pPr>
+      <w:r>
+        <w:rPr>
+          <w:rFonts w:ascii="Skeena" w:hAnsi="Skeena"/>
+        </w:rPr>
+        <w:t>The project cost has increased from an estimated $6 million in 2019 to the current $10 million, reflecting construction industry inflation of approximately 5-8% annually. The district notes that further delays would likely add $500,000-800,000 per year to the project cost. If the district does not proceed with MSBA funding, future roof replacement would require 100% local funding rather than the current 38% local share (District Q&amp;A, p. 3).</w:t>
+      </w:r>
+    </w:p>
+    <w:p>
+      <w:pPr>
+        <w:pStyle w:val="Heading3"/>
+      </w:pPr>
+      <w:r>
+        <w:t>Alternative Scenarios</w:t>
+      </w:r>
+    </w:p>
+    <w:p>
+      <w:pPr>
+        <w:rPr>
+          <w:rFonts w:ascii="Skeena" w:hAnsi="Skeena"/>
+        </w:rPr>
+      </w:pPr>
+      <w:r>
+        <w:rPr>
+          <w:rFonts w:ascii="Skeena" w:hAnsi="Skeena"/>
+        </w:rPr>
+        <w:t>The district evaluated less comprehensive options, including partial replacement and recoating strategies (Options B through E), with costs ranging from approximately $800,000 to several million dollars. These alternatives were not recommended as they would not address the underlying drainage issues, would provide shorter warranty periods, and would not bring the facility up to current building codes (MSBA Submission, Section 6, p. 1).</w:t>
+      </w:r>
+    </w:p>
+    <w:p>
+      <w:pPr>
+        <w:pStyle w:val="Heading2"/>
+      </w:pPr>
+      <w:r>
+        <w:t>Future plans</w:t>
+      </w:r>
+    </w:p>
+    <w:p>
+      <w:pPr>
+        <w:rPr>
+          <w:rFonts w:ascii="Skeena" w:hAnsi="Skeena"/>
+        </w:rPr>
+      </w:pPr>
+      <w:r>
+        <w:rPr>
+          <w:rFonts w:ascii="Skeena" w:hAnsi="Skeena"/>
+        </w:rPr>
+        <w:t>Consolidating the middle and high school in the ARHS facility: The ARMS roof replacement is not an obstacle to pursuing that plan in the future.</w:t>
+      </w:r>
+    </w:p>
+    <w:p>
+      <w:pPr>
+        <w:rPr>
+          <w:rFonts w:ascii="Skeena" w:hAnsi="Skeena"/>
+        </w:rPr>
+      </w:pPr>
+      <w:r>
+        <w:rPr>
+          <w:rFonts w:ascii="Skeena" w:hAnsi="Skeena"/>
+        </w:rPr>
+        <w:t>The MSBA 20-year requirement that ARMS facility be used for educational purposes. MSBA does not specify what qualifies for educational purposes</w:t>
+      </w:r>
+      <w:r>
+        <w:rPr>
+          <w:rFonts w:ascii="Skeena" w:hAnsi="Skeena"/>
+        </w:rPr>
+        <w:t xml:space="preserve">. If </w:t>
+      </w:r>
+      <w:r>
+        <w:rPr>
+          <w:rFonts w:ascii="Skeena" w:hAnsi="Skeena"/>
+        </w:rPr>
+        <w:t xml:space="preserve">qualifications are as wide open as they sound, then </w:t>
+      </w:r>
+      <w:r>
+        <w:rPr>
+          <w:rFonts w:ascii="Skeena" w:hAnsi="Skeena"/>
+        </w:rPr>
+        <w:t xml:space="preserve">there are many </w:t>
+      </w:r>
+      <w:r>
+        <w:rPr>
+          <w:rFonts w:ascii="Skeena" w:hAnsi="Skeena"/>
+        </w:rPr>
+        <w:t xml:space="preserve">attractive </w:t>
+      </w:r>
+      <w:r>
+        <w:rPr>
+          <w:rFonts w:ascii="Skeena" w:hAnsi="Skeena"/>
+        </w:rPr>
+        <w:t xml:space="preserve">options: </w:t>
+      </w:r>
+    </w:p>
+    <w:p>
+      <w:pPr>
+        <w:pStyle w:val="ListParagraph"/>
+        <w:numPr>
+          <w:ilvl w:val="0"/>
+          <w:numId w:val="16"/>
+        </w:numPr>
+        <w:rPr>
+          <w:rFonts w:ascii="Skeena" w:hAnsi="Skeena"/>
+        </w:rPr>
+      </w:pPr>
+      <w:r>
+        <w:rPr>
+          <w:rFonts w:ascii="Skeena" w:hAnsi="Skeena"/>
+        </w:rPr>
+        <w:t>Vocational school</w:t>
+      </w:r>
+    </w:p>
+    <w:p>
+      <w:pPr>
+        <w:pStyle w:val="ListParagraph"/>
+        <w:numPr>
+          <w:ilvl w:val="0"/>
+          <w:numId w:val="16"/>
+        </w:numPr>
+        <w:rPr>
+          <w:rFonts w:ascii="Skeena" w:hAnsi="Skeena"/>
+        </w:rPr>
+      </w:pPr>
+      <w:r>
+        <w:rPr>
+          <w:rFonts w:ascii="Skeena" w:hAnsi="Skeena"/>
+        </w:rPr>
+        <w:t>Collaborative school</w:t>
+      </w:r>
+    </w:p>
+    <w:p>
+      <w:pPr>
+        <w:pStyle w:val="ListParagraph"/>
+        <w:numPr>
+          <w:ilvl w:val="0"/>
+          <w:numId w:val="16"/>
+        </w:numPr>
+        <w:rPr>
+          <w:rFonts w:ascii="Skeena" w:hAnsi="Skeena"/>
+        </w:rPr>
+      </w:pPr>
+      <w:r>
+        <w:rPr>
+          <w:rFonts w:ascii="Skeena" w:hAnsi="Skeena"/>
+        </w:rPr>
         <w:lastRenderedPageBreak/>
-        <w:t>Code Compliance Improvements</w:t>
-      </w:r>
-    </w:p>
-    <w:p>
-      <w:pPr>
-        <w:rPr>
-          <w:rFonts w:ascii="Skeena" w:hAnsi="Skeena"/>
-        </w:rPr>
-      </w:pPr>
-      <w:r>
-        <w:rPr>
-          <w:rFonts w:ascii="Skeena" w:hAnsi="Skeena"/>
-        </w:rPr>
-        <w:t>The project brings the facility up to current Massachusetts building codes in several areas. Energy efficiency will improve with R-30 continuous insulation, exceeding the Massachusetts Stretch Code requirement for Climate Zone 5. The roof will meet current snow load requirements of 35 pounds per square foot and current wind uplift resistance standards, both significantly higher than 1994 requirements (MSBA Submission, Section 5, pp. 1-3).</w:t>
-      </w:r>
-    </w:p>
-    <w:p>
-      <w:pPr>
-        <w:pStyle w:val="Heading3"/>
-      </w:pPr>
-      <w:r>
-        <w:t>Construction Timeline</w:t>
-      </w:r>
-    </w:p>
-    <w:p>
-      <w:pPr>
-        <w:rPr>
-          <w:rFonts w:ascii="Skeena" w:hAnsi="Skeena"/>
-        </w:rPr>
-      </w:pPr>
-      <w:r>
-        <w:rPr>
-          <w:rFonts w:ascii="Skeena" w:hAnsi="Skeena"/>
-        </w:rPr>
-        <w:t>Construction must occur during summer 2026 when students are not present, particularly given the asbestos abatement requirements. The timeline includes bidding beginning February 2, 2026, with construction completion targeted for August 30, 2026. The work cannot be phased across multiple summers without jeopardizing MSBA funding eligibility due to the program's timeline requirements (District Q&amp;A, p. 1).</w:t>
-      </w:r>
-    </w:p>
-    <w:p>
-      <w:pPr>
-        <w:pStyle w:val="Heading2"/>
-      </w:pPr>
-      <w:r>
-        <w:t>Costs</w:t>
-      </w:r>
-    </w:p>
-    <w:p>
-      <w:pPr>
-        <w:pStyle w:val="Heading3"/>
-      </w:pPr>
-      <w:r>
-        <w:t>Total Project Investment</w:t>
-      </w:r>
-    </w:p>
-    <w:p>
-      <w:pPr>
-        <w:rPr>
-          <w:rFonts w:ascii="Skeena" w:hAnsi="Skeena"/>
-        </w:rPr>
-      </w:pPr>
-      <w:r>
-        <w:rPr>
-          <w:rFonts w:ascii="Skeena" w:hAnsi="Skeena"/>
-        </w:rPr>
-        <w:t>The total project cost is $10,024,016, which breaks down into construction costs of $8,470,479 and soft costs of $1,553,537. Soft costs include design services, owner's project management, bidding, and administrative expenses, representing approximately 15.5% of the total project (MSBA Submission, Cost Summary).</w:t>
-      </w:r>
-    </w:p>
-    <w:p>
-      <w:pPr>
-        <w:pStyle w:val="Heading3"/>
-      </w:pPr>
-      <w:r>
-        <w:t>Funding Structure</w:t>
-      </w:r>
-    </w:p>
-    <w:p>
-      <w:pPr>
-        <w:rPr>
-          <w:rFonts w:ascii="Skeena" w:hAnsi="Skeena"/>
-        </w:rPr>
-      </w:pPr>
-      <w:r>
-        <w:rPr>
-          <w:rFonts w:ascii="Skeena" w:hAnsi="Skeena"/>
-        </w:rPr>
-        <w:t>The MSBA will provide $5,999,980 in reimbursement, covering 61.95% of eligible costs. The regional district's responsibility is $4,024,036. The district previously authorized $3 million in borrowing, which has been incorporated into capital planning. The additional authorization needed is approximately $4 million, though final borrowing amounts will be determined based on available funds and financing terms (District Q&amp;A, p. 3).</w:t>
-      </w:r>
-    </w:p>
-    <w:p>
-      <w:pPr>
-        <w:pStyle w:val="Heading3"/>
-      </w:pPr>
-      <w:r>
-        <w:t>Cost Allocation to Member Towns</w:t>
-      </w:r>
-    </w:p>
-    <w:p>
-      <w:pPr>
-        <w:rPr>
-          <w:rFonts w:ascii="Skeena" w:hAnsi="Skeena"/>
-        </w:rPr>
-      </w:pPr>
-      <w:r>
-        <w:rPr>
-          <w:rFonts w:ascii="Skeena" w:hAnsi="Skeena"/>
-        </w:rPr>
-        <w:t>Leverett's share, based on 2024 equalized valuation, totals approximately $412,000 plus interest. This represents about $155,000 plus interest above what was already planned for under the existing $3 million authorization. The preliminary debt service projections for Leverett range from $79,452 in FY27 to $233,873 in FY31, though final amounts will depend on borrowing terms and interest rates (District Q&amp;A, p</w:t>
-      </w:r>
-      <w:proofErr w:type="gramStart"/>
-      <w:r>
-        <w:rPr>
-          <w:rFonts w:ascii="Skeena" w:hAnsi="Skeena"/>
-        </w:rPr>
-        <w:t>. 3</w:t>
-      </w:r>
-      <w:proofErr w:type="gramEnd"/>
-      <w:r>
-        <w:rPr>
-          <w:rFonts w:ascii="Skeena" w:hAnsi="Skeena"/>
-        </w:rPr>
-        <w:t>).</w:t>
-      </w:r>
-    </w:p>
-    <w:p>
-      <w:pPr>
-        <w:pStyle w:val="Heading3"/>
-      </w:pPr>
-      <w:r>
-        <w:lastRenderedPageBreak/>
-        <w:t>Historical Cost Context</w:t>
-      </w:r>
-    </w:p>
-    <w:p>
-      <w:pPr>
-        <w:rPr>
-          <w:rFonts w:ascii="Skeena" w:hAnsi="Skeena"/>
-        </w:rPr>
-      </w:pPr>
-      <w:r>
-        <w:rPr>
-          <w:rFonts w:ascii="Skeena" w:hAnsi="Skeena"/>
-        </w:rPr>
-        <w:t>The project cost has increased from an estimated $6 million in 2019 to the current $10 million, reflecting construction industry inflation of approximately 5-8% annually. The district notes that further delays would likely add $500,000-800,000 per year to the project cost. If the district does not proceed with MSBA funding, future roof replacement would require 100% local funding rather than the current 38% local share (District Q&amp;A, p. 3).</w:t>
-      </w:r>
-    </w:p>
-    <w:p>
-      <w:pPr>
-        <w:pStyle w:val="Heading3"/>
-      </w:pPr>
-      <w:r>
-        <w:t>Alternative Scenarios</w:t>
-      </w:r>
-    </w:p>
-    <w:p>
-      <w:pPr>
-        <w:rPr>
-          <w:rFonts w:ascii="Skeena" w:hAnsi="Skeena"/>
-        </w:rPr>
-      </w:pPr>
-      <w:r>
-        <w:rPr>
-          <w:rFonts w:ascii="Skeena" w:hAnsi="Skeena"/>
-        </w:rPr>
-        <w:t xml:space="preserve">The district evaluated </w:t>
-      </w:r>
-      <w:proofErr w:type="gramStart"/>
-      <w:r>
-        <w:rPr>
-          <w:rFonts w:ascii="Skeena" w:hAnsi="Skeena"/>
-        </w:rPr>
-        <w:t>less</w:t>
-      </w:r>
-      <w:proofErr w:type="gramEnd"/>
-      <w:r>
-        <w:rPr>
-          <w:rFonts w:ascii="Skeena" w:hAnsi="Skeena"/>
-        </w:rPr>
-        <w:t xml:space="preserve"> comprehensive options, including partial replacement and recoating strategies (Options B through E), with costs ranging from approximately $800,000 to several million dollars. These alternatives were not recommended as they would not address the underlying drainage issues, would provide shorter warranty periods, and would not bring the facility up to current building codes (MSBA Submission, Section 6, p. 1).</w:t>
-      </w:r>
-    </w:p>
-    <w:p>
-      <w:pPr>
-        <w:rPr>
-          <w:rFonts w:ascii="Skeena" w:hAnsi="Skeena"/>
-        </w:rPr>
-      </w:pPr>
+        <w:t>Magnet school</w:t>
+      </w:r>
+    </w:p>
+    <w:p>
+      <w:pPr>
+        <w:pStyle w:val="ListParagraph"/>
+        <w:numPr>
+          <w:ilvl w:val="0"/>
+          <w:numId w:val="16"/>
+        </w:numPr>
+        <w:rPr>
+          <w:rFonts w:ascii="Skeena" w:hAnsi="Skeena"/>
+        </w:rPr>
+      </w:pPr>
+      <w:r>
+        <w:rPr>
+          <w:rFonts w:ascii="Skeena" w:hAnsi="Skeena"/>
+        </w:rPr>
+        <w:t>Private school</w:t>
+      </w:r>
+    </w:p>
+    <w:p>
+      <w:pPr>
+        <w:pStyle w:val="ListParagraph"/>
+        <w:numPr>
+          <w:ilvl w:val="0"/>
+          <w:numId w:val="16"/>
+        </w:numPr>
+        <w:rPr>
+          <w:rFonts w:ascii="Skeena" w:hAnsi="Skeena"/>
+        </w:rPr>
+      </w:pPr>
+      <w:r>
+        <w:rPr>
+          <w:rFonts w:ascii="Skeena" w:hAnsi="Skeena"/>
+        </w:rPr>
+        <w:t>Charter school</w:t>
+      </w:r>
+    </w:p>
+    <w:p>
+      <w:pPr>
+        <w:pStyle w:val="ListParagraph"/>
+        <w:numPr>
+          <w:ilvl w:val="0"/>
+          <w:numId w:val="16"/>
+        </w:numPr>
+        <w:rPr>
+          <w:rFonts w:ascii="Skeena" w:hAnsi="Skeena"/>
+        </w:rPr>
+      </w:pPr>
+      <w:r>
+        <w:rPr>
+          <w:rFonts w:ascii="Skeena" w:hAnsi="Skeena"/>
+        </w:rPr>
+        <w:t>Community college branch</w:t>
+      </w:r>
+    </w:p>
+    <w:p>
+      <w:pPr>
+        <w:pStyle w:val="ListParagraph"/>
+        <w:numPr>
+          <w:ilvl w:val="0"/>
+          <w:numId w:val="16"/>
+        </w:numPr>
+        <w:rPr>
+          <w:rFonts w:ascii="Skeena" w:hAnsi="Skeena"/>
+        </w:rPr>
+      </w:pPr>
+      <w:r>
+        <w:rPr>
+          <w:rFonts w:ascii="Skeena" w:hAnsi="Skeena"/>
+        </w:rPr>
+        <w:t>UMass branch</w:t>
+      </w:r>
+    </w:p>
+    <w:p>
+      <w:pPr>
+        <w:pStyle w:val="ListParagraph"/>
+        <w:numPr>
+          <w:ilvl w:val="0"/>
+          <w:numId w:val="16"/>
+        </w:numPr>
+        <w:rPr>
+          <w:rFonts w:ascii="Skeena" w:hAnsi="Skeena"/>
+        </w:rPr>
+      </w:pPr>
+      <w:r>
+        <w:rPr>
+          <w:rFonts w:ascii="Skeena" w:hAnsi="Skeena"/>
+        </w:rPr>
+        <w:t>A branch of any of the other five colleges</w:t>
+      </w:r>
+    </w:p>
+    <w:p>
+      <w:pPr>
+        <w:pStyle w:val="ListParagraph"/>
+        <w:numPr>
+          <w:ilvl w:val="0"/>
+          <w:numId w:val="16"/>
+        </w:numPr>
+        <w:rPr>
+          <w:rFonts w:ascii="Skeena" w:hAnsi="Skeena"/>
+        </w:rPr>
+      </w:pPr>
+      <w:r>
+        <w:rPr>
+          <w:rFonts w:ascii="Skeena" w:hAnsi="Skeena"/>
+        </w:rPr>
+        <w:t>Adult education</w:t>
+      </w:r>
+    </w:p>
+    <w:p>
+      <w:pPr>
+        <w:pStyle w:val="ListParagraph"/>
+        <w:numPr>
+          <w:ilvl w:val="0"/>
+          <w:numId w:val="16"/>
+        </w:numPr>
+        <w:rPr>
+          <w:rFonts w:ascii="Skeena" w:hAnsi="Skeena"/>
+        </w:rPr>
+      </w:pPr>
+      <w:r>
+        <w:rPr>
+          <w:rFonts w:ascii="Skeena" w:hAnsi="Skeena"/>
+        </w:rPr>
+        <w:t>Professional education</w:t>
+      </w:r>
+    </w:p>
+    <w:p>
+      <w:pPr>
+        <w:pStyle w:val="ListParagraph"/>
+        <w:numPr>
+          <w:ilvl w:val="0"/>
+          <w:numId w:val="16"/>
+        </w:numPr>
+        <w:rPr>
+          <w:rFonts w:ascii="Skeena" w:hAnsi="Skeena"/>
+        </w:rPr>
+      </w:pPr>
+      <w:r>
+        <w:rPr>
+          <w:rFonts w:ascii="Skeena" w:hAnsi="Skeena"/>
+        </w:rPr>
+        <w:t>Offices for DESE</w:t>
+      </w:r>
+    </w:p>
+    <w:p>
+      <w:pPr>
+        <w:pStyle w:val="ListParagraph"/>
+        <w:numPr>
+          <w:ilvl w:val="0"/>
+          <w:numId w:val="16"/>
+        </w:numPr>
+        <w:rPr>
+          <w:rFonts w:ascii="Skeena" w:hAnsi="Skeena"/>
+        </w:rPr>
+      </w:pPr>
+      <w:r>
+        <w:rPr>
+          <w:rFonts w:ascii="Skeena" w:hAnsi="Skeena"/>
+        </w:rPr>
+        <w:t xml:space="preserve">Offices for </w:t>
+      </w:r>
+      <w:r>
+        <w:rPr>
+          <w:rFonts w:ascii="Skeena" w:hAnsi="Skeena"/>
+        </w:rPr>
+        <w:t>businesses and nonprofits in the education sector</w:t>
+      </w:r>
     </w:p>
     <w:sectPr>
       <w:pgSz w:w="12240" w:h="15840"/>
@@ -436,6 +1213,45 @@
 </w:document>
 </file>
 
+<file path=word/comments.xml><?xml version="1.0" encoding="utf-8"?>
+<w:comments xmlns:wpc="http://schemas.microsoft.com/office/word/2010/wordprocessingCanvas" xmlns:cx="http://schemas.microsoft.com/office/drawing/2014/chartex" xmlns:cx1="http://schemas.microsoft.com/office/drawing/2015/9/8/chartex" xmlns:cx2="http://schemas.microsoft.com/office/drawing/2015/10/21/chartex" xmlns:cx3="http://schemas.microsoft.com/office/drawing/2016/5/9/chartex" xmlns:cx4="http://schemas.microsoft.com/office/drawing/2016/5/10/chartex" xmlns:cx5="http://schemas.microsoft.com/office/drawing/2016/5/11/chartex" xmlns:cx6="http://schemas.microsoft.com/office/drawing/2016/5/12/chartex" xmlns:cx7="http://schemas.microsoft.com/office/drawing/2016/5/13/chartex" xmlns:cx8="http://schemas.microsoft.com/office/drawing/2016/5/14/chartex" xmlns:mc="http://schemas.openxmlformats.org/markup-compatibility/2006" xmlns:aink="http://schemas.microsoft.com/office/drawing/2016/ink" xmlns:am3d="http://schemas.microsoft.com/office/drawing/2017/model3d" xmlns:o="urn:schemas-microsoft-com:office:office" xmlns:oel="http://schemas.microsoft.com/office/2019/extlst" xmlns:r="http://schemas.openxmlformats.org/officeDocument/2006/relationships" xmlns:m="http://schemas.openxmlformats.org/officeDocument/2006/math" xmlns:v="urn:schemas-microsoft-com:vml" xmlns:wp14="http://schemas.microsoft.com/office/word/2010/wordprocessingDrawing" xmlns:wp="http://schemas.openxmlformats.org/drawingml/2006/wordprocessingDrawing" xmlns:w10="urn:schemas-microsoft-com:office:word" xmlns:w="http://schemas.openxmlformats.org/wordprocessingml/2006/main" xmlns:w14="http://schemas.microsoft.com/office/word/2010/wordml" xmlns:w15="http://schemas.microsoft.com/office/word/2012/wordml" xmlns:w16cex="http://schemas.microsoft.com/office/word/2018/wordml/cex" xmlns:w16cid="http://schemas.microsoft.com/office/word/2016/wordml/cid" xmlns:w16="http://schemas.microsoft.com/office/word/2018/wordml" xmlns:w16du="http://schemas.microsoft.com/office/word/2023/wordml/word16du" xmlns:w16sdtdh="http://schemas.microsoft.com/office/word/2020/wordml/sdtdatahash" xmlns:w16sdtfl="http://schemas.microsoft.com/office/word/2024/wordml/sdtformatlock" xmlns:w16se="http://schemas.microsoft.com/office/word/2015/wordml/symex" xmlns:wpg="http://schemas.microsoft.com/office/word/2010/wordprocessingGroup" xmlns:wpi="http://schemas.microsoft.com/office/word/2010/wordprocessingInk" xmlns:wne="http://schemas.microsoft.com/office/word/2006/wordml" xmlns:wps="http://schemas.microsoft.com/office/word/2010/wordprocessingShape" mc:Ignorable="w14 w15 w16se w16cid w16 w16cex w16sdtdh w16sdtfl w16du wp14">
+  <w:comment w:id="0" w:author="Tim Shores" w:date="2025-10-25T21:34:00Z" w:initials="TS">
+    <w:p>
+      <w:pPr>
+        <w:pStyle w:val="CommentText"/>
+      </w:pPr>
+      <w:r>
+        <w:rPr>
+          <w:rStyle w:val="CommentReference"/>
+        </w:rPr>
+        <w:annotationRef/>
+      </w:r>
+      <w:r>
+        <w:t>From Building Conditions Survey &amp; Assessment by T2. Sections 2-4.</w:t>
+      </w:r>
+    </w:p>
+  </w:comment>
+</w:comments>
+</file>
+
+<file path=word/commentsExtended.xml><?xml version="1.0" encoding="utf-8"?>
+<w15:commentsEx xmlns:wpc="http://schemas.microsoft.com/office/word/2010/wordprocessingCanvas" xmlns:cx="http://schemas.microsoft.com/office/drawing/2014/chartex" xmlns:cx1="http://schemas.microsoft.com/office/drawing/2015/9/8/chartex" xmlns:cx2="http://schemas.microsoft.com/office/drawing/2015/10/21/chartex" xmlns:cx3="http://schemas.microsoft.com/office/drawing/2016/5/9/chartex" xmlns:cx4="http://schemas.microsoft.com/office/drawing/2016/5/10/chartex" xmlns:cx5="http://schemas.microsoft.com/office/drawing/2016/5/11/chartex" xmlns:cx6="http://schemas.microsoft.com/office/drawing/2016/5/12/chartex" xmlns:cx7="http://schemas.microsoft.com/office/drawing/2016/5/13/chartex" xmlns:cx8="http://schemas.microsoft.com/office/drawing/2016/5/14/chartex" xmlns:mc="http://schemas.openxmlformats.org/markup-compatibility/2006" xmlns:aink="http://schemas.microsoft.com/office/drawing/2016/ink" xmlns:am3d="http://schemas.microsoft.com/office/drawing/2017/model3d" xmlns:o="urn:schemas-microsoft-com:office:office" xmlns:oel="http://schemas.microsoft.com/office/2019/extlst" xmlns:r="http://schemas.openxmlformats.org/officeDocument/2006/relationships" xmlns:m="http://schemas.openxmlformats.org/officeDocument/2006/math" xmlns:v="urn:schemas-microsoft-com:vml" xmlns:wp14="http://schemas.microsoft.com/office/word/2010/wordprocessingDrawing" xmlns:wp="http://schemas.openxmlformats.org/drawingml/2006/wordprocessingDrawing" xmlns:w10="urn:schemas-microsoft-com:office:word" xmlns:w="http://schemas.openxmlformats.org/wordprocessingml/2006/main" xmlns:w14="http://schemas.microsoft.com/office/word/2010/wordml" xmlns:w15="http://schemas.microsoft.com/office/word/2012/wordml" xmlns:w16cex="http://schemas.microsoft.com/office/word/2018/wordml/cex" xmlns:w16cid="http://schemas.microsoft.com/office/word/2016/wordml/cid" xmlns:w16="http://schemas.microsoft.com/office/word/2018/wordml" xmlns:w16du="http://schemas.microsoft.com/office/word/2023/wordml/word16du" xmlns:w16sdtdh="http://schemas.microsoft.com/office/word/2020/wordml/sdtdatahash" xmlns:w16sdtfl="http://schemas.microsoft.com/office/word/2024/wordml/sdtformatlock" xmlns:w16se="http://schemas.microsoft.com/office/word/2015/wordml/symex" xmlns:wpg="http://schemas.microsoft.com/office/word/2010/wordprocessingGroup" xmlns:wpi="http://schemas.microsoft.com/office/word/2010/wordprocessingInk" xmlns:wne="http://schemas.microsoft.com/office/word/2006/wordml" xmlns:wps="http://schemas.microsoft.com/office/word/2010/wordprocessingShape" mc:Ignorable="w14 w15 w16se w16cid w16 w16cex w16sdtdh w16sdtfl w16du wp14">
+  <w15:commentEx w15:paraId="7AB8A61A" w15:done="0"/>
+</w15:commentsEx>
+</file>
+
+<file path=word/commentsExtensible.xml><?xml version="1.0" encoding="utf-8"?>
+<w16cex:commentsExtensible xmlns:wpc="http://schemas.microsoft.com/office/word/2010/wordprocessingCanvas" xmlns:cx="http://schemas.microsoft.com/office/drawing/2014/chartex" xmlns:cx1="http://schemas.microsoft.com/office/drawing/2015/9/8/chartex" xmlns:cx2="http://schemas.microsoft.com/office/drawing/2015/10/21/chartex" xmlns:cx3="http://schemas.microsoft.com/office/drawing/2016/5/9/chartex" xmlns:cx4="http://schemas.microsoft.com/office/drawing/2016/5/10/chartex" xmlns:cx5="http://schemas.microsoft.com/office/drawing/2016/5/11/chartex" xmlns:cx6="http://schemas.microsoft.com/office/drawing/2016/5/12/chartex" xmlns:cx7="http://schemas.microsoft.com/office/drawing/2016/5/13/chartex" xmlns:cx8="http://schemas.microsoft.com/office/drawing/2016/5/14/chartex" xmlns:cr="http://schemas.microsoft.com/office/comments/2020/reactions" xmlns:mc="http://schemas.openxmlformats.org/markup-compatibility/2006" xmlns:aink="http://schemas.microsoft.com/office/drawing/2016/ink" xmlns:am3d="http://schemas.microsoft.com/office/drawing/2017/model3d" xmlns:o="urn:schemas-microsoft-com:office:office" xmlns:oel="http://schemas.microsoft.com/office/2019/extlst" xmlns:r="http://schemas.openxmlformats.org/officeDocument/2006/relationships" xmlns:m="http://schemas.openxmlformats.org/officeDocument/2006/math" xmlns:v="urn:schemas-microsoft-com:vml" xmlns:wp14="http://schemas.microsoft.com/office/word/2010/wordprocessingDrawing" xmlns:wp="http://schemas.openxmlformats.org/drawingml/2006/wordprocessingDrawing" xmlns:w10="urn:schemas-microsoft-com:office:word" xmlns:w="http://schemas.openxmlformats.org/wordprocessingml/2006/main" xmlns:w14="http://schemas.microsoft.com/office/word/2010/wordml" xmlns:w15="http://schemas.microsoft.com/office/word/2012/wordml" xmlns:w16cex="http://schemas.microsoft.com/office/word/2018/wordml/cex" xmlns:w16cid="http://schemas.microsoft.com/office/word/2016/wordml/cid" xmlns:w16="http://schemas.microsoft.com/office/word/2018/wordml" xmlns:w16du="http://schemas.microsoft.com/office/word/2023/wordml/word16du" xmlns:w16sdtdh="http://schemas.microsoft.com/office/word/2020/wordml/sdtdatahash" xmlns:w16sdtfl="http://schemas.microsoft.com/office/word/2024/wordml/sdtformatlock" xmlns:w16se="http://schemas.microsoft.com/office/word/2015/wordml/symex" xmlns:wpg="http://schemas.microsoft.com/office/word/2010/wordprocessingGroup" xmlns:wpi="http://schemas.microsoft.com/office/word/2010/wordprocessingInk" xmlns:wne="http://schemas.microsoft.com/office/word/2006/wordml" xmlns:wps="http://schemas.microsoft.com/office/word/2010/wordprocessingShape" mc:Ignorable="w14 w15 w16se w16cid w16 w16cex w16sdtdh w16sdtfl cr w16du wp14">
+  <w16cex:commentExtensible w16cex:durableId="06FB7140" w16cex:dateUtc="2025-10-26T01:34:00Z"/>
+</w16cex:commentsExtensible>
+</file>
+
+<file path=word/commentsIds.xml><?xml version="1.0" encoding="utf-8"?>
+<w16cid:commentsIds xmlns:wpc="http://schemas.microsoft.com/office/word/2010/wordprocessingCanvas" xmlns:cx="http://schemas.microsoft.com/office/drawing/2014/chartex" xmlns:cx1="http://schemas.microsoft.com/office/drawing/2015/9/8/chartex" xmlns:cx2="http://schemas.microsoft.com/office/drawing/2015/10/21/chartex" xmlns:cx3="http://schemas.microsoft.com/office/drawing/2016/5/9/chartex" xmlns:cx4="http://schemas.microsoft.com/office/drawing/2016/5/10/chartex" xmlns:cx5="http://schemas.microsoft.com/office/drawing/2016/5/11/chartex" xmlns:cx6="http://schemas.microsoft.com/office/drawing/2016/5/12/chartex" xmlns:cx7="http://schemas.microsoft.com/office/drawing/2016/5/13/chartex" xmlns:cx8="http://schemas.microsoft.com/office/drawing/2016/5/14/chartex" xmlns:mc="http://schemas.openxmlformats.org/markup-compatibility/2006" xmlns:aink="http://schemas.microsoft.com/office/drawing/2016/ink" xmlns:am3d="http://schemas.microsoft.com/office/drawing/2017/model3d" xmlns:o="urn:schemas-microsoft-com:office:office" xmlns:oel="http://schemas.microsoft.com/office/2019/extlst" xmlns:r="http://schemas.openxmlformats.org/officeDocument/2006/relationships" xmlns:m="http://schemas.openxmlformats.org/officeDocument/2006/math" xmlns:v="urn:schemas-microsoft-com:vml" xmlns:wp14="http://schemas.microsoft.com/office/word/2010/wordprocessingDrawing" xmlns:wp="http://schemas.openxmlformats.org/drawingml/2006/wordprocessingDrawing" xmlns:w10="urn:schemas-microsoft-com:office:word" xmlns:w="http://schemas.openxmlformats.org/wordprocessingml/2006/main" xmlns:w14="http://schemas.microsoft.com/office/word/2010/wordml" xmlns:w15="http://schemas.microsoft.com/office/word/2012/wordml" xmlns:w16cex="http://schemas.microsoft.com/office/word/2018/wordml/cex" xmlns:w16cid="http://schemas.microsoft.com/office/word/2016/wordml/cid" xmlns:w16="http://schemas.microsoft.com/office/word/2018/wordml" xmlns:w16du="http://schemas.microsoft.com/office/word/2023/wordml/word16du" xmlns:w16sdtdh="http://schemas.microsoft.com/office/word/2020/wordml/sdtdatahash" xmlns:w16sdtfl="http://schemas.microsoft.com/office/word/2024/wordml/sdtformatlock" xmlns:w16se="http://schemas.microsoft.com/office/word/2015/wordml/symex" xmlns:wpg="http://schemas.microsoft.com/office/word/2010/wordprocessingGroup" xmlns:wpi="http://schemas.microsoft.com/office/word/2010/wordprocessingInk" xmlns:wne="http://schemas.microsoft.com/office/word/2006/wordml" xmlns:wps="http://schemas.microsoft.com/office/word/2010/wordprocessingShape" mc:Ignorable="w14 w15 w16se w16cid w16 w16cex w16sdtdh w16sdtfl w16du wp14">
+  <w16cid:commentId w16cid:paraId="7AB8A61A" w16cid:durableId="06FB7140"/>
+</w16cid:commentsIds>
+</file>
+
 <file path=word/numbering.xml><?xml version="1.0" encoding="utf-8"?>
 <w:numbering xmlns:wpc="http://schemas.microsoft.com/office/word/2010/wordprocessingCanvas" xmlns:cx="http://schemas.microsoft.com/office/drawing/2014/chartex" xmlns:cx1="http://schemas.microsoft.com/office/drawing/2015/9/8/chartex" xmlns:cx2="http://schemas.microsoft.com/office/drawing/2015/10/21/chartex" xmlns:cx3="http://schemas.microsoft.com/office/drawing/2016/5/9/chartex" xmlns:cx4="http://schemas.microsoft.com/office/drawing/2016/5/10/chartex" xmlns:cx5="http://schemas.microsoft.com/office/drawing/2016/5/11/chartex" xmlns:cx6="http://schemas.microsoft.com/office/drawing/2016/5/12/chartex" xmlns:cx7="http://schemas.microsoft.com/office/drawing/2016/5/13/chartex" xmlns:cx8="http://schemas.microsoft.com/office/drawing/2016/5/14/chartex" xmlns:mc="http://schemas.openxmlformats.org/markup-compatibility/2006" xmlns:aink="http://schemas.microsoft.com/office/drawing/2016/ink" xmlns:am3d="http://schemas.microsoft.com/office/drawing/2017/model3d" xmlns:o="urn:schemas-microsoft-com:office:office" xmlns:oel="http://schemas.microsoft.com/office/2019/extlst" xmlns:r="http://schemas.openxmlformats.org/officeDocument/2006/relationships" xmlns:m="http://schemas.openxmlformats.org/officeDocument/2006/math" xmlns:v="urn:schemas-microsoft-com:vml" xmlns:wp14="http://schemas.microsoft.com/office/word/2010/wordprocessingDrawing" xmlns:wp="http://schemas.openxmlformats.org/drawingml/2006/wordprocessingDrawing" xmlns:w10="urn:schemas-microsoft-com:office:word" xmlns:w="http://schemas.openxmlformats.org/wordprocessingml/2006/main" xmlns:w14="http://schemas.microsoft.com/office/word/2010/wordml" xmlns:w15="http://schemas.microsoft.com/office/word/2012/wordml" xmlns:w16cex="http://schemas.microsoft.com/office/word/2018/wordml/cex" xmlns:w16cid="http://schemas.microsoft.com/office/word/2016/wordml/cid" xmlns:w16="http://schemas.microsoft.com/office/word/2018/wordml" xmlns:w16du="http://schemas.microsoft.com/office/word/2023/wordml/word16du" xmlns:w16sdtdh="http://schemas.microsoft.com/office/word/2020/wordml/sdtdatahash" xmlns:w16sdtfl="http://schemas.microsoft.com/office/word/2024/wordml/sdtformatlock" xmlns:w16se="http://schemas.microsoft.com/office/word/2015/wordml/symex" xmlns:wpg="http://schemas.microsoft.com/office/word/2010/wordprocessingGroup" xmlns:wpi="http://schemas.microsoft.com/office/word/2010/wordprocessingInk" xmlns:wne="http://schemas.microsoft.com/office/word/2006/wordml" xmlns:wps="http://schemas.microsoft.com/office/word/2010/wordprocessingShape" mc:Ignorable="w14 w15 w16se w16cid w16 w16cex w16sdtdh w16sdtfl w16du wp14">
   <w:abstractNum w:abstractNumId="0" w15:restartNumberingAfterBreak="0">
@@ -1035,6 +1851,119 @@
     </w:lvl>
   </w:abstractNum>
   <w:abstractNum w:abstractNumId="4" w15:restartNumberingAfterBreak="0">
+    <w:nsid w:val="2C957EAB"/>
+    <w:multiLevelType w:val="hybridMultilevel"/>
+    <w:tmpl w:val="58202A0E"/>
+    <w:lvl w:ilvl="0" w:tplc="04090001">
+      <w:start w:val="1"/>
+      <w:numFmt w:val="bullet"/>
+      <w:lvlText w:val=""/>
+      <w:lvlJc w:val="left"/>
+      <w:pPr>
+        <w:ind w:left="720" w:hanging="360"/>
+      </w:pPr>
+      <w:rPr>
+        <w:rFonts w:ascii="Symbol" w:hAnsi="Symbol" w:hint="default"/>
+      </w:rPr>
+    </w:lvl>
+    <w:lvl w:ilvl="1" w:tplc="04090003" w:tentative="1">
+      <w:start w:val="1"/>
+      <w:numFmt w:val="bullet"/>
+      <w:lvlText w:val="o"/>
+      <w:lvlJc w:val="left"/>
+      <w:pPr>
+        <w:ind w:left="1440" w:hanging="360"/>
+      </w:pPr>
+      <w:rPr>
+        <w:rFonts w:ascii="Courier New" w:hAnsi="Courier New" w:cs="Courier New" w:hint="default"/>
+      </w:rPr>
+    </w:lvl>
+    <w:lvl w:ilvl="2" w:tplc="04090005" w:tentative="1">
+      <w:start w:val="1"/>
+      <w:numFmt w:val="bullet"/>
+      <w:lvlText w:val=""/>
+      <w:lvlJc w:val="left"/>
+      <w:pPr>
+        <w:ind w:left="2160" w:hanging="360"/>
+      </w:pPr>
+      <w:rPr>
+        <w:rFonts w:ascii="Wingdings" w:hAnsi="Wingdings" w:hint="default"/>
+      </w:rPr>
+    </w:lvl>
+    <w:lvl w:ilvl="3" w:tplc="04090001" w:tentative="1">
+      <w:start w:val="1"/>
+      <w:numFmt w:val="bullet"/>
+      <w:lvlText w:val=""/>
+      <w:lvlJc w:val="left"/>
+      <w:pPr>
+        <w:ind w:left="2880" w:hanging="360"/>
+      </w:pPr>
+      <w:rPr>
+        <w:rFonts w:ascii="Symbol" w:hAnsi="Symbol" w:hint="default"/>
+      </w:rPr>
+    </w:lvl>
+    <w:lvl w:ilvl="4" w:tplc="04090003" w:tentative="1">
+      <w:start w:val="1"/>
+      <w:numFmt w:val="bullet"/>
+      <w:lvlText w:val="o"/>
+      <w:lvlJc w:val="left"/>
+      <w:pPr>
+        <w:ind w:left="3600" w:hanging="360"/>
+      </w:pPr>
+      <w:rPr>
+        <w:rFonts w:ascii="Courier New" w:hAnsi="Courier New" w:cs="Courier New" w:hint="default"/>
+      </w:rPr>
+    </w:lvl>
+    <w:lvl w:ilvl="5" w:tplc="04090005" w:tentative="1">
+      <w:start w:val="1"/>
+      <w:numFmt w:val="bullet"/>
+      <w:lvlText w:val=""/>
+      <w:lvlJc w:val="left"/>
+      <w:pPr>
+        <w:ind w:left="4320" w:hanging="360"/>
+      </w:pPr>
+      <w:rPr>
+        <w:rFonts w:ascii="Wingdings" w:hAnsi="Wingdings" w:hint="default"/>
+      </w:rPr>
+    </w:lvl>
+    <w:lvl w:ilvl="6" w:tplc="04090001" w:tentative="1">
+      <w:start w:val="1"/>
+      <w:numFmt w:val="bullet"/>
+      <w:lvlText w:val=""/>
+      <w:lvlJc w:val="left"/>
+      <w:pPr>
+        <w:ind w:left="5040" w:hanging="360"/>
+      </w:pPr>
+      <w:rPr>
+        <w:rFonts w:ascii="Symbol" w:hAnsi="Symbol" w:hint="default"/>
+      </w:rPr>
+    </w:lvl>
+    <w:lvl w:ilvl="7" w:tplc="04090003" w:tentative="1">
+      <w:start w:val="1"/>
+      <w:numFmt w:val="bullet"/>
+      <w:lvlText w:val="o"/>
+      <w:lvlJc w:val="left"/>
+      <w:pPr>
+        <w:ind w:left="5760" w:hanging="360"/>
+      </w:pPr>
+      <w:rPr>
+        <w:rFonts w:ascii="Courier New" w:hAnsi="Courier New" w:cs="Courier New" w:hint="default"/>
+      </w:rPr>
+    </w:lvl>
+    <w:lvl w:ilvl="8" w:tplc="04090005" w:tentative="1">
+      <w:start w:val="1"/>
+      <w:numFmt w:val="bullet"/>
+      <w:lvlText w:val=""/>
+      <w:lvlJc w:val="left"/>
+      <w:pPr>
+        <w:ind w:left="6480" w:hanging="360"/>
+      </w:pPr>
+      <w:rPr>
+        <w:rFonts w:ascii="Wingdings" w:hAnsi="Wingdings" w:hint="default"/>
+      </w:rPr>
+    </w:lvl>
+  </w:abstractNum>
+  <w:abstractNum w:abstractNumId="5" w15:restartNumberingAfterBreak="0">
     <w:nsid w:val="3BFF6B45"/>
     <w:multiLevelType w:val="multilevel"/>
     <w:tmpl w:val="FEB40BAE"/>
@@ -1183,7 +2112,7 @@
       </w:rPr>
     </w:lvl>
   </w:abstractNum>
-  <w:abstractNum w:abstractNumId="5" w15:restartNumberingAfterBreak="0">
+  <w:abstractNum w:abstractNumId="6" w15:restartNumberingAfterBreak="0">
     <w:nsid w:val="3CEC5DCC"/>
     <w:multiLevelType w:val="multilevel"/>
     <w:tmpl w:val="6F9085EE"/>
@@ -1332,7 +2261,7 @@
       </w:rPr>
     </w:lvl>
   </w:abstractNum>
-  <w:abstractNum w:abstractNumId="6" w15:restartNumberingAfterBreak="0">
+  <w:abstractNum w:abstractNumId="7" w15:restartNumberingAfterBreak="0">
     <w:nsid w:val="494E7DF2"/>
     <w:multiLevelType w:val="multilevel"/>
     <w:tmpl w:val="005296FE"/>
@@ -1481,7 +2410,7 @@
       </w:rPr>
     </w:lvl>
   </w:abstractNum>
-  <w:abstractNum w:abstractNumId="7" w15:restartNumberingAfterBreak="0">
+  <w:abstractNum w:abstractNumId="8" w15:restartNumberingAfterBreak="0">
     <w:nsid w:val="4C77441F"/>
     <w:multiLevelType w:val="multilevel"/>
     <w:tmpl w:val="321EFA58"/>
@@ -1630,7 +2559,7 @@
       </w:rPr>
     </w:lvl>
   </w:abstractNum>
-  <w:abstractNum w:abstractNumId="8" w15:restartNumberingAfterBreak="0">
+  <w:abstractNum w:abstractNumId="9" w15:restartNumberingAfterBreak="0">
     <w:nsid w:val="50DE2DC6"/>
     <w:multiLevelType w:val="multilevel"/>
     <w:tmpl w:val="767E36AA"/>
@@ -1779,7 +2708,7 @@
       </w:rPr>
     </w:lvl>
   </w:abstractNum>
-  <w:abstractNum w:abstractNumId="9" w15:restartNumberingAfterBreak="0">
+  <w:abstractNum w:abstractNumId="10" w15:restartNumberingAfterBreak="0">
     <w:nsid w:val="532D319D"/>
     <w:multiLevelType w:val="multilevel"/>
     <w:tmpl w:val="28EC5E4A"/>
@@ -1928,7 +2857,7 @@
       </w:rPr>
     </w:lvl>
   </w:abstractNum>
-  <w:abstractNum w:abstractNumId="10" w15:restartNumberingAfterBreak="0">
+  <w:abstractNum w:abstractNumId="11" w15:restartNumberingAfterBreak="0">
     <w:nsid w:val="5C933457"/>
     <w:multiLevelType w:val="multilevel"/>
     <w:tmpl w:val="54C0DE32"/>
@@ -2077,7 +3006,7 @@
       </w:rPr>
     </w:lvl>
   </w:abstractNum>
-  <w:abstractNum w:abstractNumId="11" w15:restartNumberingAfterBreak="0">
+  <w:abstractNum w:abstractNumId="12" w15:restartNumberingAfterBreak="0">
     <w:nsid w:val="5D8F137A"/>
     <w:multiLevelType w:val="multilevel"/>
     <w:tmpl w:val="AA2CE62C"/>
@@ -2226,7 +3155,7 @@
       </w:rPr>
     </w:lvl>
   </w:abstractNum>
-  <w:abstractNum w:abstractNumId="12" w15:restartNumberingAfterBreak="0">
+  <w:abstractNum w:abstractNumId="13" w15:restartNumberingAfterBreak="0">
     <w:nsid w:val="6B55740C"/>
     <w:multiLevelType w:val="multilevel"/>
     <w:tmpl w:val="73145B84"/>
@@ -2375,7 +3304,7 @@
       </w:rPr>
     </w:lvl>
   </w:abstractNum>
-  <w:abstractNum w:abstractNumId="13" w15:restartNumberingAfterBreak="0">
+  <w:abstractNum w:abstractNumId="14" w15:restartNumberingAfterBreak="0">
     <w:nsid w:val="723815E3"/>
     <w:multiLevelType w:val="multilevel"/>
     <w:tmpl w:val="A8BE0E0E"/>
@@ -2524,50 +3453,177 @@
       </w:rPr>
     </w:lvl>
   </w:abstractNum>
+  <w:abstractNum w:abstractNumId="15" w15:restartNumberingAfterBreak="0">
+    <w:nsid w:val="74DE2B4A"/>
+    <w:multiLevelType w:val="hybridMultilevel"/>
+    <w:tmpl w:val="E1924206"/>
+    <w:lvl w:ilvl="0" w:tplc="04090001">
+      <w:start w:val="1"/>
+      <w:numFmt w:val="bullet"/>
+      <w:lvlText w:val=""/>
+      <w:lvlJc w:val="left"/>
+      <w:pPr>
+        <w:ind w:left="720" w:hanging="360"/>
+      </w:pPr>
+      <w:rPr>
+        <w:rFonts w:ascii="Symbol" w:hAnsi="Symbol" w:hint="default"/>
+      </w:rPr>
+    </w:lvl>
+    <w:lvl w:ilvl="1" w:tplc="04090003" w:tentative="1">
+      <w:start w:val="1"/>
+      <w:numFmt w:val="bullet"/>
+      <w:lvlText w:val="o"/>
+      <w:lvlJc w:val="left"/>
+      <w:pPr>
+        <w:ind w:left="1440" w:hanging="360"/>
+      </w:pPr>
+      <w:rPr>
+        <w:rFonts w:ascii="Courier New" w:hAnsi="Courier New" w:cs="Courier New" w:hint="default"/>
+      </w:rPr>
+    </w:lvl>
+    <w:lvl w:ilvl="2" w:tplc="04090005" w:tentative="1">
+      <w:start w:val="1"/>
+      <w:numFmt w:val="bullet"/>
+      <w:lvlText w:val=""/>
+      <w:lvlJc w:val="left"/>
+      <w:pPr>
+        <w:ind w:left="2160" w:hanging="360"/>
+      </w:pPr>
+      <w:rPr>
+        <w:rFonts w:ascii="Wingdings" w:hAnsi="Wingdings" w:hint="default"/>
+      </w:rPr>
+    </w:lvl>
+    <w:lvl w:ilvl="3" w:tplc="04090001" w:tentative="1">
+      <w:start w:val="1"/>
+      <w:numFmt w:val="bullet"/>
+      <w:lvlText w:val=""/>
+      <w:lvlJc w:val="left"/>
+      <w:pPr>
+        <w:ind w:left="2880" w:hanging="360"/>
+      </w:pPr>
+      <w:rPr>
+        <w:rFonts w:ascii="Symbol" w:hAnsi="Symbol" w:hint="default"/>
+      </w:rPr>
+    </w:lvl>
+    <w:lvl w:ilvl="4" w:tplc="04090003" w:tentative="1">
+      <w:start w:val="1"/>
+      <w:numFmt w:val="bullet"/>
+      <w:lvlText w:val="o"/>
+      <w:lvlJc w:val="left"/>
+      <w:pPr>
+        <w:ind w:left="3600" w:hanging="360"/>
+      </w:pPr>
+      <w:rPr>
+        <w:rFonts w:ascii="Courier New" w:hAnsi="Courier New" w:cs="Courier New" w:hint="default"/>
+      </w:rPr>
+    </w:lvl>
+    <w:lvl w:ilvl="5" w:tplc="04090005" w:tentative="1">
+      <w:start w:val="1"/>
+      <w:numFmt w:val="bullet"/>
+      <w:lvlText w:val=""/>
+      <w:lvlJc w:val="left"/>
+      <w:pPr>
+        <w:ind w:left="4320" w:hanging="360"/>
+      </w:pPr>
+      <w:rPr>
+        <w:rFonts w:ascii="Wingdings" w:hAnsi="Wingdings" w:hint="default"/>
+      </w:rPr>
+    </w:lvl>
+    <w:lvl w:ilvl="6" w:tplc="04090001" w:tentative="1">
+      <w:start w:val="1"/>
+      <w:numFmt w:val="bullet"/>
+      <w:lvlText w:val=""/>
+      <w:lvlJc w:val="left"/>
+      <w:pPr>
+        <w:ind w:left="5040" w:hanging="360"/>
+      </w:pPr>
+      <w:rPr>
+        <w:rFonts w:ascii="Symbol" w:hAnsi="Symbol" w:hint="default"/>
+      </w:rPr>
+    </w:lvl>
+    <w:lvl w:ilvl="7" w:tplc="04090003" w:tentative="1">
+      <w:start w:val="1"/>
+      <w:numFmt w:val="bullet"/>
+      <w:lvlText w:val="o"/>
+      <w:lvlJc w:val="left"/>
+      <w:pPr>
+        <w:ind w:left="5760" w:hanging="360"/>
+      </w:pPr>
+      <w:rPr>
+        <w:rFonts w:ascii="Courier New" w:hAnsi="Courier New" w:cs="Courier New" w:hint="default"/>
+      </w:rPr>
+    </w:lvl>
+    <w:lvl w:ilvl="8" w:tplc="04090005" w:tentative="1">
+      <w:start w:val="1"/>
+      <w:numFmt w:val="bullet"/>
+      <w:lvlText w:val=""/>
+      <w:lvlJc w:val="left"/>
+      <w:pPr>
+        <w:ind w:left="6480" w:hanging="360"/>
+      </w:pPr>
+      <w:rPr>
+        <w:rFonts w:ascii="Wingdings" w:hAnsi="Wingdings" w:hint="default"/>
+      </w:rPr>
+    </w:lvl>
+  </w:abstractNum>
   <w:num w:numId="1" w16cid:durableId="1448309999">
-    <w:abstractNumId w:val="10"/>
+    <w:abstractNumId w:val="11"/>
   </w:num>
   <w:num w:numId="2" w16cid:durableId="915019574">
-    <w:abstractNumId w:val="4"/>
+    <w:abstractNumId w:val="5"/>
   </w:num>
   <w:num w:numId="3" w16cid:durableId="1792020129">
     <w:abstractNumId w:val="2"/>
   </w:num>
   <w:num w:numId="4" w16cid:durableId="1751344126">
-    <w:abstractNumId w:val="11"/>
+    <w:abstractNumId w:val="12"/>
   </w:num>
   <w:num w:numId="5" w16cid:durableId="1028334816">
+    <w:abstractNumId w:val="9"/>
+  </w:num>
+  <w:num w:numId="6" w16cid:durableId="1554536795">
     <w:abstractNumId w:val="8"/>
   </w:num>
-  <w:num w:numId="6" w16cid:durableId="1554536795">
-    <w:abstractNumId w:val="7"/>
-  </w:num>
   <w:num w:numId="7" w16cid:durableId="1717243985">
-    <w:abstractNumId w:val="9"/>
+    <w:abstractNumId w:val="10"/>
   </w:num>
   <w:num w:numId="8" w16cid:durableId="1878423261">
     <w:abstractNumId w:val="3"/>
   </w:num>
   <w:num w:numId="9" w16cid:durableId="1150250499">
-    <w:abstractNumId w:val="5"/>
+    <w:abstractNumId w:val="6"/>
   </w:num>
   <w:num w:numId="10" w16cid:durableId="175585763">
-    <w:abstractNumId w:val="6"/>
+    <w:abstractNumId w:val="7"/>
   </w:num>
   <w:num w:numId="11" w16cid:durableId="1121075564">
-    <w:abstractNumId w:val="13"/>
+    <w:abstractNumId w:val="14"/>
   </w:num>
   <w:num w:numId="12" w16cid:durableId="1953514049">
     <w:abstractNumId w:val="1"/>
   </w:num>
   <w:num w:numId="13" w16cid:durableId="556162490">
-    <w:abstractNumId w:val="12"/>
+    <w:abstractNumId w:val="13"/>
   </w:num>
   <w:num w:numId="14" w16cid:durableId="1364553042">
     <w:abstractNumId w:val="0"/>
   </w:num>
+  <w:num w:numId="15" w16cid:durableId="14429868">
+    <w:abstractNumId w:val="4"/>
+  </w:num>
+  <w:num w:numId="16" w16cid:durableId="1231159778">
+    <w:abstractNumId w:val="15"/>
+  </w:num>
   <w:numIdMacAtCleanup w:val="14"/>
 </w:numbering>
+</file>
+
+<file path=word/people.xml><?xml version="1.0" encoding="utf-8"?>
+<w15:people xmlns:wpc="http://schemas.microsoft.com/office/word/2010/wordprocessingCanvas" xmlns:cx="http://schemas.microsoft.com/office/drawing/2014/chartex" xmlns:cx1="http://schemas.microsoft.com/office/drawing/2015/9/8/chartex" xmlns:cx2="http://schemas.microsoft.com/office/drawing/2015/10/21/chartex" xmlns:cx3="http://schemas.microsoft.com/office/drawing/2016/5/9/chartex" xmlns:cx4="http://schemas.microsoft.com/office/drawing/2016/5/10/chartex" xmlns:cx5="http://schemas.microsoft.com/office/drawing/2016/5/11/chartex" xmlns:cx6="http://schemas.microsoft.com/office/drawing/2016/5/12/chartex" xmlns:cx7="http://schemas.microsoft.com/office/drawing/2016/5/13/chartex" xmlns:cx8="http://schemas.microsoft.com/office/drawing/2016/5/14/chartex" xmlns:mc="http://schemas.openxmlformats.org/markup-compatibility/2006" xmlns:aink="http://schemas.microsoft.com/office/drawing/2016/ink" xmlns:am3d="http://schemas.microsoft.com/office/drawing/2017/model3d" xmlns:o="urn:schemas-microsoft-com:office:office" xmlns:oel="http://schemas.microsoft.com/office/2019/extlst" xmlns:r="http://schemas.openxmlformats.org/officeDocument/2006/relationships" xmlns:m="http://schemas.openxmlformats.org/officeDocument/2006/math" xmlns:v="urn:schemas-microsoft-com:vml" xmlns:wp14="http://schemas.microsoft.com/office/word/2010/wordprocessingDrawing" xmlns:wp="http://schemas.openxmlformats.org/drawingml/2006/wordprocessingDrawing" xmlns:w10="urn:schemas-microsoft-com:office:word" xmlns:w="http://schemas.openxmlformats.org/wordprocessingml/2006/main" xmlns:w14="http://schemas.microsoft.com/office/word/2010/wordml" xmlns:w15="http://schemas.microsoft.com/office/word/2012/wordml" xmlns:w16cex="http://schemas.microsoft.com/office/word/2018/wordml/cex" xmlns:w16cid="http://schemas.microsoft.com/office/word/2016/wordml/cid" xmlns:w16="http://schemas.microsoft.com/office/word/2018/wordml" xmlns:w16du="http://schemas.microsoft.com/office/word/2023/wordml/word16du" xmlns:w16sdtdh="http://schemas.microsoft.com/office/word/2020/wordml/sdtdatahash" xmlns:w16sdtfl="http://schemas.microsoft.com/office/word/2024/wordml/sdtformatlock" xmlns:w16se="http://schemas.microsoft.com/office/word/2015/wordml/symex" xmlns:wpg="http://schemas.microsoft.com/office/word/2010/wordprocessingGroup" xmlns:wpi="http://schemas.microsoft.com/office/word/2010/wordprocessingInk" xmlns:wne="http://schemas.microsoft.com/office/word/2006/wordml" xmlns:wps="http://schemas.microsoft.com/office/word/2010/wordprocessingShape" mc:Ignorable="w14 w15 w16se w16cid w16 w16cex w16sdtdh w16sdtfl w16du wp14">
+  <w15:person w15:author="Tim Shores">
+    <w15:presenceInfo w15:providerId="Windows Live" w15:userId="c93bebe60e3c7665"/>
+  </w15:person>
+</w15:people>
 </file>
 
 <file path=word/styles.xml><?xml version="1.0" encoding="utf-8"?>
@@ -3492,6 +4548,91 @@
       <w:spacing w:val="5"/>
     </w:rPr>
   </w:style>
+  <w:style w:type="table" w:styleId="TableGrid">
+    <w:name w:val="Table Grid"/>
+    <w:basedOn w:val="TableNormal"/>
+    <w:uiPriority w:val="39"/>
+    <w:rsid w:val="0061557E"/>
+    <w:pPr>
+      <w:spacing w:after="0" w:line="240" w:lineRule="auto"/>
+    </w:pPr>
+    <w:tblPr>
+      <w:tblBorders>
+        <w:top w:val="single" w:sz="4" w:space="0" w:color="auto"/>
+        <w:left w:val="single" w:sz="4" w:space="0" w:color="auto"/>
+        <w:bottom w:val="single" w:sz="4" w:space="0" w:color="auto"/>
+        <w:right w:val="single" w:sz="4" w:space="0" w:color="auto"/>
+        <w:insideH w:val="single" w:sz="4" w:space="0" w:color="auto"/>
+        <w:insideV w:val="single" w:sz="4" w:space="0" w:color="auto"/>
+      </w:tblBorders>
+    </w:tblPr>
+  </w:style>
+  <w:style w:type="character" w:styleId="CommentReference">
+    <w:name w:val="annotation reference"/>
+    <w:basedOn w:val="DefaultParagraphFont"/>
+    <w:uiPriority w:val="99"/>
+    <w:semiHidden/>
+    <w:unhideWhenUsed/>
+    <w:rsid w:val="0081767D"/>
+    <w:rPr>
+      <w:sz w:val="16"/>
+      <w:szCs w:val="16"/>
+    </w:rPr>
+  </w:style>
+  <w:style w:type="paragraph" w:styleId="CommentText">
+    <w:name w:val="annotation text"/>
+    <w:basedOn w:val="Normal"/>
+    <w:link w:val="CommentTextChar"/>
+    <w:uiPriority w:val="99"/>
+    <w:unhideWhenUsed/>
+    <w:rsid w:val="0081767D"/>
+    <w:pPr>
+      <w:spacing w:line="240" w:lineRule="auto"/>
+    </w:pPr>
+    <w:rPr>
+      <w:sz w:val="20"/>
+      <w:szCs w:val="20"/>
+    </w:rPr>
+  </w:style>
+  <w:style w:type="character" w:customStyle="1" w:styleId="CommentTextChar">
+    <w:name w:val="Comment Text Char"/>
+    <w:basedOn w:val="DefaultParagraphFont"/>
+    <w:link w:val="CommentText"/>
+    <w:uiPriority w:val="99"/>
+    <w:rsid w:val="0081767D"/>
+    <w:rPr>
+      <w:sz w:val="20"/>
+      <w:szCs w:val="20"/>
+    </w:rPr>
+  </w:style>
+  <w:style w:type="paragraph" w:styleId="CommentSubject">
+    <w:name w:val="annotation subject"/>
+    <w:basedOn w:val="CommentText"/>
+    <w:next w:val="CommentText"/>
+    <w:link w:val="CommentSubjectChar"/>
+    <w:uiPriority w:val="99"/>
+    <w:semiHidden/>
+    <w:unhideWhenUsed/>
+    <w:rsid w:val="0081767D"/>
+    <w:rPr>
+      <w:b/>
+      <w:bCs/>
+    </w:rPr>
+  </w:style>
+  <w:style w:type="character" w:customStyle="1" w:styleId="CommentSubjectChar">
+    <w:name w:val="Comment Subject Char"/>
+    <w:basedOn w:val="CommentTextChar"/>
+    <w:link w:val="CommentSubject"/>
+    <w:uiPriority w:val="99"/>
+    <w:semiHidden/>
+    <w:rsid w:val="0081767D"/>
+    <w:rPr>
+      <w:b/>
+      <w:bCs/>
+      <w:sz w:val="20"/>
+      <w:szCs w:val="20"/>
+    </w:rPr>
+  </w:style>
 </w:styles>
 </file>
 

</xml_diff>